<commit_message>
Partie 3 du dossier commun
</commit_message>
<xml_diff>
--- a/marais_r_sense_dossier_technique_partie_commune.docx
+++ b/marais_r_sense_dossier_technique_partie_commune.docx
@@ -624,7 +624,16 @@
         </w:rPr>
       </w:r>
       <w:bookmarkEnd w:id="1"/>
-      <w:r/>
+      <w:r>
+        <w:rPr>
+          <w:rFonts w:ascii="Times New Roman" w:hAnsi="Times New Roman" w:eastAsia="Times New Roman" w:cs="Times New Roman"/>
+          <w:b/>
+          <w:bCs/>
+          <w:sz w:val="48"/>
+          <w:szCs w:val="48"/>
+          <w:highlight w:val="none"/>
+        </w:rPr>
+      </w:r>
       <w:r>
         <w:rPr>
           <w:rFonts w:ascii="Times New Roman" w:hAnsi="Times New Roman" w:eastAsia="Times New Roman" w:cs="Times New Roman"/>
@@ -737,6 +746,12 @@
               <w:highlight w:val="none"/>
             </w:rPr>
           </w:r>
+          <w:r>
+            <w:rPr>
+              <w:rFonts w:ascii="Times New Roman" w:hAnsi="Times New Roman" w:eastAsia="Times New Roman" w:cs="Times New Roman"/>
+              <w:highlight w:val="none"/>
+            </w:rPr>
+          </w:r>
         </w:p>
         <w:p>
           <w:pPr>
@@ -752,6 +767,7 @@
               <w14:ligatures w14:val="none"/>
             </w:rPr>
           </w:pPr>
+          <w:r/>
           <w:hyperlink w:tooltip="#_Toc2" w:anchor="_Toc2" w:history="1">
             <w:r>
               <w:rPr>
@@ -808,6 +824,12 @@
               <w14:ligatures w14:val="none"/>
             </w:rPr>
           </w:r>
+          <w:r>
+            <w:rPr>
+              <w:highlight w:val="none"/>
+              <w14:ligatures w14:val="none"/>
+            </w:rPr>
+          </w:r>
         </w:p>
         <w:p>
           <w:pPr>
@@ -823,6 +845,7 @@
               <w:highlight w:val="none"/>
             </w:rPr>
           </w:pPr>
+          <w:r/>
           <w:hyperlink w:tooltip="#_Toc3" w:anchor="_Toc3" w:history="1">
             <w:r>
               <w:rPr>
@@ -859,6 +882,12 @@
               <w:highlight w:val="none"/>
             </w:rPr>
           </w:r>
+          <w:r>
+            <w:rPr>
+              <w:rFonts w:ascii="Times New Roman" w:hAnsi="Times New Roman" w:eastAsia="Times New Roman" w:cs="Times New Roman"/>
+              <w:highlight w:val="none"/>
+            </w:rPr>
+          </w:r>
         </w:p>
         <w:p>
           <w:pPr>
@@ -871,6 +900,7 @@
             <w:ind/>
             <w:rPr/>
           </w:pPr>
+          <w:r/>
           <w:hyperlink w:tooltip="#_Toc4" w:anchor="_Toc4" w:history="1">
             <w:r>
               <w:rPr>
@@ -910,6 +940,7 @@
             </w:r>
           </w:hyperlink>
           <w:r/>
+          <w:r/>
         </w:p>
         <w:p>
           <w:pPr>
@@ -922,6 +953,7 @@
             <w:ind/>
             <w:rPr/>
           </w:pPr>
+          <w:r/>
           <w:hyperlink w:tooltip="#_Toc5" w:anchor="_Toc5" w:history="1">
             <w:r>
               <w:rPr>
@@ -951,6 +983,7 @@
             </w:r>
           </w:hyperlink>
           <w:r/>
+          <w:r/>
         </w:p>
         <w:p>
           <w:pPr>
@@ -966,7 +999,6 @@
               <w:highlight w:val="none"/>
             </w:rPr>
           </w:pPr>
-          <w:r/>
           <w:r>
             <w:fldChar w:fldCharType="end"/>
           </w:r>
@@ -980,7 +1012,16 @@
               <w:highlight w:val="none"/>
             </w:rPr>
           </w:r>
-          <w:r/>
+          <w:r>
+            <w:rPr>
+              <w:rFonts w:ascii="Times New Roman" w:hAnsi="Times New Roman" w:eastAsia="Times New Roman" w:cs="Times New Roman"/>
+              <w:b/>
+              <w:bCs/>
+              <w:sz w:val="48"/>
+              <w:szCs w:val="48"/>
+              <w:highlight w:val="none"/>
+            </w:rPr>
+          </w:r>
         </w:p>
       </w:sdtContent>
     </w:sdt>
@@ -1069,7 +1110,12 @@
         </w:rPr>
       </w:r>
       <w:bookmarkEnd w:id="2"/>
-      <w:r/>
+      <w:r>
+        <w:rPr>
+          <w:highlight w:val="none"/>
+          <w14:ligatures w14:val="none"/>
+        </w:rPr>
+      </w:r>
       <w:r>
         <w:rPr>
           <w:highlight w:val="none"/>
@@ -1242,7 +1288,16 @@
         </w:rPr>
       </w:r>
       <w:bookmarkEnd w:id="3"/>
-      <w:r/>
+      <w:r>
+        <w:rPr>
+          <w:rFonts w:ascii="Times New Roman" w:hAnsi="Times New Roman" w:eastAsia="Times New Roman" w:cs="Times New Roman"/>
+          <w:b/>
+          <w:bCs/>
+          <w:sz w:val="48"/>
+          <w:szCs w:val="48"/>
+          <w:highlight w:val="none"/>
+        </w:rPr>
+      </w:r>
       <w:r>
         <w:rPr>
           <w:rFonts w:ascii="Times New Roman" w:hAnsi="Times New Roman" w:eastAsia="Times New Roman" w:cs="Times New Roman"/>
@@ -1326,7 +1381,12 @@
         </w:rPr>
       </w:r>
       <w:bookmarkEnd w:id="4"/>
-      <w:r/>
+      <w:r>
+        <w:rPr>
+          <w:sz w:val="36"/>
+          <w:szCs w:val="36"/>
+        </w:rPr>
+      </w:r>
       <w:r>
         <w:rPr>
           <w:sz w:val="36"/>
@@ -1434,7 +1494,6 @@
       <w:r>
         <w:t xml:space="preserve">Tableau description diagramme d’utilisation : </w:t>
       </w:r>
-      <w:r/>
       <w:bookmarkEnd w:id="5"/>
       <w:r/>
       <w:r/>
@@ -4249,10 +4308,10 @@
     </w:p>
     <w:p>
       <w:pPr>
-        <w:pBdr/>
-        <w:spacing/>
-        <w:ind w:right="284" w:firstLine="0" w:left="-567"/>
-        <w:jc w:val="center"/>
+        <w:pStyle w:val="845"/>
+        <w:pBdr/>
+        <w:spacing/>
+        <w:ind/>
         <w:rPr>
           <w:rFonts w:ascii="Times New Roman" w:hAnsi="Times New Roman" w:eastAsia="Times New Roman" w:cs="Times New Roman"/>
           <w:b/>
@@ -4281,6 +4340,7 @@
           <w:szCs w:val="48"/>
           <w:highlight w:val="none"/>
         </w:rPr>
+        <w:t xml:space="preserve">Étude préliminaire</w:t>
       </w:r>
       <w:r>
         <w:rPr>
@@ -4289,6 +4349,737 @@
           <w:bCs/>
           <w:sz w:val="48"/>
           <w:szCs w:val="48"/>
+          <w:highlight w:val="none"/>
+        </w:rPr>
+      </w:r>
+    </w:p>
+    <w:p>
+      <w:pPr>
+        <w:pBdr/>
+        <w:spacing/>
+        <w:ind/>
+        <w:rPr/>
+      </w:pPr>
+      <w:r/>
+      <w:r/>
+      <w:r/>
+    </w:p>
+    <w:p>
+      <w:pPr>
+        <w:pStyle w:val="846"/>
+        <w:pBdr/>
+        <w:spacing/>
+        <w:ind/>
+        <w:rPr>
+          <w14:ligatures w14:val="none"/>
+        </w:rPr>
+      </w:pPr>
+      <w:r>
+        <w:rPr>
+          <w:highlight w:val="none"/>
+        </w:rPr>
+      </w:r>
+      <w:r>
+        <w:rPr>
+          <w:highlight w:val="none"/>
+        </w:rPr>
+        <w:t xml:space="preserve">Diagramme de déploiement d’exploitation</w:t>
+      </w:r>
+      <w:r/>
+    </w:p>
+    <w:p>
+      <w:pPr>
+        <w:pBdr/>
+        <w:spacing/>
+        <w:ind/>
+        <w:rPr>
+          <w:rFonts w:ascii="Times New Roman" w:hAnsi="Times New Roman" w:eastAsia="Times New Roman" w:cs="Times New Roman"/>
+          <w:b/>
+          <w:bCs/>
+          <w:color w:val="000000"/>
+          <w:sz w:val="24"/>
+          <w:szCs w:val="24"/>
+          <w14:ligatures w14:val="none"/>
+        </w:rPr>
+      </w:pPr>
+      <w:r>
+        <w:rPr>
+          <w:highlight w:val="none"/>
+        </w:rPr>
+      </w:r>
+      <w:r>
+        <mc:AlternateContent>
+          <mc:Choice Requires="wpg">
+            <w:drawing>
+              <wp:inline xmlns:wp="http://schemas.openxmlformats.org/drawingml/2006/wordprocessingDrawing" distT="0" distB="0" distL="0" distR="0">
+                <wp:extent cx="5940425" cy="4397934"/>
+                <wp:effectExtent l="0" t="0" r="0" b="0"/>
+                <wp:docPr id="4" name=""/>
+                <wp:cNvGraphicFramePr>
+                  <a:graphicFrameLocks xmlns:a="http://schemas.openxmlformats.org/drawingml/2006/main" noChangeAspect="1"/>
+                </wp:cNvGraphicFramePr>
+                <a:graphic xmlns:a="http://schemas.openxmlformats.org/drawingml/2006/main">
+                  <a:graphicData uri="http://schemas.openxmlformats.org/drawingml/2006/picture">
+                    <pic:pic xmlns:pic="http://schemas.openxmlformats.org/drawingml/2006/picture">
+                      <pic:nvPicPr>
+                        <pic:cNvPr id="616372683" name=""/>
+                        <pic:cNvPicPr>
+                          <a:picLocks noChangeAspect="1"/>
+                        </pic:cNvPicPr>
+                        <pic:nvPr/>
+                      </pic:nvPicPr>
+                      <pic:blipFill rotWithShape="1">
+                        <a:blip r:embed="rId14"/>
+                        <a:stretch/>
+                      </pic:blipFill>
+                      <pic:spPr bwMode="auto">
+                        <a:xfrm>
+                          <a:off x="0" y="0"/>
+                          <a:ext cx="5940424" cy="4397934"/>
+                        </a:xfrm>
+                        <a:prstGeom prst="rect">
+                          <a:avLst/>
+                        </a:prstGeom>
+                      </pic:spPr>
+                    </pic:pic>
+                  </a:graphicData>
+                </a:graphic>
+              </wp:inline>
+            </w:drawing>
+          </mc:Choice>
+          <mc:Fallback>
+            <w:pict>
+              <v:shapetype id="_x0000_t75" coordsize="21600,21600" o:spt="75" o:preferrelative="t" path="m@4@5l@4@11@9@11@9@5xe" filled="f" stroked="f">
+                <v:stroke joinstyle="miter"/>
+                <v:formulas>
+                  <v:f eqn="if lineDrawn pixelLineWidth 0"/>
+                  <v:f eqn="sum @0 1 0"/>
+                  <v:f eqn="sum 0 0 @1"/>
+                  <v:f eqn="prod @2 1 2"/>
+                  <v:f eqn="prod @3 21600 pixelWidth"/>
+                  <v:f eqn="prod @3 21600 pixelHeight"/>
+                  <v:f eqn="sum @0 0 1"/>
+                  <v:f eqn="prod @6 1 2"/>
+                  <v:f eqn="prod @7 21600 pixelWidth"/>
+                  <v:f eqn="sum @8 21600 0"/>
+                  <v:f eqn="prod @7 21600 pixelHeight"/>
+                  <v:f eqn="sum @10 21600 0"/>
+                </v:formulas>
+                <v:path o:extrusionok="f" gradientshapeok="t" o:connecttype="rect"/>
+                <o:lock v:ext="edit" aspectratio="t"/>
+              </v:shapetype>
+              <v:shape id="_x0000_i3" o:spid="_x0000_s3" type="#_x0000_t75" style="width:467.75pt;height:346.29pt;mso-wrap-distance-left:0.00pt;mso-wrap-distance-top:0.00pt;mso-wrap-distance-right:0.00pt;mso-wrap-distance-bottom:0.00pt;z-index:1;" stroked="false">
+                <v:imagedata r:id="rId14" o:title=""/>
+                <o:lock v:ext="edit" rotation="t"/>
+              </v:shape>
+            </w:pict>
+          </mc:Fallback>
+        </mc:AlternateContent>
+      </w:r>
+      <w:r>
+        <w:rPr>
+          <w:highlight w:val="none"/>
+        </w:rPr>
+      </w:r>
+      <w:r/>
+      <w:r/>
+      <w:r>
+        <w:rPr>
+          <w:rFonts w:ascii="Times New Roman" w:hAnsi="Times New Roman" w:eastAsia="Times New Roman" w:cs="Times New Roman"/>
+          <w:b/>
+          <w:color w:val="000000"/>
+          <w:sz w:val="24"/>
+        </w:rPr>
+        <w:t xml:space="preserve">Diagramme de déploiement UML</w:t>
+      </w:r>
+      <w:r>
+        <w:rPr>
+          <w:highlight w:val="none"/>
+        </w:rPr>
+      </w:r>
+    </w:p>
+    <w:p>
+      <w:pPr>
+        <w:pBdr/>
+        <w:spacing/>
+        <w:ind/>
+        <w:rPr>
+          <w:rFonts w:ascii="Times New Roman" w:hAnsi="Times New Roman" w:eastAsia="Times New Roman" w:cs="Times New Roman"/>
+          <w:color w:val="000000"/>
+          <w:sz w:val="24"/>
+          <w:szCs w:val="24"/>
+          <w14:ligatures w14:val="none"/>
+        </w:rPr>
+      </w:pPr>
+      <w:r>
+        <w:rPr>
+          <w:rFonts w:ascii="Times New Roman" w:hAnsi="Times New Roman" w:eastAsia="Times New Roman" w:cs="Times New Roman"/>
+          <w:b/>
+          <w:color w:val="000000"/>
+          <w:sz w:val="24"/>
+        </w:rPr>
+      </w:r>
+      <w:r>
+        <w:rPr>
+          <w:rFonts w:ascii="Times New Roman" w:hAnsi="Times New Roman" w:eastAsia="Times New Roman" w:cs="Times New Roman"/>
+          <w:color w:val="000000"/>
+          <w:sz w:val="24"/>
+        </w:rPr>
+        <w:t xml:space="preserve">Le diagramme de déploiement ci-dessus représente l'architecture physique du système de surveillance de la qualité de l'air.</w:t>
+      </w:r>
+      <w:r>
+        <w:rPr>
+          <w:highlight w:val="none"/>
+        </w:rPr>
+      </w:r>
+    </w:p>
+    <w:p>
+      <w:pPr>
+        <w:pBdr/>
+        <w:spacing/>
+        <w:ind/>
+        <w:rPr>
+          <w:rFonts w:ascii="Times New Roman" w:hAnsi="Times New Roman" w:eastAsia="Times New Roman" w:cs="Times New Roman"/>
+          <w:b/>
+          <w:bCs/>
+          <w:color w:val="000000"/>
+          <w:sz w:val="24"/>
+          <w:szCs w:val="24"/>
+          <w14:ligatures w14:val="none"/>
+        </w:rPr>
+      </w:pPr>
+      <w:r>
+        <w:rPr>
+          <w:rFonts w:ascii="Times New Roman" w:hAnsi="Times New Roman" w:eastAsia="Times New Roman" w:cs="Times New Roman"/>
+          <w:color w:val="000000"/>
+          <w:sz w:val="24"/>
+        </w:rPr>
+      </w:r>
+      <w:r>
+        <w:rPr>
+          <w:rFonts w:ascii="Times New Roman" w:hAnsi="Times New Roman" w:eastAsia="Times New Roman" w:cs="Times New Roman"/>
+          <w:b/>
+          <w:color w:val="000000"/>
+          <w:sz w:val="24"/>
+        </w:rPr>
+        <w:t xml:space="preserve">Nœuds d'exécution et périphériques</w:t>
+      </w:r>
+      <w:r>
+        <w:rPr>
+          <w:highlight w:val="none"/>
+        </w:rPr>
+      </w:r>
+    </w:p>
+    <w:p>
+      <w:pPr>
+        <w:pBdr/>
+        <w:spacing/>
+        <w:ind/>
+        <w:rPr>
+          <w:rFonts w:ascii="Times New Roman" w:hAnsi="Times New Roman" w:eastAsia="Times New Roman" w:cs="Times New Roman"/>
+          <w:color w:val="000000"/>
+          <w:sz w:val="24"/>
+          <w:szCs w:val="24"/>
+          <w14:ligatures w14:val="none"/>
+        </w:rPr>
+      </w:pPr>
+      <w:r>
+        <w:rPr>
+          <w:rFonts w:ascii="Times New Roman" w:hAnsi="Times New Roman" w:eastAsia="Times New Roman" w:cs="Times New Roman"/>
+          <w:b/>
+          <w:color w:val="000000"/>
+          <w:sz w:val="24"/>
+        </w:rPr>
+      </w:r>
+      <w:r>
+        <w:rPr>
+          <w:rFonts w:ascii="Times New Roman" w:hAnsi="Times New Roman" w:eastAsia="Times New Roman" w:cs="Times New Roman"/>
+          <w:color w:val="000000"/>
+          <w:sz w:val="24"/>
+        </w:rPr>
+        <w:t xml:space="preserve">Le système repose sur deux types de sondes déployées sur un VLAN dédié (VLAN Sondes).</w:t>
+      </w:r>
+      <w:r>
+        <w:rPr>
+          <w:rFonts w:ascii="Times New Roman" w:hAnsi="Times New Roman" w:eastAsia="Times New Roman" w:cs="Times New Roman"/>
+          <w:color w:val="000000"/>
+          <w:sz w:val="24"/>
+        </w:rPr>
+        <w:t xml:space="preserve"> Chacune embarque une carte </w:t>
+      </w:r>
+      <w:r>
+        <w:rPr>
+          <w:rFonts w:ascii="Times New Roman" w:hAnsi="Times New Roman" w:eastAsia="Times New Roman" w:cs="Times New Roman"/>
+          <w:i w:val="0"/>
+          <w:iCs w:val="0"/>
+          <w:color w:val="000000"/>
+          <w:sz w:val="24"/>
+        </w:rPr>
+        <w:t xml:space="preserve">Unihiker</w:t>
+      </w:r>
+      <w:r>
+        <w:rPr>
+          <w:rFonts w:ascii="Times New Roman" w:hAnsi="Times New Roman" w:eastAsia="Times New Roman" w:cs="Times New Roman"/>
+          <w:color w:val="000000"/>
+          <w:sz w:val="24"/>
+        </w:rPr>
+        <w:t xml:space="preserve"> qui héberge quatre modules logiciels : un module de transmission, un module de mesure, un module d'affichage et un module d'alerte. </w:t>
+        <w:br/>
+      </w:r>
+      <w:r>
+        <w:rPr>
+          <w:rFonts w:ascii="Times New Roman" w:hAnsi="Times New Roman" w:eastAsia="Times New Roman" w:cs="Times New Roman"/>
+          <w:color w:val="000000"/>
+          <w:sz w:val="24"/>
+        </w:rPr>
+        <w:t xml:space="preserve">La sonde particules bois est connectée à un capteur de particules via une liaison série </w:t>
+      </w:r>
+      <w:r>
+        <w:rPr>
+          <w:rFonts w:ascii="Times New Roman" w:hAnsi="Times New Roman" w:eastAsia="Times New Roman" w:cs="Times New Roman"/>
+          <w:b w:val="0"/>
+          <w:bCs w:val="0"/>
+          <w:color w:val="000000"/>
+          <w:sz w:val="24"/>
+        </w:rPr>
+        <w:t xml:space="preserve">UART</w:t>
+      </w:r>
+      <w:r>
+        <w:rPr>
+          <w:rFonts w:ascii="Times New Roman" w:hAnsi="Times New Roman" w:eastAsia="Times New Roman" w:cs="Times New Roman"/>
+          <w:color w:val="000000"/>
+          <w:sz w:val="24"/>
+        </w:rPr>
+        <w:t xml:space="preserve">. La sonde solvants collage est reliée à un capteur TVOC et CO2 via une liaison série</w:t>
+      </w:r>
+      <w:r>
+        <w:rPr>
+          <w:rFonts w:ascii="Times New Roman" w:hAnsi="Times New Roman" w:eastAsia="Times New Roman" w:cs="Times New Roman"/>
+          <w:b w:val="0"/>
+          <w:bCs w:val="0"/>
+          <w:color w:val="000000"/>
+          <w:sz w:val="24"/>
+        </w:rPr>
+        <w:t xml:space="preserve"> </w:t>
+      </w:r>
+      <w:r>
+        <w:rPr>
+          <w:rFonts w:ascii="Times New Roman" w:hAnsi="Times New Roman" w:eastAsia="Times New Roman" w:cs="Times New Roman"/>
+          <w:b w:val="0"/>
+          <w:bCs w:val="0"/>
+          <w:color w:val="000000"/>
+          <w:sz w:val="24"/>
+        </w:rPr>
+        <w:t xml:space="preserve">I2C</w:t>
+      </w:r>
+      <w:r>
+        <w:rPr>
+          <w:rFonts w:ascii="Times New Roman" w:hAnsi="Times New Roman" w:eastAsia="Times New Roman" w:cs="Times New Roman"/>
+          <w:color w:val="000000"/>
+          <w:sz w:val="24"/>
+        </w:rPr>
+        <w:t xml:space="preserve">.</w:t>
+      </w:r>
+      <w:r/>
+      <w:r>
+        <w:rPr>
+          <w:rFonts w:ascii="Times New Roman" w:hAnsi="Times New Roman" w:eastAsia="Times New Roman" w:cs="Times New Roman"/>
+          <w:color w:val="000000"/>
+          <w:sz w:val="24"/>
+          <w:szCs w:val="24"/>
+        </w:rPr>
+      </w:r>
+    </w:p>
+    <w:p>
+      <w:pPr>
+        <w:pBdr/>
+        <w:spacing/>
+        <w:ind/>
+        <w:rPr>
+          <w:rFonts w:ascii="Times New Roman" w:hAnsi="Times New Roman" w:eastAsia="Times New Roman" w:cs="Times New Roman"/>
+          <w:b/>
+          <w:bCs/>
+          <w:color w:val="000000"/>
+          <w:sz w:val="24"/>
+          <w:szCs w:val="24"/>
+          <w14:ligatures w14:val="none"/>
+        </w:rPr>
+      </w:pPr>
+      <w:r>
+        <w:rPr>
+          <w:rFonts w:ascii="Times New Roman" w:hAnsi="Times New Roman" w:eastAsia="Times New Roman" w:cs="Times New Roman"/>
+          <w:color w:val="000000"/>
+          <w:sz w:val="24"/>
+        </w:rPr>
+      </w:r>
+      <w:r>
+        <w:rPr>
+          <w:rFonts w:ascii="Times New Roman" w:hAnsi="Times New Roman" w:eastAsia="Times New Roman" w:cs="Times New Roman"/>
+          <w:b/>
+          <w:color w:val="000000"/>
+          <w:sz w:val="24"/>
+        </w:rPr>
+        <w:t xml:space="preserve">Éléments du réseau</w:t>
+      </w:r>
+      <w:r>
+        <w:rPr>
+          <w:highlight w:val="none"/>
+        </w:rPr>
+      </w:r>
+    </w:p>
+    <w:p>
+      <w:pPr>
+        <w:pBdr/>
+        <w:spacing/>
+        <w:ind/>
+        <w:rPr>
+          <w:rFonts w:ascii="Times New Roman" w:hAnsi="Times New Roman" w:eastAsia="Times New Roman" w:cs="Times New Roman"/>
+          <w:color w:val="000000"/>
+          <w:sz w:val="24"/>
+          <w:szCs w:val="24"/>
+          <w14:ligatures w14:val="none"/>
+        </w:rPr>
+      </w:pPr>
+      <w:r>
+        <w:rPr>
+          <w:rFonts w:ascii="Times New Roman" w:hAnsi="Times New Roman" w:eastAsia="Times New Roman" w:cs="Times New Roman"/>
+          <w:b/>
+          <w:color w:val="000000"/>
+          <w:sz w:val="24"/>
+        </w:rPr>
+      </w:r>
+      <w:r>
+        <w:rPr>
+          <w:rFonts w:ascii="Times New Roman" w:hAnsi="Times New Roman" w:eastAsia="Times New Roman" w:cs="Times New Roman"/>
+          <w:color w:val="000000"/>
+          <w:sz w:val="24"/>
+        </w:rPr>
+        <w:t xml:space="preserve">Les deux sondes communiquent sans fil avec un </w:t>
+      </w:r>
+      <w:r>
+        <w:rPr>
+          <w:rFonts w:ascii="Times New Roman" w:hAnsi="Times New Roman" w:eastAsia="Times New Roman" w:cs="Times New Roman"/>
+          <w:i w:val="0"/>
+          <w:iCs w:val="0"/>
+          <w:color w:val="000000"/>
+          <w:sz w:val="24"/>
+        </w:rPr>
+        <w:t xml:space="preserve">Point d'accès sans fil</w:t>
+      </w:r>
+      <w:r>
+        <w:rPr>
+          <w:rFonts w:ascii="Times New Roman" w:hAnsi="Times New Roman" w:eastAsia="Times New Roman" w:cs="Times New Roman"/>
+          <w:color w:val="000000"/>
+          <w:sz w:val="24"/>
+        </w:rPr>
+        <w:t xml:space="preserve"> via le protocole MQTT.</w:t>
+      </w:r>
+      <w:r>
+        <w:rPr>
+          <w:rFonts w:ascii="Times New Roman" w:hAnsi="Times New Roman" w:eastAsia="Times New Roman" w:cs="Times New Roman"/>
+          <w:i/>
+          <w:color w:val="000000"/>
+          <w:sz w:val="24"/>
+        </w:rPr>
+        <w:t xml:space="preserve"> </w:t>
+      </w:r>
+      <w:r>
+        <w:rPr>
+          <w:rFonts w:ascii="Times New Roman" w:hAnsi="Times New Roman" w:eastAsia="Times New Roman" w:cs="Times New Roman"/>
+          <w:i w:val="0"/>
+          <w:iCs w:val="0"/>
+          <w:color w:val="000000"/>
+          <w:sz w:val="24"/>
+        </w:rPr>
+        <w:t xml:space="preserve">Ce point d'accès est relié par </w:t>
+      </w:r>
+      <w:r>
+        <w:rPr>
+          <w:rFonts w:ascii="Times New Roman" w:hAnsi="Times New Roman" w:eastAsia="Times New Roman" w:cs="Times New Roman"/>
+          <w:b w:val="0"/>
+          <w:bCs w:val="0"/>
+          <w:i w:val="0"/>
+          <w:iCs w:val="0"/>
+          <w:color w:val="000000"/>
+          <w:sz w:val="24"/>
+        </w:rPr>
+        <w:t xml:space="preserve">Ethernet</w:t>
+      </w:r>
+      <w:r>
+        <w:rPr>
+          <w:rFonts w:ascii="Times New Roman" w:hAnsi="Times New Roman" w:eastAsia="Times New Roman" w:cs="Times New Roman"/>
+          <w:i w:val="0"/>
+          <w:iCs w:val="0"/>
+          <w:color w:val="000000"/>
+          <w:sz w:val="24"/>
+        </w:rPr>
+        <w:t xml:space="preserve"> à un Commutateur connecté à un Routeur</w:t>
+      </w:r>
+      <w:r>
+        <w:rPr>
+          <w:rFonts w:ascii="Times New Roman" w:hAnsi="Times New Roman" w:eastAsia="Times New Roman" w:cs="Times New Roman"/>
+          <w:i w:val="0"/>
+          <w:iCs w:val="0"/>
+          <w:color w:val="000000"/>
+          <w:sz w:val="24"/>
+        </w:rPr>
+        <w:t xml:space="preserve">.</w:t>
+      </w:r>
+      <w:r>
+        <w:rPr>
+          <w:rFonts w:ascii="Times New Roman" w:hAnsi="Times New Roman" w:eastAsia="Times New Roman" w:cs="Times New Roman"/>
+          <w:color w:val="000000"/>
+          <w:sz w:val="24"/>
+        </w:rPr>
+        <w:t xml:space="preserve"> Le routeur </w:t>
+      </w:r>
+      <w:r>
+        <w:rPr>
+          <w:rFonts w:ascii="Times New Roman" w:hAnsi="Times New Roman" w:eastAsia="Times New Roman" w:cs="Times New Roman"/>
+          <w:color w:val="000000"/>
+          <w:sz w:val="24"/>
+        </w:rPr>
+        <w:t xml:space="preserve">assure la connexion </w:t>
+      </w:r>
+      <w:r>
+        <w:rPr>
+          <w:rFonts w:ascii="Times New Roman" w:hAnsi="Times New Roman" w:eastAsia="Times New Roman" w:cs="Times New Roman"/>
+          <w:b w:val="0"/>
+          <w:bCs w:val="0"/>
+          <w:color w:val="000000"/>
+          <w:sz w:val="24"/>
+        </w:rPr>
+        <w:t xml:space="preserve">Internet</w:t>
+      </w:r>
+      <w:r>
+        <w:rPr>
+          <w:rFonts w:ascii="Times New Roman" w:hAnsi="Times New Roman" w:eastAsia="Times New Roman" w:cs="Times New Roman"/>
+          <w:color w:val="000000"/>
+          <w:sz w:val="24"/>
+        </w:rPr>
+        <w:t xml:space="preserve"> vers le </w:t>
+      </w:r>
+      <w:r>
+        <w:rPr>
+          <w:rFonts w:ascii="Times New Roman" w:hAnsi="Times New Roman" w:eastAsia="Times New Roman" w:cs="Times New Roman"/>
+          <w:i w:val="0"/>
+          <w:iCs w:val="0"/>
+          <w:color w:val="000000"/>
+          <w:sz w:val="24"/>
+        </w:rPr>
+        <w:t xml:space="preserve">Serveur Marais_R_Site</w:t>
+      </w:r>
+      <w:r>
+        <w:rPr>
+          <w:rFonts w:ascii="Times New Roman" w:hAnsi="Times New Roman" w:eastAsia="Times New Roman" w:cs="Times New Roman"/>
+          <w:color w:val="000000"/>
+          <w:sz w:val="24"/>
+        </w:rPr>
+        <w:t xml:space="preserve"> qui héberge le site web de supervision.</w:t>
+      </w:r>
+      <w:r>
+        <w:rPr>
+          <w:highlight w:val="none"/>
+        </w:rPr>
+      </w:r>
+    </w:p>
+    <w:p>
+      <w:pPr>
+        <w:pBdr/>
+        <w:spacing/>
+        <w:ind/>
+        <w:rPr>
+          <w:rFonts w:ascii="Times New Roman" w:hAnsi="Times New Roman" w:eastAsia="Times New Roman" w:cs="Times New Roman"/>
+          <w:b/>
+          <w:bCs/>
+          <w:color w:val="000000"/>
+          <w:sz w:val="24"/>
+          <w:szCs w:val="24"/>
+          <w14:ligatures w14:val="none"/>
+        </w:rPr>
+      </w:pPr>
+      <w:r>
+        <w:rPr>
+          <w:rFonts w:ascii="Times New Roman" w:hAnsi="Times New Roman" w:eastAsia="Times New Roman" w:cs="Times New Roman"/>
+          <w:color w:val="000000"/>
+          <w:sz w:val="24"/>
+        </w:rPr>
+      </w:r>
+      <w:r>
+        <w:rPr>
+          <w:rFonts w:ascii="Times New Roman" w:hAnsi="Times New Roman" w:eastAsia="Times New Roman" w:cs="Times New Roman"/>
+          <w:b/>
+          <w:color w:val="000000"/>
+          <w:sz w:val="24"/>
+        </w:rPr>
+        <w:t xml:space="preserve">Module d'alerte visuelle</w:t>
+      </w:r>
+      <w:r>
+        <w:rPr>
+          <w:highlight w:val="none"/>
+        </w:rPr>
+      </w:r>
+    </w:p>
+    <w:p>
+      <w:pPr>
+        <w:pBdr/>
+        <w:spacing/>
+        <w:ind/>
+        <w:rPr>
+          <w:rFonts w:ascii="Times New Roman" w:hAnsi="Times New Roman" w:eastAsia="Times New Roman" w:cs="Times New Roman"/>
+          <w:color w:val="000000"/>
+          <w:sz w:val="24"/>
+          <w:szCs w:val="24"/>
+          <w14:ligatures w14:val="none"/>
+        </w:rPr>
+      </w:pPr>
+      <w:r>
+        <w:rPr>
+          <w:rFonts w:ascii="Times New Roman" w:hAnsi="Times New Roman" w:eastAsia="Times New Roman" w:cs="Times New Roman"/>
+          <w:b/>
+          <w:color w:val="000000"/>
+          <w:sz w:val="24"/>
+        </w:rPr>
+      </w:r>
+      <w:r>
+        <w:rPr>
+          <w:rFonts w:ascii="Times New Roman" w:hAnsi="Times New Roman" w:eastAsia="Times New Roman" w:cs="Times New Roman"/>
+          <w:color w:val="000000"/>
+          <w:sz w:val="24"/>
+        </w:rPr>
+        <w:t xml:space="preserve">Le point d'accès communique également via </w:t>
+      </w:r>
+      <w:r>
+        <w:rPr>
+          <w:rFonts w:ascii="Times New Roman" w:hAnsi="Times New Roman" w:eastAsia="Times New Roman" w:cs="Times New Roman"/>
+          <w:b w:val="0"/>
+          <w:bCs w:val="0"/>
+          <w:color w:val="000000"/>
+          <w:sz w:val="24"/>
+        </w:rPr>
+        <w:t xml:space="preserve">MQTT</w:t>
+      </w:r>
+      <w:r>
+        <w:rPr>
+          <w:rFonts w:ascii="Times New Roman" w:hAnsi="Times New Roman" w:eastAsia="Times New Roman" w:cs="Times New Roman"/>
+          <w:color w:val="000000"/>
+          <w:sz w:val="24"/>
+        </w:rPr>
+        <w:t xml:space="preserve"> avec un module d'alerte visuelle composé d'un relais WiFi connecté électriquement à un gyrophare</w:t>
+      </w:r>
+      <w:r>
+        <w:rPr>
+          <w:rFonts w:ascii="Times New Roman" w:hAnsi="Times New Roman" w:eastAsia="Times New Roman" w:cs="Times New Roman"/>
+          <w:color w:val="000000"/>
+          <w:sz w:val="24"/>
+        </w:rPr>
+        <w:t xml:space="preserve">, permettant une signalisation physique en cas de dépassement de seuil.</w:t>
+        <w:br/>
+        <w:t xml:space="preserve">De plus, si le module d’alerte de la carte Unihiker détecte un dépassement des seuils, il sera affiché une alerte sur l’écran de la carte.</w:t>
+      </w:r>
+      <w:r>
+        <w:rPr>
+          <w:highlight w:val="none"/>
+        </w:rPr>
+      </w:r>
+    </w:p>
+    <w:p>
+      <w:pPr>
+        <w:pBdr/>
+        <w:spacing/>
+        <w:ind/>
+        <w:rPr>
+          <w:rFonts w:ascii="Times New Roman" w:hAnsi="Times New Roman" w:eastAsia="Times New Roman" w:cs="Times New Roman"/>
+          <w:b/>
+          <w:bCs/>
+          <w:color w:val="000000"/>
+          <w:sz w:val="24"/>
+          <w:szCs w:val="24"/>
+          <w14:ligatures w14:val="none"/>
+        </w:rPr>
+      </w:pPr>
+      <w:r>
+        <w:rPr>
+          <w:rFonts w:ascii="Times New Roman" w:hAnsi="Times New Roman" w:eastAsia="Times New Roman" w:cs="Times New Roman"/>
+          <w:color w:val="000000"/>
+          <w:sz w:val="24"/>
+        </w:rPr>
+      </w:r>
+      <w:r>
+        <w:rPr>
+          <w:rFonts w:ascii="Times New Roman" w:hAnsi="Times New Roman" w:eastAsia="Times New Roman" w:cs="Times New Roman"/>
+          <w:b/>
+          <w:color w:val="000000"/>
+          <w:sz w:val="24"/>
+        </w:rPr>
+        <w:t xml:space="preserve">Bus, liaisons et protocoles</w:t>
+      </w:r>
+      <w:r>
+        <w:rPr>
+          <w:highlight w:val="none"/>
+        </w:rPr>
+      </w:r>
+    </w:p>
+    <w:p>
+      <w:pPr>
+        <w:pBdr/>
+        <w:spacing/>
+        <w:ind/>
+        <w:rPr>
+          <w:highlight w:val="none"/>
+          <w14:ligatures w14:val="none"/>
+        </w:rPr>
+      </w:pPr>
+      <w:r>
+        <w:rPr>
+          <w:rFonts w:ascii="Times New Roman" w:hAnsi="Times New Roman" w:eastAsia="Times New Roman" w:cs="Times New Roman"/>
+          <w:b/>
+          <w:color w:val="000000"/>
+          <w:sz w:val="24"/>
+        </w:rPr>
+      </w:r>
+      <w:r>
+        <w:rPr>
+          <w:rFonts w:ascii="Times New Roman" w:hAnsi="Times New Roman" w:eastAsia="Times New Roman" w:cs="Times New Roman"/>
+          <w:color w:val="000000"/>
+          <w:sz w:val="24"/>
+        </w:rPr>
+        <w:t xml:space="preserve">Les protocoles et liaisons mis en œuvre sont les suivants : UART et I2C pour les liaisons capteurs, MQTT sur WiFi pour l’envoi des données des sondes, Ethernet pour l'interconnexion des équipements réseau, et Internet pour l'accès distant au serveur we</w:t>
+      </w:r>
+      <w:r>
+        <w:rPr>
+          <w:rFonts w:ascii="Times New Roman" w:hAnsi="Times New Roman" w:eastAsia="Times New Roman" w:cs="Times New Roman"/>
+          <w:color w:val="000000"/>
+          <w:sz w:val="24"/>
+        </w:rPr>
+        <w:t xml:space="preserve">b.</w:t>
+      </w:r>
+      <w:r>
+        <w:rPr>
+          <w:highlight w:val="none"/>
+        </w:rPr>
+      </w:r>
+      <w:r/>
+    </w:p>
+    <w:p>
+      <w:pPr>
+        <w:pBdr/>
+        <w:spacing/>
+        <w:ind/>
+        <w:rPr/>
+      </w:pPr>
+      <w:r>
+        <w:rPr>
+          <w:highlight w:val="none"/>
+        </w:rPr>
+      </w:r>
+      <w:r>
+        <w:rPr>
+          <w:highlight w:val="none"/>
+        </w:rPr>
+      </w:r>
+      <w:r>
+        <w:rPr>
           <w:highlight w:val="none"/>
         </w:rPr>
       </w:r>

</xml_diff>

<commit_message>
Version fusion de partie mateo et moi
</commit_message>
<xml_diff>
--- a/marais_r_sense_dossier_technique_partie_commune.docx
+++ b/marais_r_sense_dossier_technique_partie_commune.docx
@@ -624,16 +624,7 @@
         </w:rPr>
       </w:r>
       <w:bookmarkEnd w:id="1"/>
-      <w:r>
-        <w:rPr>
-          <w:rFonts w:ascii="Times New Roman" w:hAnsi="Times New Roman" w:eastAsia="Times New Roman" w:cs="Times New Roman"/>
-          <w:b/>
-          <w:bCs/>
-          <w:sz w:val="48"/>
-          <w:szCs w:val="48"/>
-          <w:highlight w:val="none"/>
-        </w:rPr>
-      </w:r>
+      <w:r/>
       <w:r>
         <w:rPr>
           <w:rFonts w:ascii="Times New Roman" w:hAnsi="Times New Roman" w:eastAsia="Times New Roman" w:cs="Times New Roman"/>
@@ -746,12 +737,6 @@
               <w:highlight w:val="none"/>
             </w:rPr>
           </w:r>
-          <w:r>
-            <w:rPr>
-              <w:rFonts w:ascii="Times New Roman" w:hAnsi="Times New Roman" w:eastAsia="Times New Roman" w:cs="Times New Roman"/>
-              <w:highlight w:val="none"/>
-            </w:rPr>
-          </w:r>
         </w:p>
         <w:p>
           <w:pPr>
@@ -767,7 +752,6 @@
               <w14:ligatures w14:val="none"/>
             </w:rPr>
           </w:pPr>
-          <w:r/>
           <w:hyperlink w:tooltip="#_Toc2" w:anchor="_Toc2" w:history="1">
             <w:r>
               <w:rPr>
@@ -824,12 +808,6 @@
               <w14:ligatures w14:val="none"/>
             </w:rPr>
           </w:r>
-          <w:r>
-            <w:rPr>
-              <w:highlight w:val="none"/>
-              <w14:ligatures w14:val="none"/>
-            </w:rPr>
-          </w:r>
         </w:p>
         <w:p>
           <w:pPr>
@@ -845,7 +823,6 @@
               <w:highlight w:val="none"/>
             </w:rPr>
           </w:pPr>
-          <w:r/>
           <w:hyperlink w:tooltip="#_Toc3" w:anchor="_Toc3" w:history="1">
             <w:r>
               <w:rPr>
@@ -882,12 +859,6 @@
               <w:highlight w:val="none"/>
             </w:rPr>
           </w:r>
-          <w:r>
-            <w:rPr>
-              <w:rFonts w:ascii="Times New Roman" w:hAnsi="Times New Roman" w:eastAsia="Times New Roman" w:cs="Times New Roman"/>
-              <w:highlight w:val="none"/>
-            </w:rPr>
-          </w:r>
         </w:p>
         <w:p>
           <w:pPr>
@@ -900,7 +871,6 @@
             <w:ind/>
             <w:rPr/>
           </w:pPr>
-          <w:r/>
           <w:hyperlink w:tooltip="#_Toc4" w:anchor="_Toc4" w:history="1">
             <w:r>
               <w:rPr>
@@ -940,7 +910,6 @@
             </w:r>
           </w:hyperlink>
           <w:r/>
-          <w:r/>
         </w:p>
         <w:p>
           <w:pPr>
@@ -953,7 +922,6 @@
             <w:ind/>
             <w:rPr/>
           </w:pPr>
-          <w:r/>
           <w:hyperlink w:tooltip="#_Toc5" w:anchor="_Toc5" w:history="1">
             <w:r>
               <w:rPr>
@@ -983,7 +951,318 @@
             </w:r>
           </w:hyperlink>
           <w:r/>
+        </w:p>
+        <w:p>
+          <w:pPr>
+            <w:pStyle w:val="893"/>
+            <w:pBdr/>
+            <w:tabs>
+              <w:tab w:val="right" w:leader="dot" w:pos="9355"/>
+            </w:tabs>
+            <w:spacing/>
+            <w:ind/>
+            <w:rPr/>
+          </w:pPr>
+          <w:hyperlink w:tooltip="#_Toc6" w:anchor="_Toc6" w:history="1">
+            <w:r>
+              <w:rPr>
+                <w:rStyle w:val="890"/>
+              </w:rPr>
+            </w:r>
+            <w:r>
+              <w:rPr>
+                <w:rStyle w:val="890"/>
+              </w:rPr>
+              <w:t xml:space="preserve">Scénarios associés</w:t>
+            </w:r>
+            <w:r>
+              <w:rPr>
+                <w:rStyle w:val="890"/>
+              </w:rPr>
+            </w:r>
+            <w:r>
+              <w:tab/>
+            </w:r>
+            <w:r>
+              <w:fldChar w:fldCharType="begin"/>
+              <w:instrText xml:space="preserve">PAGEREF _Toc6 \h</w:instrText>
+              <w:fldChar w:fldCharType="separate"/>
+              <w:t xml:space="preserve">5</w:t>
+              <w:fldChar w:fldCharType="end"/>
+            </w:r>
+          </w:hyperlink>
           <w:r/>
+        </w:p>
+        <w:p>
+          <w:pPr>
+            <w:pStyle w:val="893"/>
+            <w:pBdr/>
+            <w:tabs>
+              <w:tab w:val="right" w:leader="dot" w:pos="9355"/>
+            </w:tabs>
+            <w:spacing/>
+            <w:ind/>
+            <w:rPr>
+              <w:rFonts w:ascii="Times New Roman" w:hAnsi="Times New Roman" w:eastAsia="Times New Roman" w:cs="Times New Roman"/>
+              <w:highlight w:val="none"/>
+            </w:rPr>
+          </w:pPr>
+          <w:hyperlink w:tooltip="#_Toc7" w:anchor="_Toc7" w:history="1">
+            <w:r>
+              <w:rPr>
+                <w:rStyle w:val="890"/>
+              </w:rPr>
+            </w:r>
+            <w:r>
+              <w:rPr>
+                <w:rStyle w:val="890"/>
+              </w:rPr>
+            </w:r>
+            <w:r>
+              <w:rPr>
+                <w:rStyle w:val="890"/>
+                <w:rFonts w:ascii="Times New Roman" w:hAnsi="Times New Roman" w:eastAsia="Times New Roman" w:cs="Times New Roman"/>
+              </w:rPr>
+              <w:t xml:space="preserve"> </w:t>
+            </w:r>
+            <w:r>
+              <w:rPr>
+                <w:rStyle w:val="890"/>
+                <w:rFonts w:ascii="Times New Roman" w:hAnsi="Times New Roman" w:eastAsia="Times New Roman" w:cs="Times New Roman"/>
+                <w:highlight w:val="none"/>
+              </w:rPr>
+            </w:r>
+            <w:r>
+              <w:tab/>
+            </w:r>
+            <w:r>
+              <w:fldChar w:fldCharType="begin"/>
+              <w:instrText xml:space="preserve">PAGEREF _Toc7 \h</w:instrText>
+              <w:fldChar w:fldCharType="separate"/>
+              <w:t xml:space="preserve">5</w:t>
+              <w:fldChar w:fldCharType="end"/>
+            </w:r>
+          </w:hyperlink>
+          <w:r>
+            <w:rPr>
+              <w:rFonts w:ascii="Times New Roman" w:hAnsi="Times New Roman" w:eastAsia="Times New Roman" w:cs="Times New Roman"/>
+              <w:highlight w:val="none"/>
+            </w:rPr>
+          </w:r>
+        </w:p>
+        <w:p>
+          <w:pPr>
+            <w:pStyle w:val="893"/>
+            <w:pBdr/>
+            <w:tabs>
+              <w:tab w:val="right" w:leader="dot" w:pos="9355"/>
+            </w:tabs>
+            <w:spacing/>
+            <w:ind/>
+            <w:rPr>
+              <w:rFonts w:ascii="Times New Roman" w:hAnsi="Times New Roman" w:eastAsia="Times New Roman" w:cs="Times New Roman"/>
+              <w:highlight w:val="none"/>
+            </w:rPr>
+          </w:pPr>
+          <w:hyperlink w:tooltip="#_Toc8" w:anchor="_Toc8" w:history="1">
+            <w:r>
+              <w:rPr>
+                <w:rStyle w:val="890"/>
+              </w:rPr>
+            </w:r>
+            <w:r>
+              <w:rPr>
+                <w:rStyle w:val="890"/>
+                <w:rFonts w:ascii="Times New Roman" w:hAnsi="Times New Roman" w:eastAsia="Times New Roman" w:cs="Times New Roman"/>
+              </w:rPr>
+              <w:t xml:space="preserve">IHM</w:t>
+            </w:r>
+            <w:r>
+              <w:rPr>
+                <w:rStyle w:val="890"/>
+                <w:rFonts w:ascii="Times New Roman" w:hAnsi="Times New Roman" w:eastAsia="Times New Roman" w:cs="Times New Roman"/>
+                <w:highlight w:val="none"/>
+              </w:rPr>
+              <w:t xml:space="preserve"> </w:t>
+            </w:r>
+            <w:r>
+              <w:rPr>
+                <w:rStyle w:val="890"/>
+                <w:rFonts w:ascii="Times New Roman" w:hAnsi="Times New Roman" w:eastAsia="Times New Roman" w:cs="Times New Roman"/>
+                <w:highlight w:val="none"/>
+              </w:rPr>
+            </w:r>
+            <w:r>
+              <w:tab/>
+            </w:r>
+            <w:r>
+              <w:fldChar w:fldCharType="begin"/>
+              <w:instrText xml:space="preserve">PAGEREF _Toc8 \h</w:instrText>
+              <w:fldChar w:fldCharType="separate"/>
+              <w:t xml:space="preserve">5</w:t>
+              <w:fldChar w:fldCharType="end"/>
+            </w:r>
+          </w:hyperlink>
+          <w:r>
+            <w:rPr>
+              <w:rFonts w:ascii="Times New Roman" w:hAnsi="Times New Roman" w:eastAsia="Times New Roman" w:cs="Times New Roman"/>
+              <w:highlight w:val="none"/>
+            </w:rPr>
+          </w:r>
+        </w:p>
+        <w:p>
+          <w:pPr>
+            <w:pStyle w:val="893"/>
+            <w:pBdr/>
+            <w:tabs>
+              <w:tab w:val="right" w:leader="dot" w:pos="9355"/>
+            </w:tabs>
+            <w:spacing/>
+            <w:ind/>
+            <w:rPr>
+              <w:highlight w:val="none"/>
+              <w14:ligatures w14:val="none"/>
+            </w:rPr>
+          </w:pPr>
+          <w:hyperlink w:tooltip="#_Toc9" w:anchor="_Toc9" w:history="1">
+            <w:r>
+              <w:rPr>
+                <w:rStyle w:val="890"/>
+              </w:rPr>
+            </w:r>
+            <w:r>
+              <w:rPr>
+                <w:rStyle w:val="890"/>
+                <w:highlight w:val="none"/>
+              </w:rPr>
+              <w:t xml:space="preserve">Contraintes diverses exprimées par le demandeur </w:t>
+            </w:r>
+            <w:r>
+              <w:rPr>
+                <w:rStyle w:val="890"/>
+                <w:highlight w:val="none"/>
+                <w14:ligatures w14:val="none"/>
+              </w:rPr>
+            </w:r>
+            <w:r>
+              <w:tab/>
+            </w:r>
+            <w:r>
+              <w:fldChar w:fldCharType="begin"/>
+              <w:instrText xml:space="preserve">PAGEREF _Toc9 \h</w:instrText>
+              <w:fldChar w:fldCharType="separate"/>
+              <w:t xml:space="preserve">6</w:t>
+              <w:fldChar w:fldCharType="end"/>
+            </w:r>
+          </w:hyperlink>
+          <w:r>
+            <w:rPr>
+              <w:highlight w:val="none"/>
+              <w14:ligatures w14:val="none"/>
+            </w:rPr>
+          </w:r>
+        </w:p>
+        <w:p>
+          <w:pPr>
+            <w:pStyle w:val="892"/>
+            <w:pBdr/>
+            <w:tabs>
+              <w:tab w:val="right" w:leader="dot" w:pos="9355"/>
+            </w:tabs>
+            <w:spacing/>
+            <w:ind/>
+            <w:rPr>
+              <w:rFonts w:ascii="Times New Roman" w:hAnsi="Times New Roman" w:eastAsia="Times New Roman" w:cs="Times New Roman"/>
+              <w:highlight w:val="none"/>
+            </w:rPr>
+          </w:pPr>
+          <w:hyperlink w:tooltip="#_Toc10" w:anchor="_Toc10" w:history="1">
+            <w:r>
+              <w:rPr>
+                <w:rStyle w:val="890"/>
+              </w:rPr>
+            </w:r>
+            <w:r>
+              <w:rPr>
+                <w:rStyle w:val="890"/>
+                <w:rFonts w:ascii="Times New Roman" w:hAnsi="Times New Roman" w:eastAsia="Times New Roman" w:cs="Times New Roman"/>
+                <w:highlight w:val="none"/>
+              </w:rPr>
+              <w:t xml:space="preserve">Étude préliminaire</w:t>
+            </w:r>
+            <w:r>
+              <w:rPr>
+                <w:rStyle w:val="890"/>
+                <w:rFonts w:ascii="Times New Roman" w:hAnsi="Times New Roman" w:eastAsia="Times New Roman" w:cs="Times New Roman"/>
+                <w:highlight w:val="none"/>
+              </w:rPr>
+            </w:r>
+            <w:r>
+              <w:tab/>
+            </w:r>
+            <w:r>
+              <w:fldChar w:fldCharType="begin"/>
+              <w:instrText xml:space="preserve">PAGEREF _Toc10 \h</w:instrText>
+              <w:fldChar w:fldCharType="separate"/>
+              <w:t xml:space="preserve">7</w:t>
+              <w:fldChar w:fldCharType="end"/>
+            </w:r>
+          </w:hyperlink>
+          <w:r>
+            <w:rPr>
+              <w:rFonts w:ascii="Times New Roman" w:hAnsi="Times New Roman" w:eastAsia="Times New Roman" w:cs="Times New Roman"/>
+              <w:highlight w:val="none"/>
+            </w:rPr>
+          </w:r>
+        </w:p>
+        <w:p>
+          <w:pPr>
+            <w:pStyle w:val="893"/>
+            <w:pBdr/>
+            <w:tabs>
+              <w:tab w:val="right" w:leader="dot" w:pos="9355"/>
+            </w:tabs>
+            <w:spacing/>
+            <w:ind/>
+            <w:rPr>
+              <w14:ligatures w14:val="none"/>
+            </w:rPr>
+          </w:pPr>
+          <w:hyperlink w:tooltip="#_Toc11" w:anchor="_Toc11" w:history="1">
+            <w:r>
+              <w:rPr>
+                <w:rStyle w:val="890"/>
+              </w:rPr>
+            </w:r>
+            <w:r>
+              <w:rPr>
+                <w:rStyle w:val="890"/>
+                <w:highlight w:val="none"/>
+              </w:rPr>
+              <w:t xml:space="preserve">Diagramme de déploiement d’exploitation</w:t>
+            </w:r>
+            <w:r>
+              <w:rPr>
+                <w:rStyle w:val="890"/>
+                <w14:ligatures w14:val="none"/>
+              </w:rPr>
+            </w:r>
+            <w:r>
+              <w:tab/>
+            </w:r>
+            <w:r>
+              <w:fldChar w:fldCharType="begin"/>
+              <w:instrText xml:space="preserve">PAGEREF _Toc11 \h</w:instrText>
+              <w:fldChar w:fldCharType="separate"/>
+              <w:t xml:space="preserve">7</w:t>
+              <w:fldChar w:fldCharType="end"/>
+            </w:r>
+          </w:hyperlink>
+          <w:r>
+            <w:rPr>
+              <w14:ligatures w14:val="none"/>
+            </w:rPr>
+          </w:r>
         </w:p>
         <w:p>
           <w:pPr>
@@ -999,6 +1278,7 @@
               <w:highlight w:val="none"/>
             </w:rPr>
           </w:pPr>
+          <w:r/>
           <w:r>
             <w:fldChar w:fldCharType="end"/>
           </w:r>
@@ -1012,16 +1292,7 @@
               <w:highlight w:val="none"/>
             </w:rPr>
           </w:r>
-          <w:r>
-            <w:rPr>
-              <w:rFonts w:ascii="Times New Roman" w:hAnsi="Times New Roman" w:eastAsia="Times New Roman" w:cs="Times New Roman"/>
-              <w:b/>
-              <w:bCs/>
-              <w:sz w:val="48"/>
-              <w:szCs w:val="48"/>
-              <w:highlight w:val="none"/>
-            </w:rPr>
-          </w:r>
+          <w:r/>
         </w:p>
       </w:sdtContent>
     </w:sdt>
@@ -1110,12 +1381,7 @@
         </w:rPr>
       </w:r>
       <w:bookmarkEnd w:id="2"/>
-      <w:r>
-        <w:rPr>
-          <w:highlight w:val="none"/>
-          <w14:ligatures w14:val="none"/>
-        </w:rPr>
-      </w:r>
+      <w:r/>
       <w:r>
         <w:rPr>
           <w:highlight w:val="none"/>
@@ -1288,16 +1554,7 @@
         </w:rPr>
       </w:r>
       <w:bookmarkEnd w:id="3"/>
-      <w:r>
-        <w:rPr>
-          <w:rFonts w:ascii="Times New Roman" w:hAnsi="Times New Roman" w:eastAsia="Times New Roman" w:cs="Times New Roman"/>
-          <w:b/>
-          <w:bCs/>
-          <w:sz w:val="48"/>
-          <w:szCs w:val="48"/>
-          <w:highlight w:val="none"/>
-        </w:rPr>
-      </w:r>
+      <w:r/>
       <w:r>
         <w:rPr>
           <w:rFonts w:ascii="Times New Roman" w:hAnsi="Times New Roman" w:eastAsia="Times New Roman" w:cs="Times New Roman"/>
@@ -1381,12 +1638,7 @@
         </w:rPr>
       </w:r>
       <w:bookmarkEnd w:id="4"/>
-      <w:r>
-        <w:rPr>
-          <w:sz w:val="36"/>
-          <w:szCs w:val="36"/>
-        </w:rPr>
-      </w:r>
+      <w:r/>
       <w:r>
         <w:rPr>
           <w:sz w:val="36"/>
@@ -1494,6 +1746,7 @@
       <w:r>
         <w:t xml:space="preserve">Tableau description diagramme d’utilisation : </w:t>
       </w:r>
+      <w:r/>
       <w:bookmarkEnd w:id="5"/>
       <w:r/>
       <w:r/>
@@ -3854,6 +4107,7 @@
                 <w:szCs w:val="24"/>
                 <w:highlight w:val="none"/>
               </w:rPr>
+              <w:t xml:space="preserve">Recevoir les seuils </w:t>
             </w:r>
             <w:r>
               <w:rPr>
@@ -3910,6 +4164,7 @@
                 <w:szCs w:val="24"/>
                 <w:highlight w:val="none"/>
               </w:rPr>
+              <w:t xml:space="preserve">1/2/3</w:t>
             </w:r>
             <w:r>
               <w:rPr>
@@ -4083,6 +4338,7 @@
                 <w:szCs w:val="24"/>
                 <w:highlight w:val="none"/>
               </w:rPr>
+              <w:t xml:space="preserve">Recevoir les mesures</w:t>
             </w:r>
             <w:r>
               <w:rPr>
@@ -4139,6 +4395,7 @@
                 <w:szCs w:val="24"/>
                 <w:highlight w:val="none"/>
               </w:rPr>
+              <w:t xml:space="preserve">1/2/3</w:t>
             </w:r>
             <w:r>
               <w:rPr>
@@ -4169,54 +4426,7 @@
         <w:pBdr/>
         <w:shd w:val="nil" w:color="000000"/>
         <w:spacing/>
-        <w:ind w:right="0" w:firstLine="0" w:left="-567"/>
-        <w:jc w:val="left"/>
-        <w:rPr>
-          <w:rFonts w:ascii="Times New Roman" w:hAnsi="Times New Roman" w:eastAsia="Times New Roman" w:cs="Times New Roman"/>
-          <w:b w:val="0"/>
-          <w:bCs w:val="0"/>
-          <w:sz w:val="24"/>
-          <w:szCs w:val="24"/>
-          <w:highlight w:val="none"/>
-        </w:rPr>
-      </w:pPr>
-      <w:r>
-        <w:rPr>
-          <w:rFonts w:ascii="Times New Roman" w:hAnsi="Times New Roman" w:eastAsia="Times New Roman" w:cs="Times New Roman"/>
-          <w:b w:val="0"/>
-          <w:bCs w:val="0"/>
-          <w:sz w:val="24"/>
-          <w:szCs w:val="24"/>
-          <w:highlight w:val="none"/>
-        </w:rPr>
-      </w:r>
-      <w:r>
-        <w:rPr>
-          <w:rFonts w:ascii="Times New Roman" w:hAnsi="Times New Roman" w:eastAsia="Times New Roman" w:cs="Times New Roman"/>
-          <w:b w:val="0"/>
-          <w:bCs w:val="0"/>
-          <w:sz w:val="24"/>
-          <w:szCs w:val="24"/>
-          <w:highlight w:val="none"/>
-        </w:rPr>
-      </w:r>
-      <w:r>
-        <w:rPr>
-          <w:rFonts w:ascii="Times New Roman" w:hAnsi="Times New Roman" w:eastAsia="Times New Roman" w:cs="Times New Roman"/>
-          <w:b w:val="0"/>
-          <w:bCs w:val="0"/>
-          <w:sz w:val="24"/>
-          <w:szCs w:val="24"/>
-          <w:highlight w:val="none"/>
-        </w:rPr>
-      </w:r>
-    </w:p>
-    <w:p>
-      <w:pPr>
-        <w:pBdr/>
-        <w:shd w:val="nil" w:color="000000"/>
-        <w:spacing/>
-        <w:ind w:right="0" w:firstLine="0" w:left="-567"/>
+        <w:ind w:right="0" w:firstLine="0" w:left="0"/>
         <w:jc w:val="left"/>
         <w:rPr>
           <w:rFonts w:ascii="Times New Roman" w:hAnsi="Times New Roman" w:eastAsia="Times New Roman" w:cs="Times New Roman"/>
@@ -4260,11 +4470,30 @@
     </w:p>
     <w:p>
       <w:pPr>
-        <w:pBdr/>
-        <w:shd w:val="nil" w:color="000000"/>
-        <w:spacing/>
-        <w:ind w:right="0" w:firstLine="0" w:left="-567"/>
-        <w:jc w:val="left"/>
+        <w:pStyle w:val="846"/>
+        <w:pBdr/>
+        <w:spacing/>
+        <w:ind/>
+        <w:rPr>
+          <w14:ligatures w14:val="none"/>
+        </w:rPr>
+      </w:pPr>
+      <w:r/>
+      <w:bookmarkStart w:id="6" w:name="_Toc6"/>
+      <w:r>
+        <w:t xml:space="preserve">Scénarios associés</w:t>
+      </w:r>
+      <w:r/>
+      <w:bookmarkEnd w:id="6"/>
+      <w:r/>
+      <w:r/>
+    </w:p>
+    <w:p>
+      <w:pPr>
+        <w:pStyle w:val="846"/>
+        <w:pBdr/>
+        <w:spacing/>
+        <w:ind/>
         <w:rPr>
           <w:rFonts w:ascii="Times New Roman" w:hAnsi="Times New Roman" w:eastAsia="Times New Roman" w:cs="Times New Roman"/>
           <w:b/>
@@ -4274,145 +4503,14 @@
           <w:highlight w:val="none"/>
         </w:rPr>
       </w:pPr>
-      <w:r>
-        <w:rPr>
-          <w:rFonts w:ascii="Times New Roman" w:hAnsi="Times New Roman" w:eastAsia="Times New Roman" w:cs="Times New Roman"/>
-          <w:b/>
-          <w:bCs/>
-          <w:sz w:val="48"/>
-          <w:szCs w:val="48"/>
-          <w:highlight w:val="none"/>
-        </w:rPr>
-        <w:br w:type="page" w:clear="all"/>
-      </w:r>
-      <w:r>
-        <w:rPr>
-          <w:rFonts w:ascii="Times New Roman" w:hAnsi="Times New Roman" w:eastAsia="Times New Roman" w:cs="Times New Roman"/>
-          <w:b/>
-          <w:bCs/>
-          <w:sz w:val="48"/>
-          <w:szCs w:val="48"/>
-          <w:highlight w:val="none"/>
-        </w:rPr>
-      </w:r>
-      <w:r>
-        <w:rPr>
-          <w:rFonts w:ascii="Times New Roman" w:hAnsi="Times New Roman" w:eastAsia="Times New Roman" w:cs="Times New Roman"/>
-          <w:b/>
-          <w:bCs/>
-          <w:sz w:val="48"/>
-          <w:szCs w:val="48"/>
-          <w:highlight w:val="none"/>
-        </w:rPr>
-      </w:r>
-    </w:p>
-    <w:p>
-      <w:pPr>
-        <w:pStyle w:val="845"/>
-        <w:pBdr/>
-        <w:spacing/>
-        <w:ind/>
-        <w:rPr>
-          <w:rFonts w:ascii="Times New Roman" w:hAnsi="Times New Roman" w:eastAsia="Times New Roman" w:cs="Times New Roman"/>
-          <w:b/>
-          <w:bCs/>
-          <w:sz w:val="48"/>
-          <w:szCs w:val="48"/>
-          <w:highlight w:val="none"/>
-        </w:rPr>
-      </w:pPr>
-      <w:r>
-        <w:rPr>
-          <w:rFonts w:ascii="Times New Roman" w:hAnsi="Times New Roman" w:eastAsia="Times New Roman" w:cs="Times New Roman"/>
-          <w:b/>
-          <w:bCs/>
-          <w:sz w:val="48"/>
-          <w:szCs w:val="48"/>
-          <w:highlight w:val="none"/>
-        </w:rPr>
-      </w:r>
-      <w:r>
-        <w:rPr>
-          <w:rFonts w:ascii="Times New Roman" w:hAnsi="Times New Roman" w:eastAsia="Times New Roman" w:cs="Times New Roman"/>
-          <w:b/>
-          <w:bCs/>
-          <w:sz w:val="48"/>
-          <w:szCs w:val="48"/>
-          <w:highlight w:val="none"/>
-        </w:rPr>
-        <w:t xml:space="preserve">Étude préliminaire</w:t>
-      </w:r>
-      <w:r>
-        <w:rPr>
-          <w:rFonts w:ascii="Times New Roman" w:hAnsi="Times New Roman" w:eastAsia="Times New Roman" w:cs="Times New Roman"/>
-          <w:b/>
-          <w:bCs/>
-          <w:sz w:val="48"/>
-          <w:szCs w:val="48"/>
-          <w:highlight w:val="none"/>
-        </w:rPr>
-      </w:r>
-    </w:p>
-    <w:p>
-      <w:pPr>
-        <w:pBdr/>
-        <w:spacing/>
-        <w:ind/>
-        <w:rPr/>
-      </w:pPr>
       <w:r/>
-      <w:r/>
-      <w:r/>
-    </w:p>
-    <w:p>
-      <w:pPr>
-        <w:pStyle w:val="846"/>
-        <w:pBdr/>
-        <w:spacing/>
-        <w:ind/>
-        <w:rPr>
-          <w14:ligatures w14:val="none"/>
-        </w:rPr>
-      </w:pPr>
-      <w:r>
-        <w:rPr>
-          <w:highlight w:val="none"/>
-        </w:rPr>
-      </w:r>
-      <w:r>
-        <w:rPr>
-          <w:highlight w:val="none"/>
-        </w:rPr>
-        <w:t xml:space="preserve">Diagramme de déploiement d’exploitation</w:t>
-      </w:r>
-      <w:r/>
-    </w:p>
-    <w:p>
-      <w:pPr>
-        <w:pBdr/>
-        <w:spacing/>
-        <w:ind/>
-        <w:rPr>
-          <w:rFonts w:ascii="Times New Roman" w:hAnsi="Times New Roman" w:eastAsia="Times New Roman" w:cs="Times New Roman"/>
-          <w:b/>
-          <w:bCs/>
-          <w:color w:val="000000"/>
-          <w:sz w:val="24"/>
-          <w:szCs w:val="24"/>
-          <w14:ligatures w14:val="none"/>
-        </w:rPr>
-      </w:pPr>
-      <w:r>
-        <w:rPr>
-          <w:highlight w:val="none"/>
-        </w:rPr>
-      </w:r>
+      <w:bookmarkStart w:id="7" w:name="_Toc7"/>
       <w:r>
         <mc:AlternateContent>
           <mc:Choice Requires="wpg">
             <w:drawing>
               <wp:inline xmlns:wp="http://schemas.openxmlformats.org/drawingml/2006/wordprocessingDrawing" distT="0" distB="0" distL="0" distR="0">
-                <wp:extent cx="5940425" cy="4397934"/>
+                <wp:extent cx="6348435" cy="3612539"/>
                 <wp:effectExtent l="0" t="0" r="0" b="0"/>
                 <wp:docPr id="4" name=""/>
                 <wp:cNvGraphicFramePr>
@@ -4422,7 +4520,7 @@
                   <a:graphicData uri="http://schemas.openxmlformats.org/drawingml/2006/picture">
                     <pic:pic xmlns:pic="http://schemas.openxmlformats.org/drawingml/2006/picture">
                       <pic:nvPicPr>
-                        <pic:cNvPr id="616372683" name=""/>
+                        <pic:cNvPr id="1818675042" name=""/>
                         <pic:cNvPicPr>
                           <a:picLocks noChangeAspect="1"/>
                         </pic:cNvPicPr>
@@ -4433,9 +4531,9 @@
                         <a:stretch/>
                       </pic:blipFill>
                       <pic:spPr bwMode="auto">
-                        <a:xfrm>
+                        <a:xfrm flipH="0" flipV="0">
                           <a:off x="0" y="0"/>
-                          <a:ext cx="5940424" cy="4397934"/>
+                          <a:ext cx="6348434" cy="3612538"/>
                         </a:xfrm>
                         <a:prstGeom prst="rect">
                           <a:avLst/>
@@ -4468,8 +4566,304 @@
                 <v:path o:extrusionok="f" gradientshapeok="t" o:connecttype="rect"/>
                 <o:lock v:ext="edit" aspectratio="t"/>
               </v:shapetype>
-              <v:shape id="_x0000_i3" o:spid="_x0000_s3" type="#_x0000_t75" style="width:467.75pt;height:346.29pt;mso-wrap-distance-left:0.00pt;mso-wrap-distance-top:0.00pt;mso-wrap-distance-right:0.00pt;mso-wrap-distance-bottom:0.00pt;z-index:1;" stroked="false">
+              <v:shape id="_x0000_i3" o:spid="_x0000_s3" type="#_x0000_t75" style="width:499.88pt;height:284.45pt;mso-wrap-distance-left:0.00pt;mso-wrap-distance-top:0.00pt;mso-wrap-distance-right:0.00pt;mso-wrap-distance-bottom:0.00pt;z-index:1;" stroked="false">
                 <v:imagedata r:id="rId14" o:title=""/>
+                <o:lock v:ext="edit" rotation="t"/>
+              </v:shape>
+            </w:pict>
+          </mc:Fallback>
+        </mc:AlternateContent>
+      </w:r>
+      <w:r>
+        <w:rPr>
+          <w:rStyle w:val="856"/>
+          <w:rFonts w:ascii="Times New Roman" w:hAnsi="Times New Roman" w:eastAsia="Times New Roman" w:cs="Times New Roman"/>
+        </w:rPr>
+        <w:t xml:space="preserve"> </w:t>
+      </w:r>
+      <w:r>
+        <w:rPr>
+          <w:rFonts w:ascii="Times New Roman" w:hAnsi="Times New Roman" w:eastAsia="Times New Roman" w:cs="Times New Roman"/>
+          <w:b/>
+          <w:bCs/>
+          <w:sz w:val="48"/>
+          <w:szCs w:val="48"/>
+          <w:highlight w:val="none"/>
+        </w:rPr>
+      </w:r>
+      <w:bookmarkEnd w:id="7"/>
+      <w:r/>
+      <w:r>
+        <w:rPr>
+          <w:rFonts w:ascii="Times New Roman" w:hAnsi="Times New Roman" w:eastAsia="Times New Roman" w:cs="Times New Roman"/>
+          <w:b/>
+          <w:bCs/>
+          <w:sz w:val="48"/>
+          <w:szCs w:val="48"/>
+          <w:highlight w:val="none"/>
+        </w:rPr>
+      </w:r>
+    </w:p>
+    <w:p>
+      <w:pPr>
+        <w:pStyle w:val="846"/>
+        <w:pBdr/>
+        <w:spacing/>
+        <w:ind/>
+        <w:rPr>
+          <w:rFonts w:ascii="Times New Roman" w:hAnsi="Times New Roman" w:eastAsia="Times New Roman" w:cs="Times New Roman"/>
+          <w:b/>
+          <w:bCs/>
+          <w:sz w:val="48"/>
+          <w:szCs w:val="48"/>
+          <w:highlight w:val="none"/>
+        </w:rPr>
+      </w:pPr>
+      <w:r/>
+      <w:bookmarkStart w:id="8" w:name="_Toc8"/>
+      <w:r>
+        <mc:AlternateContent>
+          <mc:Choice Requires="wpg">
+            <w:drawing>
+              <wp:anchor xmlns:wp="http://schemas.openxmlformats.org/drawingml/2006/wordprocessingDrawing" xmlns:wp14="http://schemas.microsoft.com/office/word/2010/wordprocessingDrawing" distT="0" distB="0" distL="115200" distR="115200" simplePos="0" relativeHeight="15360" behindDoc="0" locked="0" layoutInCell="1" allowOverlap="1">
+                <wp:simplePos x="0" y="0"/>
+                <wp:positionH relativeFrom="column">
+                  <wp:posOffset>-360045</wp:posOffset>
+                </wp:positionH>
+                <wp:positionV relativeFrom="paragraph">
+                  <wp:posOffset>530679</wp:posOffset>
+                </wp:positionV>
+                <wp:extent cx="3567150" cy="2675363"/>
+                <wp:effectExtent l="0" t="0" r="0" b="0"/>
+                <wp:wrapTight wrapText="bothSides">
+                  <wp:wrapPolygon edited="1">
+                    <wp:start x="0" y="0"/>
+                    <wp:lineTo x="21600" y="0"/>
+                    <wp:lineTo x="21600" y="21600"/>
+                    <wp:lineTo x="0" y="21600"/>
+                  </wp:wrapPolygon>
+                </wp:wrapTight>
+                <wp:docPr id="5" name=""/>
+                <wp:cNvGraphicFramePr>
+                  <a:graphicFrameLocks xmlns:a="http://schemas.openxmlformats.org/drawingml/2006/main" noChangeAspect="1"/>
+                </wp:cNvGraphicFramePr>
+                <a:graphic xmlns:a="http://schemas.openxmlformats.org/drawingml/2006/main">
+                  <a:graphicData uri="http://schemas.openxmlformats.org/drawingml/2006/picture">
+                    <pic:pic xmlns:pic="http://schemas.openxmlformats.org/drawingml/2006/picture">
+                      <pic:nvPicPr>
+                        <pic:cNvPr id="272410930" name=""/>
+                        <pic:cNvPicPr>
+                          <a:picLocks noChangeAspect="1"/>
+                        </pic:cNvPicPr>
+                        <pic:nvPr/>
+                      </pic:nvPicPr>
+                      <pic:blipFill rotWithShape="1">
+                        <a:blip r:embed="rId15"/>
+                        <a:stretch/>
+                      </pic:blipFill>
+                      <pic:spPr bwMode="auto">
+                        <a:xfrm flipH="0" flipV="0">
+                          <a:off x="0" y="0"/>
+                          <a:ext cx="3567150" cy="2675362"/>
+                        </a:xfrm>
+                        <a:prstGeom prst="rect">
+                          <a:avLst/>
+                        </a:prstGeom>
+                      </pic:spPr>
+                    </pic:pic>
+                  </a:graphicData>
+                </a:graphic>
+              </wp:anchor>
+            </w:drawing>
+          </mc:Choice>
+          <mc:Fallback>
+            <w:pict>
+              <v:shapetype id="_x0000_t75" coordsize="21600,21600" o:spt="75" o:preferrelative="t" path="m@4@5l@4@11@9@11@9@5xe" filled="f" stroked="f">
+                <v:stroke joinstyle="miter"/>
+                <v:formulas>
+                  <v:f eqn="if lineDrawn pixelLineWidth 0"/>
+                  <v:f eqn="sum @0 1 0"/>
+                  <v:f eqn="sum 0 0 @1"/>
+                  <v:f eqn="prod @2 1 2"/>
+                  <v:f eqn="prod @3 21600 pixelWidth"/>
+                  <v:f eqn="prod @3 21600 pixelHeight"/>
+                  <v:f eqn="sum @0 0 1"/>
+                  <v:f eqn="prod @6 1 2"/>
+                  <v:f eqn="prod @7 21600 pixelWidth"/>
+                  <v:f eqn="sum @8 21600 0"/>
+                  <v:f eqn="prod @7 21600 pixelHeight"/>
+                  <v:f eqn="sum @10 21600 0"/>
+                </v:formulas>
+                <v:path o:extrusionok="f" gradientshapeok="t" o:connecttype="rect"/>
+                <o:lock v:ext="edit" aspectratio="t"/>
+              </v:shapetype>
+              <v:shape id="_x0000_i4" o:spid="_x0000_s4" type="#_x0000_t75" style="position:absolute;z-index:15360;o:allowoverlap:true;o:allowincell:true;mso-position-horizontal-relative:text;margin-left:-28.35pt;mso-position-horizontal:absolute;mso-position-vertical-relative:text;margin-top:41.79pt;mso-position-vertical:absolute;width:280.88pt;height:210.66pt;mso-wrap-distance-left:9.07pt;mso-wrap-distance-top:0.00pt;mso-wrap-distance-right:9.07pt;mso-wrap-distance-bottom:0.00pt;z-index:1;" wrapcoords="0 0 100000 0 100000 100000 0 100000" stroked="false">
+                <w10:wrap type="tight"/>
+                <v:imagedata r:id="rId15" o:title=""/>
+                <o:lock v:ext="edit" rotation="t"/>
+              </v:shape>
+            </w:pict>
+          </mc:Fallback>
+        </mc:AlternateContent>
+      </w:r>
+      <w:r>
+        <w:rPr>
+          <w:rStyle w:val="856"/>
+          <w:rFonts w:ascii="Times New Roman" w:hAnsi="Times New Roman" w:eastAsia="Times New Roman" w:cs="Times New Roman"/>
+        </w:rPr>
+        <w:t xml:space="preserve">IHM</w:t>
+      </w:r>
+      <w:r>
+        <w:rPr>
+          <w:rFonts w:ascii="Times New Roman" w:hAnsi="Times New Roman" w:eastAsia="Times New Roman" w:cs="Times New Roman"/>
+          <w:b/>
+          <w:bCs/>
+          <w:sz w:val="48"/>
+          <w:szCs w:val="48"/>
+          <w:highlight w:val="none"/>
+        </w:rPr>
+        <w:br w:type="page" w:clear="all"/>
+      </w:r>
+      <w:r>
+        <w:rPr>
+          <w:rFonts w:ascii="Times New Roman" w:hAnsi="Times New Roman" w:eastAsia="Times New Roman" w:cs="Times New Roman"/>
+          <w:b/>
+          <w:bCs/>
+          <w:sz w:val="48"/>
+          <w:szCs w:val="48"/>
+          <w:highlight w:val="none"/>
+        </w:rPr>
+      </w:r>
+      <w:bookmarkEnd w:id="8"/>
+      <w:r/>
+      <w:r>
+        <w:rPr>
+          <w:rFonts w:ascii="Times New Roman" w:hAnsi="Times New Roman" w:eastAsia="Times New Roman" w:cs="Times New Roman"/>
+          <w:b/>
+          <w:bCs/>
+          <w:sz w:val="48"/>
+          <w:szCs w:val="48"/>
+          <w:highlight w:val="none"/>
+        </w:rPr>
+      </w:r>
+    </w:p>
+    <w:p>
+      <w:pPr>
+        <w:pStyle w:val="846"/>
+        <w:pBdr/>
+        <w:spacing/>
+        <w:ind/>
+        <w:rPr>
+          <w:highlight w:val="none"/>
+          <w14:ligatures w14:val="none"/>
+        </w:rPr>
+      </w:pPr>
+      <w:r/>
+      <w:bookmarkStart w:id="9" w:name="_Toc9"/>
+      <w:r/>
+      <w:r>
+        <w:rPr>
+          <w:highlight w:val="none"/>
+        </w:rPr>
+        <w:t xml:space="preserve">Contraintes diverses exprimées par le demandeur </w:t>
+      </w:r>
+      <w:r>
+        <w:rPr>
+          <w:highlight w:val="none"/>
+          <w14:ligatures w14:val="none"/>
+        </w:rPr>
+      </w:r>
+      <w:bookmarkEnd w:id="9"/>
+      <w:r/>
+      <w:r>
+        <w:rPr>
+          <w:highlight w:val="none"/>
+          <w14:ligatures w14:val="none"/>
+        </w:rPr>
+      </w:r>
+    </w:p>
+    <w:p>
+      <w:pPr>
+        <w:pBdr/>
+        <w:spacing/>
+        <w:ind/>
+        <w:rPr/>
+      </w:pPr>
+      <w:r/>
+      <w:r/>
+    </w:p>
+    <w:p>
+      <w:pPr>
+        <w:pBdr/>
+        <w:spacing/>
+        <w:ind/>
+        <w:rPr>
+          <w:highlight w:val="none"/>
+        </w:rPr>
+      </w:pPr>
+      <w:r>
+        <mc:AlternateContent>
+          <mc:Choice Requires="wpg">
+            <w:drawing>
+              <wp:inline xmlns:wp="http://schemas.openxmlformats.org/drawingml/2006/wordprocessingDrawing" distT="0" distB="0" distL="0" distR="0">
+                <wp:extent cx="6300810" cy="3428813"/>
+                <wp:effectExtent l="0" t="0" r="0" b="0"/>
+                <wp:docPr id="6" name=""/>
+                <wp:cNvGraphicFramePr>
+                  <a:graphicFrameLocks xmlns:a="http://schemas.openxmlformats.org/drawingml/2006/main" noChangeAspect="1"/>
+                </wp:cNvGraphicFramePr>
+                <a:graphic xmlns:a="http://schemas.openxmlformats.org/drawingml/2006/main">
+                  <a:graphicData uri="http://schemas.openxmlformats.org/drawingml/2006/picture">
+                    <pic:pic xmlns:pic="http://schemas.openxmlformats.org/drawingml/2006/picture">
+                      <pic:nvPicPr>
+                        <pic:cNvPr id="1292193101" name=""/>
+                        <pic:cNvPicPr>
+                          <a:picLocks noChangeAspect="1"/>
+                        </pic:cNvPicPr>
+                        <pic:nvPr/>
+                      </pic:nvPicPr>
+                      <pic:blipFill rotWithShape="1">
+                        <a:blip r:embed="rId16"/>
+                        <a:stretch/>
+                      </pic:blipFill>
+                      <pic:spPr bwMode="auto">
+                        <a:xfrm flipH="0" flipV="0">
+                          <a:off x="0" y="0"/>
+                          <a:ext cx="6300810" cy="3428812"/>
+                        </a:xfrm>
+                        <a:prstGeom prst="rect">
+                          <a:avLst/>
+                        </a:prstGeom>
+                      </pic:spPr>
+                    </pic:pic>
+                  </a:graphicData>
+                </a:graphic>
+              </wp:inline>
+            </w:drawing>
+          </mc:Choice>
+          <mc:Fallback>
+            <w:pict>
+              <v:shapetype id="_x0000_t75" coordsize="21600,21600" o:spt="75" o:preferrelative="t" path="m@4@5l@4@11@9@11@9@5xe" filled="f" stroked="f">
+                <v:stroke joinstyle="miter"/>
+                <v:formulas>
+                  <v:f eqn="if lineDrawn pixelLineWidth 0"/>
+                  <v:f eqn="sum @0 1 0"/>
+                  <v:f eqn="sum 0 0 @1"/>
+                  <v:f eqn="prod @2 1 2"/>
+                  <v:f eqn="prod @3 21600 pixelWidth"/>
+                  <v:f eqn="prod @3 21600 pixelHeight"/>
+                  <v:f eqn="sum @0 0 1"/>
+                  <v:f eqn="prod @6 1 2"/>
+                  <v:f eqn="prod @7 21600 pixelWidth"/>
+                  <v:f eqn="sum @8 21600 0"/>
+                  <v:f eqn="prod @7 21600 pixelHeight"/>
+                  <v:f eqn="sum @10 21600 0"/>
+                </v:formulas>
+                <v:path o:extrusionok="f" gradientshapeok="t" o:connecttype="rect"/>
+                <o:lock v:ext="edit" aspectratio="t"/>
+              </v:shapetype>
+              <v:shape id="_x0000_i5" o:spid="_x0000_s5" type="#_x0000_t75" style="width:496.13pt;height:269.99pt;mso-wrap-distance-left:0.00pt;mso-wrap-distance-top:0.00pt;mso-wrap-distance-right:0.00pt;mso-wrap-distance-bottom:0.00pt;z-index:1;" stroked="false">
+                <v:imagedata r:id="rId16" o:title=""/>
                 <o:lock v:ext="edit" rotation="t"/>
               </v:shape>
             </w:pict>
@@ -4481,8 +4875,254 @@
           <w:highlight w:val="none"/>
         </w:rPr>
       </w:r>
+      <w:r>
+        <w:rPr>
+          <w:highlight w:val="none"/>
+        </w:rPr>
+      </w:r>
+    </w:p>
+    <w:p>
+      <w:pPr>
+        <w:pBdr/>
+        <w:spacing/>
+        <w:ind/>
+        <w:rPr/>
+      </w:pPr>
       <w:r/>
       <w:r/>
+    </w:p>
+    <w:p>
+      <w:pPr>
+        <w:pBdr/>
+        <w:spacing/>
+        <w:ind/>
+        <w:rPr>
+          <w:highlight w:val="none"/>
+        </w:rPr>
+      </w:pPr>
+      <w:r>
+        <w:rPr>
+          <w:highlight w:val="none"/>
+        </w:rPr>
+        <w:t xml:space="preserve">Le demandeur a notifier une demande sur les taux de CO2. La demande étant de savoir si elle pouvait prévenir </w:t>
+      </w:r>
+      <w:r>
+        <w:rPr>
+          <w:highlight w:val="none"/>
+        </w:rPr>
+        <w:t xml:space="preserve">d’un éventuel incendie dans le cas au les taux étaient suspect. </w:t>
+        <w:br/>
+        <w:t xml:space="preserve">Il est en e</w:t>
+      </w:r>
+      <w:r>
+        <w:rPr>
+          <w:highlight w:val="none"/>
+        </w:rPr>
+        <w:t xml:space="preserve">ffet possible de détourner l’utilisation du capteur de TVOC/CO2, pour détecter un éventuel départ de feu dans la menuiserie. Le demander étant très exposer à ce risque en vu de la quantité de matières inflammable dans sa menuiserie(colle, solvant et bois).</w:t>
+      </w:r>
+      <w:r>
+        <w:rPr>
+          <w:highlight w:val="none"/>
+        </w:rPr>
+      </w:r>
+      <w:r/>
+    </w:p>
+    <w:p>
+      <w:pPr>
+        <w:pBdr/>
+        <w:shd w:val="nil"/>
+        <w:spacing/>
+        <w:ind/>
+        <w:rPr/>
+      </w:pPr>
+      <w:r>
+        <w:br w:type="page" w:clear="all"/>
+      </w:r>
+      <w:r/>
+      <w:r/>
+    </w:p>
+    <w:p>
+      <w:pPr>
+        <w:pStyle w:val="845"/>
+        <w:pBdr/>
+        <w:spacing/>
+        <w:ind/>
+        <w:rPr>
+          <w:rFonts w:ascii="Times New Roman" w:hAnsi="Times New Roman" w:eastAsia="Times New Roman" w:cs="Times New Roman"/>
+          <w:b/>
+          <w:bCs/>
+          <w:sz w:val="48"/>
+          <w:szCs w:val="48"/>
+          <w:highlight w:val="none"/>
+        </w:rPr>
+      </w:pPr>
+      <w:r/>
+      <w:bookmarkStart w:id="10" w:name="_Toc10"/>
+      <w:r>
+        <w:rPr>
+          <w:rFonts w:ascii="Times New Roman" w:hAnsi="Times New Roman" w:eastAsia="Times New Roman" w:cs="Times New Roman"/>
+          <w:b/>
+          <w:bCs/>
+          <w:sz w:val="48"/>
+          <w:szCs w:val="48"/>
+          <w:highlight w:val="none"/>
+        </w:rPr>
+        <w:t xml:space="preserve">Étude préliminaire</w:t>
+      </w:r>
+      <w:r>
+        <w:rPr>
+          <w:rFonts w:ascii="Times New Roman" w:hAnsi="Times New Roman" w:eastAsia="Times New Roman" w:cs="Times New Roman"/>
+          <w:b/>
+          <w:bCs/>
+          <w:sz w:val="48"/>
+          <w:szCs w:val="48"/>
+          <w:highlight w:val="none"/>
+        </w:rPr>
+      </w:r>
+      <w:bookmarkEnd w:id="10"/>
+      <w:r/>
+      <w:r>
+        <w:rPr>
+          <w:rFonts w:ascii="Times New Roman" w:hAnsi="Times New Roman" w:eastAsia="Times New Roman" w:cs="Times New Roman"/>
+          <w:b/>
+          <w:bCs/>
+          <w:sz w:val="48"/>
+          <w:szCs w:val="48"/>
+          <w:highlight w:val="none"/>
+        </w:rPr>
+      </w:r>
+    </w:p>
+    <w:p>
+      <w:pPr>
+        <w:pBdr/>
+        <w:spacing/>
+        <w:ind/>
+        <w:rPr/>
+      </w:pPr>
+      <w:r/>
+      <w:r/>
+      <w:r/>
+    </w:p>
+    <w:p>
+      <w:pPr>
+        <w:pStyle w:val="846"/>
+        <w:pBdr/>
+        <w:spacing/>
+        <w:ind/>
+        <w:rPr>
+          <w14:ligatures w14:val="none"/>
+        </w:rPr>
+      </w:pPr>
+      <w:r/>
+      <w:bookmarkStart w:id="11" w:name="_Toc11"/>
+      <w:r>
+        <w:rPr>
+          <w:highlight w:val="none"/>
+        </w:rPr>
+        <w:t xml:space="preserve">Diagramme de déploiement d’exploitation</w:t>
+      </w:r>
+      <w:r>
+        <w:rPr>
+          <w14:ligatures w14:val="none"/>
+        </w:rPr>
+      </w:r>
+      <w:bookmarkEnd w:id="11"/>
+      <w:r/>
+      <w:r>
+        <w:rPr>
+          <w14:ligatures w14:val="none"/>
+        </w:rPr>
+      </w:r>
+    </w:p>
+    <w:p>
+      <w:pPr>
+        <w:pBdr/>
+        <w:spacing/>
+        <w:ind/>
+        <w:rPr>
+          <w:rFonts w:ascii="Times New Roman" w:hAnsi="Times New Roman" w:eastAsia="Times New Roman" w:cs="Times New Roman"/>
+          <w:b/>
+          <w:bCs/>
+          <w:color w:val="000000"/>
+          <w:sz w:val="24"/>
+          <w:szCs w:val="24"/>
+          <w14:ligatures w14:val="none"/>
+        </w:rPr>
+      </w:pPr>
+      <w:r>
+        <w:rPr>
+          <w:highlight w:val="none"/>
+        </w:rPr>
+      </w:r>
+      <w:r>
+        <mc:AlternateContent>
+          <mc:Choice Requires="wpg">
+            <w:drawing>
+              <wp:inline xmlns:wp="http://schemas.openxmlformats.org/drawingml/2006/wordprocessingDrawing" distT="0" distB="0" distL="0" distR="0">
+                <wp:extent cx="5940425" cy="4397934"/>
+                <wp:effectExtent l="0" t="0" r="0" b="0"/>
+                <wp:docPr id="7" name=""/>
+                <wp:cNvGraphicFramePr>
+                  <a:graphicFrameLocks xmlns:a="http://schemas.openxmlformats.org/drawingml/2006/main" noChangeAspect="1"/>
+                </wp:cNvGraphicFramePr>
+                <a:graphic xmlns:a="http://schemas.openxmlformats.org/drawingml/2006/main">
+                  <a:graphicData uri="http://schemas.openxmlformats.org/drawingml/2006/picture">
+                    <pic:pic xmlns:pic="http://schemas.openxmlformats.org/drawingml/2006/picture">
+                      <pic:nvPicPr>
+                        <pic:cNvPr id="698565566" name=""/>
+                        <pic:cNvPicPr>
+                          <a:picLocks noChangeAspect="1"/>
+                        </pic:cNvPicPr>
+                        <pic:nvPr/>
+                      </pic:nvPicPr>
+                      <pic:blipFill rotWithShape="1">
+                        <a:blip r:embed="rId17"/>
+                        <a:stretch/>
+                      </pic:blipFill>
+                      <pic:spPr bwMode="auto">
+                        <a:xfrm>
+                          <a:off x="0" y="0"/>
+                          <a:ext cx="5940423" cy="4397933"/>
+                        </a:xfrm>
+                        <a:prstGeom prst="rect">
+                          <a:avLst/>
+                        </a:prstGeom>
+                      </pic:spPr>
+                    </pic:pic>
+                  </a:graphicData>
+                </a:graphic>
+              </wp:inline>
+            </w:drawing>
+          </mc:Choice>
+          <mc:Fallback>
+            <w:pict>
+              <v:shapetype id="_x0000_t75" coordsize="21600,21600" o:spt="75" o:preferrelative="t" path="m@4@5l@4@11@9@11@9@5xe" filled="f" stroked="f">
+                <v:stroke joinstyle="miter"/>
+                <v:formulas>
+                  <v:f eqn="if lineDrawn pixelLineWidth 0"/>
+                  <v:f eqn="sum @0 1 0"/>
+                  <v:f eqn="sum 0 0 @1"/>
+                  <v:f eqn="prod @2 1 2"/>
+                  <v:f eqn="prod @3 21600 pixelWidth"/>
+                  <v:f eqn="prod @3 21600 pixelHeight"/>
+                  <v:f eqn="sum @0 0 1"/>
+                  <v:f eqn="prod @6 1 2"/>
+                  <v:f eqn="prod @7 21600 pixelWidth"/>
+                  <v:f eqn="sum @8 21600 0"/>
+                  <v:f eqn="prod @7 21600 pixelHeight"/>
+                  <v:f eqn="sum @10 21600 0"/>
+                </v:formulas>
+                <v:path o:extrusionok="f" gradientshapeok="t" o:connecttype="rect"/>
+                <o:lock v:ext="edit" aspectratio="t"/>
+              </v:shapetype>
+              <v:shape id="_x0000_i6" o:spid="_x0000_s6" type="#_x0000_t75" style="width:467.75pt;height:346.29pt;mso-wrap-distance-left:0.00pt;mso-wrap-distance-top:0.00pt;mso-wrap-distance-right:0.00pt;mso-wrap-distance-bottom:0.00pt;z-index:1;" stroked="false">
+                <v:imagedata r:id="rId17" o:title=""/>
+                <o:lock v:ext="edit" rotation="t"/>
+              </v:shape>
+            </w:pict>
+          </mc:Fallback>
+        </mc:AlternateContent>
+      </w:r>
       <w:r>
         <w:rPr>
           <w:rFonts w:ascii="Times New Roman" w:hAnsi="Times New Roman" w:eastAsia="Times New Roman" w:cs="Times New Roman"/>
@@ -4494,7 +5134,24 @@
       </w:r>
       <w:r>
         <w:rPr>
-          <w:highlight w:val="none"/>
+          <w:rFonts w:ascii="Times New Roman" w:hAnsi="Times New Roman" w:eastAsia="Times New Roman" w:cs="Times New Roman"/>
+          <w:b/>
+          <w:bCs/>
+          <w:color w:val="000000"/>
+          <w:sz w:val="24"/>
+          <w:szCs w:val="24"/>
+          <w14:ligatures w14:val="none"/>
+        </w:rPr>
+      </w:r>
+      <w:r>
+        <w:rPr>
+          <w:rFonts w:ascii="Times New Roman" w:hAnsi="Times New Roman" w:eastAsia="Times New Roman" w:cs="Times New Roman"/>
+          <w:b/>
+          <w:bCs/>
+          <w:color w:val="000000"/>
+          <w:sz w:val="24"/>
+          <w:szCs w:val="24"/>
+          <w14:ligatures w14:val="none"/>
         </w:rPr>
       </w:r>
     </w:p>
@@ -4529,7 +5186,20 @@
       </w:r>
       <w:r>
         <w:rPr>
-          <w:highlight w:val="none"/>
+          <w:rFonts w:ascii="Times New Roman" w:hAnsi="Times New Roman" w:eastAsia="Times New Roman" w:cs="Times New Roman"/>
+          <w:color w:val="000000"/>
+          <w:sz w:val="24"/>
+          <w:szCs w:val="24"/>
+          <w14:ligatures w14:val="none"/>
+        </w:rPr>
+      </w:r>
+      <w:r>
+        <w:rPr>
+          <w:rFonts w:ascii="Times New Roman" w:hAnsi="Times New Roman" w:eastAsia="Times New Roman" w:cs="Times New Roman"/>
+          <w:color w:val="000000"/>
+          <w:sz w:val="24"/>
+          <w:szCs w:val="24"/>
+          <w14:ligatures w14:val="none"/>
         </w:rPr>
       </w:r>
     </w:p>
@@ -4566,7 +5236,24 @@
       </w:r>
       <w:r>
         <w:rPr>
-          <w:highlight w:val="none"/>
+          <w:rFonts w:ascii="Times New Roman" w:hAnsi="Times New Roman" w:eastAsia="Times New Roman" w:cs="Times New Roman"/>
+          <w:b/>
+          <w:bCs/>
+          <w:color w:val="000000"/>
+          <w:sz w:val="24"/>
+          <w:szCs w:val="24"/>
+          <w14:ligatures w14:val="none"/>
+        </w:rPr>
+      </w:r>
+      <w:r>
+        <w:rPr>
+          <w:rFonts w:ascii="Times New Roman" w:hAnsi="Times New Roman" w:eastAsia="Times New Roman" w:cs="Times New Roman"/>
+          <w:b/>
+          <w:bCs/>
+          <w:color w:val="000000"/>
+          <w:sz w:val="24"/>
+          <w:szCs w:val="24"/>
+          <w14:ligatures w14:val="none"/>
         </w:rPr>
       </w:r>
     </w:p>
@@ -4680,13 +5367,22 @@
         </w:rPr>
         <w:t xml:space="preserve">.</w:t>
       </w:r>
-      <w:r/>
       <w:r>
         <w:rPr>
           <w:rFonts w:ascii="Times New Roman" w:hAnsi="Times New Roman" w:eastAsia="Times New Roman" w:cs="Times New Roman"/>
           <w:color w:val="000000"/>
           <w:sz w:val="24"/>
           <w:szCs w:val="24"/>
+          <w14:ligatures w14:val="none"/>
+        </w:rPr>
+      </w:r>
+      <w:r>
+        <w:rPr>
+          <w:rFonts w:ascii="Times New Roman" w:hAnsi="Times New Roman" w:eastAsia="Times New Roman" w:cs="Times New Roman"/>
+          <w:color w:val="000000"/>
+          <w:sz w:val="24"/>
+          <w:szCs w:val="24"/>
+          <w14:ligatures w14:val="none"/>
         </w:rPr>
       </w:r>
     </w:p>
@@ -4723,7 +5419,24 @@
       </w:r>
       <w:r>
         <w:rPr>
-          <w:highlight w:val="none"/>
+          <w:rFonts w:ascii="Times New Roman" w:hAnsi="Times New Roman" w:eastAsia="Times New Roman" w:cs="Times New Roman"/>
+          <w:b/>
+          <w:bCs/>
+          <w:color w:val="000000"/>
+          <w:sz w:val="24"/>
+          <w:szCs w:val="24"/>
+          <w14:ligatures w14:val="none"/>
+        </w:rPr>
+      </w:r>
+      <w:r>
+        <w:rPr>
+          <w:rFonts w:ascii="Times New Roman" w:hAnsi="Times New Roman" w:eastAsia="Times New Roman" w:cs="Times New Roman"/>
+          <w:b/>
+          <w:bCs/>
+          <w:color w:val="000000"/>
+          <w:sz w:val="24"/>
+          <w:szCs w:val="24"/>
+          <w14:ligatures w14:val="none"/>
         </w:rPr>
       </w:r>
     </w:p>
@@ -4879,7 +5592,20 @@
       </w:r>
       <w:r>
         <w:rPr>
-          <w:highlight w:val="none"/>
+          <w:rFonts w:ascii="Times New Roman" w:hAnsi="Times New Roman" w:eastAsia="Times New Roman" w:cs="Times New Roman"/>
+          <w:color w:val="000000"/>
+          <w:sz w:val="24"/>
+          <w:szCs w:val="24"/>
+          <w14:ligatures w14:val="none"/>
+        </w:rPr>
+      </w:r>
+      <w:r>
+        <w:rPr>
+          <w:rFonts w:ascii="Times New Roman" w:hAnsi="Times New Roman" w:eastAsia="Times New Roman" w:cs="Times New Roman"/>
+          <w:color w:val="000000"/>
+          <w:sz w:val="24"/>
+          <w:szCs w:val="24"/>
+          <w14:ligatures w14:val="none"/>
         </w:rPr>
       </w:r>
     </w:p>
@@ -4916,7 +5642,24 @@
       </w:r>
       <w:r>
         <w:rPr>
-          <w:highlight w:val="none"/>
+          <w:rFonts w:ascii="Times New Roman" w:hAnsi="Times New Roman" w:eastAsia="Times New Roman" w:cs="Times New Roman"/>
+          <w:b/>
+          <w:bCs/>
+          <w:color w:val="000000"/>
+          <w:sz w:val="24"/>
+          <w:szCs w:val="24"/>
+          <w14:ligatures w14:val="none"/>
+        </w:rPr>
+      </w:r>
+      <w:r>
+        <w:rPr>
+          <w:rFonts w:ascii="Times New Roman" w:hAnsi="Times New Roman" w:eastAsia="Times New Roman" w:cs="Times New Roman"/>
+          <w:b/>
+          <w:bCs/>
+          <w:color w:val="000000"/>
+          <w:sz w:val="24"/>
+          <w:szCs w:val="24"/>
+          <w14:ligatures w14:val="none"/>
         </w:rPr>
       </w:r>
     </w:p>
@@ -4979,7 +5722,20 @@
       </w:r>
       <w:r>
         <w:rPr>
-          <w:highlight w:val="none"/>
+          <w:rFonts w:ascii="Times New Roman" w:hAnsi="Times New Roman" w:eastAsia="Times New Roman" w:cs="Times New Roman"/>
+          <w:color w:val="000000"/>
+          <w:sz w:val="24"/>
+          <w:szCs w:val="24"/>
+          <w14:ligatures w14:val="none"/>
+        </w:rPr>
+      </w:r>
+      <w:r>
+        <w:rPr>
+          <w:rFonts w:ascii="Times New Roman" w:hAnsi="Times New Roman" w:eastAsia="Times New Roman" w:cs="Times New Roman"/>
+          <w:color w:val="000000"/>
+          <w:sz w:val="24"/>
+          <w:szCs w:val="24"/>
+          <w14:ligatures w14:val="none"/>
         </w:rPr>
       </w:r>
     </w:p>
@@ -5016,7 +5772,24 @@
       </w:r>
       <w:r>
         <w:rPr>
-          <w:highlight w:val="none"/>
+          <w:rFonts w:ascii="Times New Roman" w:hAnsi="Times New Roman" w:eastAsia="Times New Roman" w:cs="Times New Roman"/>
+          <w:b/>
+          <w:bCs/>
+          <w:color w:val="000000"/>
+          <w:sz w:val="24"/>
+          <w:szCs w:val="24"/>
+          <w14:ligatures w14:val="none"/>
+        </w:rPr>
+      </w:r>
+      <w:r>
+        <w:rPr>
+          <w:rFonts w:ascii="Times New Roman" w:hAnsi="Times New Roman" w:eastAsia="Times New Roman" w:cs="Times New Roman"/>
+          <w:b/>
+          <w:bCs/>
+          <w:color w:val="000000"/>
+          <w:sz w:val="24"/>
+          <w:szCs w:val="24"/>
+          <w14:ligatures w14:val="none"/>
         </w:rPr>
       </w:r>
     </w:p>
@@ -5057,8 +5830,29 @@
       <w:r>
         <w:rPr>
           <w:highlight w:val="none"/>
+          <w14:ligatures w14:val="none"/>
         </w:rPr>
       </w:r>
+      <w:r>
+        <w:rPr>
+          <w:highlight w:val="none"/>
+          <w14:ligatures w14:val="none"/>
+        </w:rPr>
+      </w:r>
+    </w:p>
+    <w:p>
+      <w:pPr>
+        <w:pBdr/>
+        <w:spacing/>
+        <w:ind/>
+        <w:rPr/>
+      </w:pPr>
+      <w:r>
+        <w:rPr>
+          <w:highlight w:val="none"/>
+        </w:rPr>
+      </w:r>
+      <w:r/>
       <w:r/>
     </w:p>
     <w:p>

</xml_diff>

<commit_message>
Modification de la partie commune
</commit_message>
<xml_diff>
--- a/marais_r_sense_dossier_technique_partie_commune.docx
+++ b/marais_r_sense_dossier_technique_partie_commune.docx
@@ -469,7 +469,7 @@
                         </pic:cNvPicPr>
                         <pic:nvPr/>
                       </pic:nvPicPr>
-                      <pic:blipFill rotWithShape="1">
+                      <pic:blipFill>
                         <a:blip r:embed="rId11"/>
                         <a:stretch/>
                       </pic:blipFill>
@@ -624,7 +624,16 @@
         </w:rPr>
       </w:r>
       <w:bookmarkEnd w:id="1"/>
-      <w:r/>
+      <w:r>
+        <w:rPr>
+          <w:rFonts w:ascii="Times New Roman" w:hAnsi="Times New Roman" w:eastAsia="Times New Roman" w:cs="Times New Roman"/>
+          <w:b/>
+          <w:bCs/>
+          <w:sz w:val="48"/>
+          <w:szCs w:val="48"/>
+          <w:highlight w:val="none"/>
+        </w:rPr>
+      </w:r>
       <w:r>
         <w:rPr>
           <w:rFonts w:ascii="Times New Roman" w:hAnsi="Times New Roman" w:eastAsia="Times New Roman" w:cs="Times New Roman"/>
@@ -737,6 +746,12 @@
               <w:highlight w:val="none"/>
             </w:rPr>
           </w:r>
+          <w:r>
+            <w:rPr>
+              <w:rFonts w:ascii="Times New Roman" w:hAnsi="Times New Roman" w:eastAsia="Times New Roman" w:cs="Times New Roman"/>
+              <w:highlight w:val="none"/>
+            </w:rPr>
+          </w:r>
         </w:p>
         <w:p>
           <w:pPr>
@@ -752,6 +767,7 @@
               <w14:ligatures w14:val="none"/>
             </w:rPr>
           </w:pPr>
+          <w:r/>
           <w:hyperlink w:tooltip="#_Toc2" w:anchor="_Toc2" w:history="1">
             <w:r>
               <w:rPr>
@@ -808,6 +824,12 @@
               <w14:ligatures w14:val="none"/>
             </w:rPr>
           </w:r>
+          <w:r>
+            <w:rPr>
+              <w:highlight w:val="none"/>
+              <w14:ligatures w14:val="none"/>
+            </w:rPr>
+          </w:r>
         </w:p>
         <w:p>
           <w:pPr>
@@ -823,6 +845,7 @@
               <w:highlight w:val="none"/>
             </w:rPr>
           </w:pPr>
+          <w:r/>
           <w:hyperlink w:tooltip="#_Toc3" w:anchor="_Toc3" w:history="1">
             <w:r>
               <w:rPr>
@@ -859,6 +882,12 @@
               <w:highlight w:val="none"/>
             </w:rPr>
           </w:r>
+          <w:r>
+            <w:rPr>
+              <w:rFonts w:ascii="Times New Roman" w:hAnsi="Times New Roman" w:eastAsia="Times New Roman" w:cs="Times New Roman"/>
+              <w:highlight w:val="none"/>
+            </w:rPr>
+          </w:r>
         </w:p>
         <w:p>
           <w:pPr>
@@ -871,6 +900,7 @@
             <w:ind/>
             <w:rPr/>
           </w:pPr>
+          <w:r/>
           <w:hyperlink w:tooltip="#_Toc4" w:anchor="_Toc4" w:history="1">
             <w:r>
               <w:rPr>
@@ -910,6 +940,7 @@
             </w:r>
           </w:hyperlink>
           <w:r/>
+          <w:r/>
         </w:p>
         <w:p>
           <w:pPr>
@@ -922,6 +953,7 @@
             <w:ind/>
             <w:rPr/>
           </w:pPr>
+          <w:r/>
           <w:hyperlink w:tooltip="#_Toc5" w:anchor="_Toc5" w:history="1">
             <w:r>
               <w:rPr>
@@ -951,6 +983,7 @@
             </w:r>
           </w:hyperlink>
           <w:r/>
+          <w:r/>
         </w:p>
         <w:p>
           <w:pPr>
@@ -963,6 +996,7 @@
             <w:ind/>
             <w:rPr/>
           </w:pPr>
+          <w:r/>
           <w:hyperlink w:tooltip="#_Toc6" w:anchor="_Toc6" w:history="1">
             <w:r>
               <w:rPr>
@@ -992,6 +1026,7 @@
             </w:r>
           </w:hyperlink>
           <w:r/>
+          <w:r/>
         </w:p>
         <w:p>
           <w:pPr>
@@ -1007,6 +1042,7 @@
               <w:highlight w:val="none"/>
             </w:rPr>
           </w:pPr>
+          <w:r/>
           <w:hyperlink w:tooltip="#_Toc7" w:anchor="_Toc7" w:history="1">
             <w:r>
               <w:rPr>
@@ -1049,6 +1085,12 @@
               <w:highlight w:val="none"/>
             </w:rPr>
           </w:r>
+          <w:r>
+            <w:rPr>
+              <w:rFonts w:ascii="Times New Roman" w:hAnsi="Times New Roman" w:eastAsia="Times New Roman" w:cs="Times New Roman"/>
+              <w:highlight w:val="none"/>
+            </w:rPr>
+          </w:r>
         </w:p>
         <w:p>
           <w:pPr>
@@ -1064,6 +1106,7 @@
               <w:highlight w:val="none"/>
             </w:rPr>
           </w:pPr>
+          <w:r/>
           <w:hyperlink w:tooltip="#_Toc8" w:anchor="_Toc8" w:history="1">
             <w:r>
               <w:rPr>
@@ -1109,6 +1152,12 @@
               <w:highlight w:val="none"/>
             </w:rPr>
           </w:r>
+          <w:r>
+            <w:rPr>
+              <w:rFonts w:ascii="Times New Roman" w:hAnsi="Times New Roman" w:eastAsia="Times New Roman" w:cs="Times New Roman"/>
+              <w:highlight w:val="none"/>
+            </w:rPr>
+          </w:r>
         </w:p>
         <w:p>
           <w:pPr>
@@ -1124,6 +1173,7 @@
               <w14:ligatures w14:val="none"/>
             </w:rPr>
           </w:pPr>
+          <w:r/>
           <w:hyperlink w:tooltip="#_Toc9" w:anchor="_Toc9" w:history="1">
             <w:r>
               <w:rPr>
@@ -1161,6 +1211,12 @@
               <w14:ligatures w14:val="none"/>
             </w:rPr>
           </w:r>
+          <w:r>
+            <w:rPr>
+              <w:highlight w:val="none"/>
+              <w14:ligatures w14:val="none"/>
+            </w:rPr>
+          </w:r>
         </w:p>
         <w:p>
           <w:pPr>
@@ -1176,6 +1232,7 @@
               <w:highlight w:val="none"/>
             </w:rPr>
           </w:pPr>
+          <w:r/>
           <w:hyperlink w:tooltip="#_Toc10" w:anchor="_Toc10" w:history="1">
             <w:r>
               <w:rPr>
@@ -1214,6 +1271,12 @@
               <w:highlight w:val="none"/>
             </w:rPr>
           </w:r>
+          <w:r>
+            <w:rPr>
+              <w:rFonts w:ascii="Times New Roman" w:hAnsi="Times New Roman" w:eastAsia="Times New Roman" w:cs="Times New Roman"/>
+              <w:highlight w:val="none"/>
+            </w:rPr>
+          </w:r>
         </w:p>
         <w:p>
           <w:pPr>
@@ -1228,6 +1291,7 @@
               <w14:ligatures w14:val="none"/>
             </w:rPr>
           </w:pPr>
+          <w:r/>
           <w:hyperlink w:tooltip="#_Toc11" w:anchor="_Toc11" w:history="1">
             <w:r>
               <w:rPr>
@@ -1263,6 +1327,11 @@
               <w14:ligatures w14:val="none"/>
             </w:rPr>
           </w:r>
+          <w:r>
+            <w:rPr>
+              <w14:ligatures w14:val="none"/>
+            </w:rPr>
+          </w:r>
         </w:p>
         <w:p>
           <w:pPr>
@@ -1278,7 +1347,6 @@
               <w:highlight w:val="none"/>
             </w:rPr>
           </w:pPr>
-          <w:r/>
           <w:r>
             <w:fldChar w:fldCharType="end"/>
           </w:r>
@@ -1292,7 +1360,16 @@
               <w:highlight w:val="none"/>
             </w:rPr>
           </w:r>
-          <w:r/>
+          <w:r>
+            <w:rPr>
+              <w:rFonts w:ascii="Times New Roman" w:hAnsi="Times New Roman" w:eastAsia="Times New Roman" w:cs="Times New Roman"/>
+              <w:b/>
+              <w:bCs/>
+              <w:sz w:val="48"/>
+              <w:szCs w:val="48"/>
+              <w:highlight w:val="none"/>
+            </w:rPr>
+          </w:r>
         </w:p>
       </w:sdtContent>
     </w:sdt>
@@ -1381,7 +1458,12 @@
         </w:rPr>
       </w:r>
       <w:bookmarkEnd w:id="2"/>
-      <w:r/>
+      <w:r>
+        <w:rPr>
+          <w:highlight w:val="none"/>
+          <w14:ligatures w14:val="none"/>
+        </w:rPr>
+      </w:r>
       <w:r>
         <w:rPr>
           <w:highlight w:val="none"/>
@@ -1451,7 +1533,7 @@
                         </pic:cNvPicPr>
                         <pic:nvPr/>
                       </pic:nvPicPr>
-                      <pic:blipFill rotWithShape="1">
+                      <pic:blipFill>
                         <a:blip r:embed="rId12"/>
                         <a:srcRect l="17197" t="0" r="16622" b="0"/>
                         <a:stretch/>
@@ -1554,7 +1636,16 @@
         </w:rPr>
       </w:r>
       <w:bookmarkEnd w:id="3"/>
-      <w:r/>
+      <w:r>
+        <w:rPr>
+          <w:rFonts w:ascii="Times New Roman" w:hAnsi="Times New Roman" w:eastAsia="Times New Roman" w:cs="Times New Roman"/>
+          <w:b/>
+          <w:bCs/>
+          <w:sz w:val="48"/>
+          <w:szCs w:val="48"/>
+          <w:highlight w:val="none"/>
+        </w:rPr>
+      </w:r>
       <w:r>
         <w:rPr>
           <w:rFonts w:ascii="Times New Roman" w:hAnsi="Times New Roman" w:eastAsia="Times New Roman" w:cs="Times New Roman"/>
@@ -1638,7 +1729,12 @@
         </w:rPr>
       </w:r>
       <w:bookmarkEnd w:id="4"/>
-      <w:r/>
+      <w:r>
+        <w:rPr>
+          <w:sz w:val="36"/>
+          <w:szCs w:val="36"/>
+        </w:rPr>
+      </w:r>
       <w:r>
         <w:rPr>
           <w:sz w:val="36"/>
@@ -1682,7 +1778,7 @@
                         </pic:cNvPicPr>
                         <pic:nvPr/>
                       </pic:nvPicPr>
-                      <pic:blipFill rotWithShape="1">
+                      <pic:blipFill>
                         <a:blip r:embed="rId13"/>
                         <a:stretch/>
                       </pic:blipFill>
@@ -1746,7 +1842,6 @@
       <w:r>
         <w:t xml:space="preserve">Tableau description diagramme d’utilisation : </w:t>
       </w:r>
-      <w:r/>
       <w:bookmarkEnd w:id="5"/>
       <w:r/>
       <w:r/>
@@ -4483,10 +4578,13 @@
       <w:r>
         <w:t xml:space="preserve">Scénarios associés</w:t>
       </w:r>
-      <w:r/>
       <w:bookmarkEnd w:id="6"/>
       <w:r/>
-      <w:r/>
+      <w:r>
+        <w:rPr>
+          <w14:ligatures w14:val="none"/>
+        </w:rPr>
+      </w:r>
     </w:p>
     <w:p>
       <w:pPr>
@@ -4526,7 +4624,7 @@
                         </pic:cNvPicPr>
                         <pic:nvPr/>
                       </pic:nvPicPr>
-                      <pic:blipFill rotWithShape="1">
+                      <pic:blipFill>
                         <a:blip r:embed="rId14"/>
                         <a:stretch/>
                       </pic:blipFill>
@@ -4592,7 +4690,16 @@
         </w:rPr>
       </w:r>
       <w:bookmarkEnd w:id="7"/>
-      <w:r/>
+      <w:r>
+        <w:rPr>
+          <w:rFonts w:ascii="Times New Roman" w:hAnsi="Times New Roman" w:eastAsia="Times New Roman" w:cs="Times New Roman"/>
+          <w:b/>
+          <w:bCs/>
+          <w:sz w:val="48"/>
+          <w:szCs w:val="48"/>
+          <w:highlight w:val="none"/>
+        </w:rPr>
+      </w:r>
       <w:r>
         <w:rPr>
           <w:rFonts w:ascii="Times New Roman" w:hAnsi="Times New Roman" w:eastAsia="Times New Roman" w:cs="Times New Roman"/>
@@ -4657,7 +4764,7 @@
                         </pic:cNvPicPr>
                         <pic:nvPr/>
                       </pic:nvPicPr>
-                      <pic:blipFill rotWithShape="1">
+                      <pic:blipFill>
                         <a:blip r:embed="rId15"/>
                         <a:stretch/>
                       </pic:blipFill>
@@ -4735,7 +4842,16 @@
         </w:rPr>
       </w:r>
       <w:bookmarkEnd w:id="8"/>
-      <w:r/>
+      <w:r>
+        <w:rPr>
+          <w:rFonts w:ascii="Times New Roman" w:hAnsi="Times New Roman" w:eastAsia="Times New Roman" w:cs="Times New Roman"/>
+          <w:b/>
+          <w:bCs/>
+          <w:sz w:val="48"/>
+          <w:szCs w:val="48"/>
+          <w:highlight w:val="none"/>
+        </w:rPr>
+      </w:r>
       <w:r>
         <w:rPr>
           <w:rFonts w:ascii="Times New Roman" w:hAnsi="Times New Roman" w:eastAsia="Times New Roman" w:cs="Times New Roman"/>
@@ -4760,7 +4876,6 @@
       </w:pPr>
       <w:r/>
       <w:bookmarkStart w:id="9" w:name="_Toc9"/>
-      <w:r/>
       <w:r>
         <w:rPr>
           <w:highlight w:val="none"/>
@@ -4774,7 +4889,12 @@
         </w:rPr>
       </w:r>
       <w:bookmarkEnd w:id="9"/>
-      <w:r/>
+      <w:r>
+        <w:rPr>
+          <w:highlight w:val="none"/>
+          <w14:ligatures w14:val="none"/>
+        </w:rPr>
+      </w:r>
       <w:r>
         <w:rPr>
           <w:highlight w:val="none"/>
@@ -4822,7 +4942,7 @@
                         </pic:cNvPicPr>
                         <pic:nvPr/>
                       </pic:nvPicPr>
-                      <pic:blipFill rotWithShape="1">
+                      <pic:blipFill>
                         <a:blip r:embed="rId16"/>
                         <a:stretch/>
                       </pic:blipFill>
@@ -4925,12 +5045,16 @@
           <w:highlight w:val="none"/>
         </w:rPr>
       </w:r>
-      <w:r/>
+      <w:r>
+        <w:rPr>
+          <w:highlight w:val="none"/>
+        </w:rPr>
+      </w:r>
     </w:p>
     <w:p>
       <w:pPr>
         <w:pBdr/>
-        <w:shd w:val="nil"/>
+        <w:shd w:val="nil" w:color="auto"/>
         <w:spacing/>
         <w:ind/>
         <w:rPr/>
@@ -4938,7 +5062,6 @@
       <w:r>
         <w:br w:type="page" w:clear="all"/>
       </w:r>
-      <w:r/>
       <w:r/>
     </w:p>
     <w:p>
@@ -4980,7 +5103,16 @@
         </w:rPr>
       </w:r>
       <w:bookmarkEnd w:id="10"/>
-      <w:r/>
+      <w:r>
+        <w:rPr>
+          <w:rFonts w:ascii="Times New Roman" w:hAnsi="Times New Roman" w:eastAsia="Times New Roman" w:cs="Times New Roman"/>
+          <w:b/>
+          <w:bCs/>
+          <w:sz w:val="48"/>
+          <w:szCs w:val="48"/>
+          <w:highlight w:val="none"/>
+        </w:rPr>
+      </w:r>
       <w:r>
         <w:rPr>
           <w:rFonts w:ascii="Times New Roman" w:hAnsi="Times New Roman" w:eastAsia="Times New Roman" w:cs="Times New Roman"/>
@@ -4999,7 +5131,6 @@
         <w:ind/>
         <w:rPr/>
       </w:pPr>
-      <w:r/>
       <w:r/>
       <w:r/>
     </w:p>
@@ -5027,7 +5158,11 @@
         </w:rPr>
       </w:r>
       <w:bookmarkEnd w:id="11"/>
-      <w:r/>
+      <w:r>
+        <w:rPr>
+          <w14:ligatures w14:val="none"/>
+        </w:rPr>
+      </w:r>
       <w:r>
         <w:rPr>
           <w14:ligatures w14:val="none"/>
@@ -5075,7 +5210,7 @@
                         </pic:cNvPicPr>
                         <pic:nvPr/>
                       </pic:nvPicPr>
-                      <pic:blipFill rotWithShape="1">
+                      <pic:blipFill>
                         <a:blip r:embed="rId17"/>
                         <a:stretch/>
                       </pic:blipFill>
@@ -5842,41 +5977,190 @@
     </w:p>
     <w:p>
       <w:pPr>
-        <w:pBdr/>
-        <w:spacing/>
-        <w:ind/>
-        <w:rPr/>
-      </w:pPr>
+        <w:pStyle w:val="845"/>
+        <w:pBdr/>
+        <w:spacing/>
+        <w:ind/>
+        <w:rPr>
+          <w:rFonts w:ascii="Times New Roman" w:hAnsi="Times New Roman" w:eastAsia="Times New Roman" w:cs="Times New Roman"/>
+          <w:b/>
+          <w:bCs/>
+          <w:sz w:val="48"/>
+          <w:szCs w:val="48"/>
+          <w:highlight w:val="none"/>
+        </w:rPr>
+      </w:pPr>
+      <w:r/>
       <w:r>
         <w:rPr>
+          <w:rFonts w:ascii="Times New Roman" w:hAnsi="Times New Roman" w:eastAsia="Times New Roman" w:cs="Times New Roman"/>
+          <w:b/>
+          <w:bCs/>
+          <w:sz w:val="48"/>
+          <w:szCs w:val="48"/>
+          <w:highlight w:val="none"/>
+        </w:rPr>
+        <w:t xml:space="preserve">Recettes</w:t>
+      </w:r>
+      <w:r>
+        <w:rPr>
+          <w:rFonts w:ascii="Times New Roman" w:hAnsi="Times New Roman" w:eastAsia="Times New Roman" w:cs="Times New Roman"/>
+          <w:b/>
+          <w:bCs/>
+          <w:sz w:val="48"/>
+          <w:szCs w:val="48"/>
+          <w:highlight w:val="none"/>
+        </w:rPr>
+      </w:r>
+    </w:p>
+    <w:p>
+      <w:pPr>
+        <w:pBdr/>
+        <w:spacing/>
+        <w:ind/>
+        <w:jc w:val="center"/>
+        <w:rPr/>
+      </w:pPr>
+      <w:r/>
+      <w:r>
+        <mc:AlternateContent>
+          <mc:Choice Requires="wpg">
+            <w:drawing>
+              <wp:anchor xmlns:wp="http://schemas.openxmlformats.org/drawingml/2006/wordprocessingDrawing" xmlns:wp14="http://schemas.microsoft.com/office/word/2010/wordprocessingDrawing" distT="0" distB="0" distL="115200" distR="115200" simplePos="0" relativeHeight="18432" behindDoc="0" locked="0" layoutInCell="1" allowOverlap="1">
+                <wp:simplePos x="0" y="0"/>
+                <wp:positionH relativeFrom="column">
+                  <wp:posOffset>-1048555</wp:posOffset>
+                </wp:positionH>
+                <wp:positionV relativeFrom="paragraph">
+                  <wp:posOffset>117902</wp:posOffset>
+                </wp:positionV>
+                <wp:extent cx="7497150" cy="2308164"/>
+                <wp:effectExtent l="0" t="0" r="0" b="0"/>
+                <wp:wrapThrough wrapText="bothSides">
+                  <wp:wrapPolygon edited="1">
+                    <wp:start x="0" y="0"/>
+                    <wp:lineTo x="21600" y="0"/>
+                    <wp:lineTo x="21600" y="21600"/>
+                    <wp:lineTo x="0" y="21600"/>
+                  </wp:wrapPolygon>
+                </wp:wrapThrough>
+                <wp:docPr id="8" name=""/>
+                <wp:cNvGraphicFramePr>
+                  <a:graphicFrameLocks xmlns:a="http://schemas.openxmlformats.org/drawingml/2006/main" noChangeAspect="1"/>
+                </wp:cNvGraphicFramePr>
+                <a:graphic xmlns:a="http://schemas.openxmlformats.org/drawingml/2006/main">
+                  <a:graphicData uri="http://schemas.openxmlformats.org/drawingml/2006/picture">
+                    <pic:pic xmlns:pic="http://schemas.openxmlformats.org/drawingml/2006/picture">
+                      <pic:nvPicPr>
+                        <pic:cNvPr id="613348510" name=""/>
+                        <pic:cNvPicPr>
+                          <a:picLocks noChangeAspect="1"/>
+                        </pic:cNvPicPr>
+                        <pic:nvPr/>
+                      </pic:nvPicPr>
+                      <pic:blipFill>
+                        <a:blip r:embed="rId18"/>
+                        <a:stretch/>
+                      </pic:blipFill>
+                      <pic:spPr bwMode="auto">
+                        <a:xfrm flipH="0" flipV="0">
+                          <a:off x="0" y="0"/>
+                          <a:ext cx="7497149" cy="2308163"/>
+                        </a:xfrm>
+                        <a:prstGeom prst="rect">
+                          <a:avLst/>
+                        </a:prstGeom>
+                      </pic:spPr>
+                    </pic:pic>
+                  </a:graphicData>
+                </a:graphic>
+              </wp:anchor>
+            </w:drawing>
+          </mc:Choice>
+          <mc:Fallback>
+            <w:pict>
+              <v:shapetype id="_x0000_t75" coordsize="21600,21600" o:spt="75" o:preferrelative="t" path="m@4@5l@4@11@9@11@9@5xe" filled="f" stroked="f">
+                <v:stroke joinstyle="miter"/>
+                <v:formulas>
+                  <v:f eqn="if lineDrawn pixelLineWidth 0"/>
+                  <v:f eqn="sum @0 1 0"/>
+                  <v:f eqn="sum 0 0 @1"/>
+                  <v:f eqn="prod @2 1 2"/>
+                  <v:f eqn="prod @3 21600 pixelWidth"/>
+                  <v:f eqn="prod @3 21600 pixelHeight"/>
+                  <v:f eqn="sum @0 0 1"/>
+                  <v:f eqn="prod @6 1 2"/>
+                  <v:f eqn="prod @7 21600 pixelWidth"/>
+                  <v:f eqn="sum @8 21600 0"/>
+                  <v:f eqn="prod @7 21600 pixelHeight"/>
+                  <v:f eqn="sum @10 21600 0"/>
+                </v:formulas>
+                <v:path o:extrusionok="f" gradientshapeok="t" o:connecttype="rect"/>
+                <o:lock v:ext="edit" aspectratio="t"/>
+              </v:shapetype>
+              <v:shape id="_x0000_i7" o:spid="_x0000_s7" type="#_x0000_t75" style="position:absolute;z-index:18432;o:allowoverlap:true;o:allowincell:true;mso-position-horizontal-relative:text;margin-left:-82.56pt;mso-position-horizontal:absolute;mso-position-vertical-relative:text;margin-top:9.28pt;mso-position-vertical:absolute;width:590.33pt;height:181.75pt;mso-wrap-distance-left:9.07pt;mso-wrap-distance-top:0.00pt;mso-wrap-distance-right:9.07pt;mso-wrap-distance-bottom:0.00pt;z-index:1;" wrapcoords="0 0 100000 0 100000 100000 0 100000" stroked="false">
+                <w10:wrap type="through"/>
+                <v:imagedata r:id="rId18" o:title=""/>
+                <o:lock v:ext="edit" rotation="t"/>
+              </v:shape>
+            </w:pict>
+          </mc:Fallback>
+        </mc:AlternateContent>
+      </w:r>
+      <w:r/>
+      <w:r/>
+      <w:r/>
+    </w:p>
+    <w:p>
+      <w:pPr>
+        <w:pBdr/>
+        <w:spacing/>
+        <w:ind/>
+        <w:rPr/>
+      </w:pPr>
+      <w:r>
+        <w:rPr>
+          <w:rFonts w:ascii="Times New Roman" w:hAnsi="Times New Roman" w:eastAsia="Times New Roman" w:cs="Times New Roman"/>
+          <w:b/>
+          <w:bCs/>
+          <w:sz w:val="48"/>
+          <w:szCs w:val="48"/>
           <w:highlight w:val="none"/>
         </w:rPr>
       </w:r>
       <w:r/>
-      <w:r/>
-    </w:p>
-    <w:p>
-      <w:pPr>
-        <w:pBdr/>
-        <w:spacing/>
-        <w:ind/>
-        <w:rPr/>
-      </w:pPr>
       <w:r>
         <w:rPr>
+          <w:rFonts w:ascii="Times New Roman" w:hAnsi="Times New Roman" w:eastAsia="Times New Roman" w:cs="Times New Roman"/>
+          <w:b/>
+          <w:bCs/>
+          <w:sz w:val="48"/>
+          <w:szCs w:val="48"/>
+          <w:highlight w:val="none"/>
+        </w:rPr>
+      </w:r>
+      <w:r/>
+      <w:r>
+        <w:rPr>
+          <w:rFonts w:ascii="Times New Roman" w:hAnsi="Times New Roman" w:eastAsia="Times New Roman" w:cs="Times New Roman"/>
+          <w:b/>
+          <w:bCs/>
+          <w:sz w:val="48"/>
+          <w:szCs w:val="48"/>
           <w:highlight w:val="none"/>
         </w:rPr>
       </w:r>
       <w:r>
         <w:rPr>
+          <w:rFonts w:ascii="Times New Roman" w:hAnsi="Times New Roman" w:eastAsia="Times New Roman" w:cs="Times New Roman"/>
+          <w:b/>
+          <w:bCs/>
+          <w:sz w:val="48"/>
+          <w:szCs w:val="48"/>
           <w:highlight w:val="none"/>
         </w:rPr>
       </w:r>
-      <w:r>
-        <w:rPr>
-          <w:highlight w:val="none"/>
-        </w:rPr>
-      </w:r>
+      <w:r/>
     </w:p>
     <w:sectPr>
       <w:footerReference w:type="default" r:id="rId10"/>

</xml_diff>

<commit_message>
Mise en page du dossier
</commit_message>
<xml_diff>
--- a/marais_r_sense_dossier_technique_partie_commune.docx
+++ b/marais_r_sense_dossier_technique_partie_commune.docx
@@ -394,6 +394,17 @@
           <w:highlight w:val="none"/>
         </w:rPr>
       </w:r>
+      <w:r/>
+      <w:r>
+        <w:rPr>
+          <w:rFonts w:ascii="Times New Roman" w:hAnsi="Times New Roman" w:eastAsia="Times New Roman" w:cs="Times New Roman"/>
+          <w:b/>
+          <w:bCs/>
+          <w:sz w:val="32"/>
+          <w:szCs w:val="32"/>
+          <w:highlight w:val="none"/>
+        </w:rPr>
+      </w:r>
       <w:r>
         <w:rPr>
           <w:rFonts w:ascii="Times New Roman" w:hAnsi="Times New Roman" w:eastAsia="Times New Roman" w:cs="Times New Roman"/>
@@ -441,20 +452,20 @@
         </w:rPr>
       </w:r>
       <w:r>
-        <w:rPr>
-          <w:rFonts w:ascii="Times New Roman" w:hAnsi="Times New Roman" w:eastAsia="Times New Roman" w:cs="Times New Roman"/>
-          <w:b/>
-          <w:bCs/>
-          <w:sz w:val="32"/>
-          <w:szCs w:val="32"/>
-          <w:highlight w:val="none"/>
-        </w:rPr>
         <mc:AlternateContent>
           <mc:Choice Requires="wpg">
             <w:drawing>
-              <wp:inline xmlns:wp="http://schemas.openxmlformats.org/drawingml/2006/wordprocessingDrawing" distT="0" distB="0" distL="0" distR="0">
-                <wp:extent cx="2381250" cy="2362200"/>
+              <wp:anchor xmlns:wp="http://schemas.openxmlformats.org/drawingml/2006/wordprocessingDrawing" xmlns:wp14="http://schemas.microsoft.com/office/word/2010/wordprocessingDrawing" distT="0" distB="0" distL="115200" distR="115200" simplePos="0" relativeHeight="31744" behindDoc="0" locked="0" layoutInCell="1" allowOverlap="1">
+                <wp:simplePos x="0" y="0"/>
+                <wp:positionH relativeFrom="column">
+                  <wp:posOffset>-827972</wp:posOffset>
+                </wp:positionH>
+                <wp:positionV relativeFrom="paragraph">
+                  <wp:posOffset>62576</wp:posOffset>
+                </wp:positionV>
+                <wp:extent cx="3527992" cy="2237048"/>
                 <wp:effectExtent l="0" t="0" r="0" b="0"/>
+                <wp:wrapNone/>
                 <wp:docPr id="1" name=""/>
                 <wp:cNvGraphicFramePr>
                   <a:graphicFrameLocks xmlns:a="http://schemas.openxmlformats.org/drawingml/2006/main" noChangeAspect="1"/>
@@ -463,20 +474,20 @@
                   <a:graphicData uri="http://schemas.openxmlformats.org/drawingml/2006/picture">
                     <pic:pic xmlns:pic="http://schemas.openxmlformats.org/drawingml/2006/picture">
                       <pic:nvPicPr>
-                        <pic:cNvPr id="454844474" name=""/>
+                        <pic:cNvPr id="1220292816" name=""/>
                         <pic:cNvPicPr>
                           <a:picLocks noChangeAspect="1"/>
                         </pic:cNvPicPr>
                         <pic:nvPr/>
                       </pic:nvPicPr>
-                      <pic:blipFill>
+                      <pic:blipFill rotWithShape="1">
                         <a:blip r:embed="rId11"/>
                         <a:stretch/>
                       </pic:blipFill>
                       <pic:spPr bwMode="auto">
-                        <a:xfrm>
+                        <a:xfrm flipH="0" flipV="0">
                           <a:off x="0" y="0"/>
-                          <a:ext cx="2381249" cy="2362199"/>
+                          <a:ext cx="3527992" cy="2237047"/>
                         </a:xfrm>
                         <a:prstGeom prst="rect">
                           <a:avLst/>
@@ -485,7 +496,7 @@
                     </pic:pic>
                   </a:graphicData>
                 </a:graphic>
-              </wp:inline>
+              </wp:anchor>
             </w:drawing>
           </mc:Choice>
           <mc:Fallback>
@@ -509,8 +520,124 @@
                 <v:path o:extrusionok="f" gradientshapeok="t" o:connecttype="rect"/>
                 <o:lock v:ext="edit" aspectratio="t"/>
               </v:shapetype>
-              <v:shape id="_x0000_i0" o:spid="_x0000_s0" type="#_x0000_t75" style="width:187.50pt;height:186.00pt;mso-wrap-distance-left:0.00pt;mso-wrap-distance-top:0.00pt;mso-wrap-distance-right:0.00pt;mso-wrap-distance-bottom:0.00pt;z-index:1;" stroked="false">
+              <v:shape id="_x0000_i0" o:spid="_x0000_s0" type="#_x0000_t75" style="position:absolute;z-index:31744;o:allowoverlap:true;o:allowincell:true;mso-position-horizontal-relative:text;margin-left:-65.19pt;mso-position-horizontal:absolute;mso-position-vertical-relative:text;margin-top:4.93pt;mso-position-vertical:absolute;width:277.79pt;height:176.15pt;mso-wrap-distance-left:9.07pt;mso-wrap-distance-top:0.00pt;mso-wrap-distance-right:9.07pt;mso-wrap-distance-bottom:0.00pt;z-index:1;" stroked="false">
                 <v:imagedata r:id="rId11" o:title=""/>
+                <o:lock v:ext="edit" rotation="t"/>
+              </v:shape>
+            </w:pict>
+          </mc:Fallback>
+        </mc:AlternateContent>
+      </w:r>
+      <w:r>
+        <w:rPr>
+          <w:rFonts w:ascii="Times New Roman" w:hAnsi="Times New Roman" w:eastAsia="Times New Roman" w:cs="Times New Roman"/>
+          <w:b/>
+          <w:bCs/>
+          <w:sz w:val="32"/>
+          <w:szCs w:val="32"/>
+          <w:highlight w:val="none"/>
+        </w:rPr>
+      </w:r>
+      <w:r/>
+      <w:r>
+        <w:rPr>
+          <w:rFonts w:ascii="Times New Roman" w:hAnsi="Times New Roman" w:eastAsia="Times New Roman" w:cs="Times New Roman"/>
+          <w:b/>
+          <w:bCs/>
+          <w:sz w:val="32"/>
+          <w:szCs w:val="32"/>
+          <w:highlight w:val="none"/>
+        </w:rPr>
+      </w:r>
+      <w:r>
+        <w:rPr>
+          <w:rFonts w:ascii="Times New Roman" w:hAnsi="Times New Roman" w:eastAsia="Times New Roman" w:cs="Times New Roman"/>
+          <w:b/>
+          <w:bCs/>
+          <w:sz w:val="32"/>
+          <w:szCs w:val="32"/>
+          <w:highlight w:val="none"/>
+        </w:rPr>
+      </w:r>
+      <w:r>
+        <w:rPr>
+          <w:rFonts w:ascii="Times New Roman" w:hAnsi="Times New Roman" w:eastAsia="Times New Roman" w:cs="Times New Roman"/>
+          <w:b/>
+          <w:bCs/>
+          <w:sz w:val="32"/>
+          <w:szCs w:val="32"/>
+          <w:highlight w:val="none"/>
+        </w:rPr>
+        <mc:AlternateContent>
+          <mc:Choice Requires="wpg">
+            <w:drawing>
+              <wp:anchor xmlns:wp="http://schemas.openxmlformats.org/drawingml/2006/wordprocessingDrawing" xmlns:wp14="http://schemas.microsoft.com/office/word/2010/wordprocessingDrawing" distT="0" distB="0" distL="115200" distR="115200" simplePos="0" relativeHeight="2048" behindDoc="0" locked="0" layoutInCell="1" allowOverlap="1">
+                <wp:simplePos x="0" y="0"/>
+                <wp:positionH relativeFrom="column">
+                  <wp:posOffset>3559175</wp:posOffset>
+                </wp:positionH>
+                <wp:positionV relativeFrom="paragraph">
+                  <wp:posOffset>0</wp:posOffset>
+                </wp:positionV>
+                <wp:extent cx="2381250" cy="2362200"/>
+                <wp:effectExtent l="0" t="0" r="0" b="0"/>
+                <wp:wrapNone/>
+                <wp:docPr id="2" name=""/>
+                <wp:cNvGraphicFramePr>
+                  <a:graphicFrameLocks xmlns:a="http://schemas.openxmlformats.org/drawingml/2006/main" noChangeAspect="1"/>
+                </wp:cNvGraphicFramePr>
+                <a:graphic xmlns:a="http://schemas.openxmlformats.org/drawingml/2006/main">
+                  <a:graphicData uri="http://schemas.openxmlformats.org/drawingml/2006/picture">
+                    <pic:pic xmlns:pic="http://schemas.openxmlformats.org/drawingml/2006/picture">
+                      <pic:nvPicPr>
+                        <pic:cNvPr id="1727857752" name=""/>
+                        <pic:cNvPicPr>
+                          <a:picLocks noChangeAspect="1"/>
+                        </pic:cNvPicPr>
+                        <pic:nvPr/>
+                      </pic:nvPicPr>
+                      <pic:blipFill rotWithShape="1">
+                        <a:blip r:embed="rId12"/>
+                        <a:stretch/>
+                      </pic:blipFill>
+                      <pic:spPr bwMode="auto">
+                        <a:xfrm>
+                          <a:off x="0" y="0"/>
+                          <a:ext cx="2381248" cy="2362198"/>
+                        </a:xfrm>
+                        <a:prstGeom prst="rect">
+                          <a:avLst/>
+                        </a:prstGeom>
+                      </pic:spPr>
+                    </pic:pic>
+                  </a:graphicData>
+                </a:graphic>
+              </wp:anchor>
+            </w:drawing>
+          </mc:Choice>
+          <mc:Fallback>
+            <w:pict>
+              <v:shapetype id="_x0000_t75" coordsize="21600,21600" o:spt="75" o:preferrelative="t" path="m@4@5l@4@11@9@11@9@5xe" filled="f" stroked="f">
+                <v:stroke joinstyle="miter"/>
+                <v:formulas>
+                  <v:f eqn="if lineDrawn pixelLineWidth 0"/>
+                  <v:f eqn="sum @0 1 0"/>
+                  <v:f eqn="sum 0 0 @1"/>
+                  <v:f eqn="prod @2 1 2"/>
+                  <v:f eqn="prod @3 21600 pixelWidth"/>
+                  <v:f eqn="prod @3 21600 pixelHeight"/>
+                  <v:f eqn="sum @0 0 1"/>
+                  <v:f eqn="prod @6 1 2"/>
+                  <v:f eqn="prod @7 21600 pixelWidth"/>
+                  <v:f eqn="sum @8 21600 0"/>
+                  <v:f eqn="prod @7 21600 pixelHeight"/>
+                  <v:f eqn="sum @10 21600 0"/>
+                </v:formulas>
+                <v:path o:extrusionok="f" gradientshapeok="t" o:connecttype="rect"/>
+                <o:lock v:ext="edit" aspectratio="t"/>
+              </v:shapetype>
+              <v:shape id="_x0000_i1" o:spid="_x0000_s1" type="#_x0000_t75" style="position:absolute;z-index:2048;o:allowoverlap:true;o:allowincell:true;mso-position-horizontal-relative:text;margin-left:280.25pt;mso-position-horizontal:absolute;mso-position-vertical-relative:text;margin-top:0.00pt;mso-position-vertical:absolute;width:187.50pt;height:186.00pt;mso-wrap-distance-left:9.07pt;mso-wrap-distance-top:0.00pt;mso-wrap-distance-right:9.07pt;mso-wrap-distance-bottom:0.00pt;z-index:1;" stroked="false">
+                <v:imagedata r:id="rId12" o:title=""/>
                 <o:lock v:ext="edit" rotation="t"/>
               </v:shape>
             </w:pict>
@@ -537,13 +664,7 @@
           <w:highlight w:val="none"/>
         </w:rPr>
       </w:r>
-    </w:p>
-    <w:p>
-      <w:pPr>
-        <w:pBdr/>
-        <w:shd w:val="nil" w:color="auto"/>
-        <w:spacing/>
-        <w:ind/>
+      <w:r>
         <w:rPr>
           <w:rFonts w:ascii="Times New Roman" w:hAnsi="Times New Roman" w:eastAsia="Times New Roman" w:cs="Times New Roman"/>
           <w:b/>
@@ -552,7 +673,47 @@
           <w:szCs w:val="32"/>
           <w:highlight w:val="none"/>
         </w:rPr>
-      </w:pPr>
+      </w:r>
+    </w:p>
+    <w:p>
+      <w:pPr>
+        <w:pBdr/>
+        <w:shd w:val="nil" w:color="auto"/>
+        <w:spacing/>
+        <w:ind/>
+        <w:rPr>
+          <w:rFonts w:ascii="Times New Roman" w:hAnsi="Times New Roman" w:eastAsia="Times New Roman" w:cs="Times New Roman"/>
+          <w:b/>
+          <w:bCs/>
+          <w:sz w:val="32"/>
+          <w:szCs w:val="32"/>
+          <w:highlight w:val="none"/>
+        </w:rPr>
+      </w:pPr>
+      <w:r>
+        <w:rPr>
+          <w:rFonts w:ascii="Times New Roman" w:hAnsi="Times New Roman" w:eastAsia="Times New Roman" w:cs="Times New Roman"/>
+          <w:b/>
+          <w:bCs/>
+          <w:sz w:val="32"/>
+          <w:szCs w:val="32"/>
+          <w:highlight w:val="none"/>
+        </w:rPr>
+      </w:r>
+      <w:r/>
+      <w:r>
+        <w:rPr>
+          <w:rFonts w:ascii="Times New Roman" w:hAnsi="Times New Roman" w:eastAsia="Times New Roman" w:cs="Times New Roman"/>
+          <w:b/>
+          <w:bCs/>
+          <w:sz w:val="32"/>
+          <w:szCs w:val="32"/>
+          <w:highlight w:val="none"/>
+        </w:rPr>
+      </w:r>
+      <w:r/>
+      <w:r/>
+      <w:r/>
       <w:r>
         <w:rPr>
           <w:rFonts w:ascii="Times New Roman" w:hAnsi="Times New Roman" w:eastAsia="Times New Roman" w:cs="Times New Roman"/>
@@ -595,6 +756,7 @@
           <w:rFonts w:ascii="Times New Roman" w:hAnsi="Times New Roman" w:eastAsia="Times New Roman" w:cs="Times New Roman"/>
           <w:b/>
           <w:bCs/>
+          <w:color w:val="1f4f79" w:themeColor="accent1" w:themeShade="80"/>
           <w:sz w:val="48"/>
           <w:szCs w:val="48"/>
           <w:highlight w:val="none"/>
@@ -607,6 +769,7 @@
           <w:rFonts w:ascii="Times New Roman" w:hAnsi="Times New Roman" w:eastAsia="Times New Roman" w:cs="Times New Roman"/>
           <w:b/>
           <w:bCs/>
+          <w:color w:val="1f4f79" w:themeColor="accent1" w:themeShade="80"/>
           <w:sz w:val="48"/>
           <w:szCs w:val="48"/>
           <w:highlight w:val="none"/>
@@ -618,6 +781,7 @@
           <w:rFonts w:ascii="Times New Roman" w:hAnsi="Times New Roman" w:eastAsia="Times New Roman" w:cs="Times New Roman"/>
           <w:b/>
           <w:bCs/>
+          <w:color w:val="1f4f79" w:themeColor="accent1" w:themeShade="80"/>
           <w:sz w:val="48"/>
           <w:szCs w:val="48"/>
           <w:highlight w:val="none"/>
@@ -626,12 +790,7 @@
       <w:bookmarkEnd w:id="1"/>
       <w:r>
         <w:rPr>
-          <w:rFonts w:ascii="Times New Roman" w:hAnsi="Times New Roman" w:eastAsia="Times New Roman" w:cs="Times New Roman"/>
-          <w:b/>
-          <w:bCs/>
-          <w:sz w:val="48"/>
-          <w:szCs w:val="48"/>
-          <w:highlight w:val="none"/>
+          <w:color w:val="1f4f79" w:themeColor="accent1" w:themeShade="80"/>
         </w:rPr>
       </w:r>
       <w:r>
@@ -639,6 +798,7 @@
           <w:rFonts w:ascii="Times New Roman" w:hAnsi="Times New Roman" w:eastAsia="Times New Roman" w:cs="Times New Roman"/>
           <w:b/>
           <w:bCs/>
+          <w:color w:val="1f4f79" w:themeColor="accent1" w:themeShade="80"/>
           <w:sz w:val="48"/>
           <w:szCs w:val="48"/>
           <w:highlight w:val="none"/>
@@ -746,12 +906,6 @@
               <w:highlight w:val="none"/>
             </w:rPr>
           </w:r>
-          <w:r>
-            <w:rPr>
-              <w:rFonts w:ascii="Times New Roman" w:hAnsi="Times New Roman" w:eastAsia="Times New Roman" w:cs="Times New Roman"/>
-              <w:highlight w:val="none"/>
-            </w:rPr>
-          </w:r>
         </w:p>
         <w:p>
           <w:pPr>
@@ -767,7 +921,6 @@
               <w14:ligatures w14:val="none"/>
             </w:rPr>
           </w:pPr>
-          <w:r/>
           <w:hyperlink w:tooltip="#_Toc2" w:anchor="_Toc2" w:history="1">
             <w:r>
               <w:rPr>
@@ -778,27 +931,19 @@
               <w:rPr>
                 <w:rStyle w:val="890"/>
               </w:rPr>
-              <w:t xml:space="preserve">Contexte du projet </w:t>
-            </w:r>
-            <w:r>
-              <w:rPr>
-                <w:rStyle w:val="890"/>
-                <w:highlight w:val="none"/>
-              </w:rPr>
-              <w:t xml:space="preserve">(</w:t>
+              <w:t xml:space="preserve"> </w:t>
             </w:r>
             <w:r>
               <w:rPr>
                 <w:rStyle w:val="890"/>
               </w:rPr>
-              <w:t xml:space="preserve">diagramme de contexte</w:t>
+              <w:t xml:space="preserve">1 -  Situation du projet dans son contexte</w:t>
             </w:r>
             <w:r>
               <w:rPr>
                 <w:rStyle w:val="890"/>
-                <w:highlight w:val="none"/>
               </w:rPr>
-              <w:t xml:space="preserve">)</w:t>
+              <w:t xml:space="preserve"> </w:t>
             </w:r>
             <w:r>
               <w:rPr>
@@ -824,12 +969,54 @@
               <w14:ligatures w14:val="none"/>
             </w:rPr>
           </w:r>
-          <w:r>
-            <w:rPr>
-              <w:highlight w:val="none"/>
-              <w14:ligatures w14:val="none"/>
-            </w:rPr>
-          </w:r>
+        </w:p>
+        <w:p>
+          <w:pPr>
+            <w:pStyle w:val="893"/>
+            <w:pBdr/>
+            <w:tabs>
+              <w:tab w:val="right" w:leader="dot" w:pos="9355"/>
+            </w:tabs>
+            <w:spacing/>
+            <w:ind/>
+            <w:rPr/>
+          </w:pPr>
+          <w:hyperlink w:tooltip="#_Toc3" w:anchor="_Toc3" w:history="1">
+            <w:r>
+              <w:rPr>
+                <w:rStyle w:val="890"/>
+              </w:rPr>
+            </w:r>
+            <w:r>
+              <w:rPr>
+                <w:rStyle w:val="890"/>
+              </w:rPr>
+              <w:t xml:space="preserve">1.1  – </w:t>
+            </w:r>
+            <w:r>
+              <w:rPr>
+                <w:rStyle w:val="890"/>
+                <w:highlight w:val="none"/>
+              </w:rPr>
+              <w:t xml:space="preserve">Introduction du projet</w:t>
+            </w:r>
+            <w:r>
+              <w:rPr>
+                <w:rStyle w:val="890"/>
+              </w:rPr>
+            </w:r>
+            <w:r>
+              <w:tab/>
+            </w:r>
+            <w:r>
+              <w:fldChar w:fldCharType="begin"/>
+              <w:instrText xml:space="preserve">PAGEREF _Toc3 \h</w:instrText>
+              <w:fldChar w:fldCharType="separate"/>
+              <w:t xml:space="preserve">3</w:t>
+              <w:fldChar w:fldCharType="end"/>
+            </w:r>
+          </w:hyperlink>
+          <w:r/>
         </w:p>
         <w:p>
           <w:pPr>
@@ -845,8 +1032,7 @@
               <w:highlight w:val="none"/>
             </w:rPr>
           </w:pPr>
-          <w:r/>
-          <w:hyperlink w:tooltip="#_Toc3" w:anchor="_Toc3" w:history="1">
+          <w:hyperlink w:tooltip="#_Toc4" w:anchor="_Toc4" w:history="1">
             <w:r>
               <w:rPr>
                 <w:rStyle w:val="890"/>
@@ -856,7 +1042,7 @@
               <w:rPr>
                 <w:rStyle w:val="890"/>
               </w:rPr>
-              <w:t xml:space="preserve">Spécification fonctionnelle</w:t>
+              <w:t xml:space="preserve">2 - Spécification fonctionnelle</w:t>
             </w:r>
             <w:r>
               <w:rPr>
@@ -870,18 +1056,12 @@
             </w:r>
             <w:r>
               <w:fldChar w:fldCharType="begin"/>
-              <w:instrText xml:space="preserve">PAGEREF _Toc3 \h</w:instrText>
+              <w:instrText xml:space="preserve">PAGEREF _Toc4 \h</w:instrText>
               <w:fldChar w:fldCharType="separate"/>
               <w:t xml:space="preserve">4</w:t>
               <w:fldChar w:fldCharType="end"/>
             </w:r>
           </w:hyperlink>
-          <w:r>
-            <w:rPr>
-              <w:rFonts w:ascii="Times New Roman" w:hAnsi="Times New Roman" w:eastAsia="Times New Roman" w:cs="Times New Roman"/>
-              <w:highlight w:val="none"/>
-            </w:rPr>
-          </w:r>
           <w:r>
             <w:rPr>
               <w:rFonts w:ascii="Times New Roman" w:hAnsi="Times New Roman" w:eastAsia="Times New Roman" w:cs="Times New Roman"/>
@@ -900,60 +1080,6 @@
             <w:ind/>
             <w:rPr/>
           </w:pPr>
-          <w:r/>
-          <w:hyperlink w:tooltip="#_Toc4" w:anchor="_Toc4" w:history="1">
-            <w:r>
-              <w:rPr>
-                <w:rStyle w:val="890"/>
-              </w:rPr>
-            </w:r>
-            <w:r>
-              <w:rPr>
-                <w:rStyle w:val="890"/>
-                <w:rFonts w:ascii="Times New Roman" w:hAnsi="Times New Roman" w:eastAsia="Times New Roman" w:cs="Times New Roman"/>
-                <w:highlight w:val="none"/>
-              </w:rPr>
-              <w:t xml:space="preserve">Diagramme utilisation</w:t>
-            </w:r>
-            <w:r>
-              <w:rPr>
-                <w:rStyle w:val="890"/>
-                <w:rFonts w:ascii="Times New Roman" w:hAnsi="Times New Roman" w:eastAsia="Times New Roman" w:cs="Times New Roman"/>
-                <w:highlight w:val="none"/>
-              </w:rPr>
-              <w:t xml:space="preserve"> :</w:t>
-            </w:r>
-            <w:r>
-              <w:rPr>
-                <w:rStyle w:val="890"/>
-              </w:rPr>
-            </w:r>
-            <w:r>
-              <w:tab/>
-            </w:r>
-            <w:r>
-              <w:fldChar w:fldCharType="begin"/>
-              <w:instrText xml:space="preserve">PAGEREF _Toc4 \h</w:instrText>
-              <w:fldChar w:fldCharType="separate"/>
-              <w:t xml:space="preserve">4</w:t>
-              <w:fldChar w:fldCharType="end"/>
-            </w:r>
-          </w:hyperlink>
-          <w:r/>
-          <w:r/>
-        </w:p>
-        <w:p>
-          <w:pPr>
-            <w:pStyle w:val="893"/>
-            <w:pBdr/>
-            <w:tabs>
-              <w:tab w:val="right" w:leader="dot" w:pos="9355"/>
-            </w:tabs>
-            <w:spacing/>
-            <w:ind/>
-            <w:rPr/>
-          </w:pPr>
-          <w:r/>
           <w:hyperlink w:tooltip="#_Toc5" w:anchor="_Toc5" w:history="1">
             <w:r>
               <w:rPr>
@@ -963,8 +1089,9 @@
             <w:r>
               <w:rPr>
                 <w:rStyle w:val="890"/>
+                <w:highlight w:val="none"/>
               </w:rPr>
-              <w:t xml:space="preserve">Tableau description diagramme d’utilisation : </w:t>
+              <w:t xml:space="preserve">2.1 – Diagramme des cas d’utilisation</w:t>
             </w:r>
             <w:r>
               <w:rPr>
@@ -983,20 +1110,20 @@
             </w:r>
           </w:hyperlink>
           <w:r/>
-          <w:r/>
         </w:p>
         <w:p>
           <w:pPr>
-            <w:pStyle w:val="893"/>
+            <w:pStyle w:val="894"/>
             <w:pBdr/>
             <w:tabs>
               <w:tab w:val="right" w:leader="dot" w:pos="9355"/>
             </w:tabs>
             <w:spacing/>
             <w:ind/>
-            <w:rPr/>
+            <w:rPr>
+              <w:rFonts w:ascii="Times New Roman" w:hAnsi="Times New Roman" w:cs="Times New Roman"/>
+            </w:rPr>
           </w:pPr>
-          <w:r/>
           <w:hyperlink w:tooltip="#_Toc6" w:anchor="_Toc6" w:history="1">
             <w:r>
               <w:rPr>
@@ -1006,12 +1133,15 @@
             <w:r>
               <w:rPr>
                 <w:rStyle w:val="890"/>
+                <w:rFonts w:ascii="Times New Roman" w:hAnsi="Times New Roman" w:eastAsia="Times New Roman" w:cs="Times New Roman"/>
+                <w:highlight w:val="none"/>
               </w:rPr>
-              <w:t xml:space="preserve">Scénarios associés</w:t>
+              <w:t xml:space="preserve">2.1.1 – Description des cas d’utilisation</w:t>
             </w:r>
             <w:r>
               <w:rPr>
                 <w:rStyle w:val="890"/>
+                <w:rFonts w:ascii="Times New Roman" w:hAnsi="Times New Roman" w:cs="Times New Roman"/>
               </w:rPr>
             </w:r>
             <w:r>
@@ -1021,16 +1151,19 @@
               <w:fldChar w:fldCharType="begin"/>
               <w:instrText xml:space="preserve">PAGEREF _Toc6 \h</w:instrText>
               <w:fldChar w:fldCharType="separate"/>
-              <w:t xml:space="preserve">5</w:t>
+              <w:t xml:space="preserve">4</w:t>
               <w:fldChar w:fldCharType="end"/>
             </w:r>
           </w:hyperlink>
-          <w:r/>
-          <w:r/>
+          <w:r>
+            <w:rPr>
+              <w:rFonts w:ascii="Times New Roman" w:hAnsi="Times New Roman" w:cs="Times New Roman"/>
+            </w:rPr>
+          </w:r>
         </w:p>
         <w:p>
           <w:pPr>
-            <w:pStyle w:val="893"/>
+            <w:pStyle w:val="894"/>
             <w:pBdr/>
             <w:tabs>
               <w:tab w:val="right" w:leader="dot" w:pos="9355"/>
@@ -1038,17 +1171,10 @@
             <w:spacing/>
             <w:ind/>
             <w:rPr>
-              <w:rFonts w:ascii="Times New Roman" w:hAnsi="Times New Roman" w:eastAsia="Times New Roman" w:cs="Times New Roman"/>
               <w:highlight w:val="none"/>
             </w:rPr>
           </w:pPr>
-          <w:r/>
           <w:hyperlink w:tooltip="#_Toc7" w:anchor="_Toc7" w:history="1">
-            <w:r>
-              <w:rPr>
-                <w:rStyle w:val="890"/>
-              </w:rPr>
-            </w:r>
             <w:r>
               <w:rPr>
                 <w:rStyle w:val="890"/>
@@ -1059,12 +1185,11 @@
                 <w:rStyle w:val="890"/>
                 <w:rFonts w:ascii="Times New Roman" w:hAnsi="Times New Roman" w:eastAsia="Times New Roman" w:cs="Times New Roman"/>
               </w:rPr>
-              <w:t xml:space="preserve"> </w:t>
+              <w:t xml:space="preserve">2.1.2 – Principaux scénarios et prototypes associés</w:t>
             </w:r>
             <w:r>
               <w:rPr>
                 <w:rStyle w:val="890"/>
-                <w:rFonts w:ascii="Times New Roman" w:hAnsi="Times New Roman" w:eastAsia="Times New Roman" w:cs="Times New Roman"/>
                 <w:highlight w:val="none"/>
               </w:rPr>
             </w:r>
@@ -1075,10 +1200,15 @@
               <w:fldChar w:fldCharType="begin"/>
               <w:instrText xml:space="preserve">PAGEREF _Toc7 \h</w:instrText>
               <w:fldChar w:fldCharType="separate"/>
-              <w:t xml:space="preserve">5</w:t>
+              <w:t xml:space="preserve">4</w:t>
               <w:fldChar w:fldCharType="end"/>
             </w:r>
           </w:hyperlink>
+          <w:r>
+            <w:rPr>
+              <w:highlight w:val="none"/>
+            </w:rPr>
+          </w:r>
           <w:r>
             <w:rPr>
               <w:rFonts w:ascii="Times New Roman" w:hAnsi="Times New Roman" w:eastAsia="Times New Roman" w:cs="Times New Roman"/>
@@ -1091,70 +1221,8 @@
               <w:highlight w:val="none"/>
             </w:rPr>
           </w:r>
-        </w:p>
-        <w:p>
-          <w:pPr>
-            <w:pStyle w:val="893"/>
-            <w:pBdr/>
-            <w:tabs>
-              <w:tab w:val="right" w:leader="dot" w:pos="9355"/>
-            </w:tabs>
-            <w:spacing/>
-            <w:ind/>
-            <w:rPr>
-              <w:rFonts w:ascii="Times New Roman" w:hAnsi="Times New Roman" w:eastAsia="Times New Roman" w:cs="Times New Roman"/>
-              <w:highlight w:val="none"/>
-            </w:rPr>
-          </w:pPr>
-          <w:r/>
-          <w:hyperlink w:tooltip="#_Toc8" w:anchor="_Toc8" w:history="1">
-            <w:r>
-              <w:rPr>
-                <w:rStyle w:val="890"/>
-              </w:rPr>
-            </w:r>
-            <w:r>
-              <w:rPr>
-                <w:rStyle w:val="890"/>
-                <w:rFonts w:ascii="Times New Roman" w:hAnsi="Times New Roman" w:eastAsia="Times New Roman" w:cs="Times New Roman"/>
-              </w:rPr>
-              <w:t xml:space="preserve">IHM</w:t>
-            </w:r>
-            <w:r>
-              <w:rPr>
-                <w:rStyle w:val="890"/>
-                <w:rFonts w:ascii="Times New Roman" w:hAnsi="Times New Roman" w:eastAsia="Times New Roman" w:cs="Times New Roman"/>
-                <w:highlight w:val="none"/>
-              </w:rPr>
-              <w:t xml:space="preserve"> </w:t>
-            </w:r>
-            <w:r>
-              <w:rPr>
-                <w:rStyle w:val="890"/>
-                <w:rFonts w:ascii="Times New Roman" w:hAnsi="Times New Roman" w:eastAsia="Times New Roman" w:cs="Times New Roman"/>
-                <w:highlight w:val="none"/>
-              </w:rPr>
-            </w:r>
-            <w:r>
-              <w:tab/>
-            </w:r>
-            <w:r>
-              <w:fldChar w:fldCharType="begin"/>
-              <w:instrText xml:space="preserve">PAGEREF _Toc8 \h</w:instrText>
-              <w:fldChar w:fldCharType="separate"/>
-              <w:t xml:space="preserve">5</w:t>
-              <w:fldChar w:fldCharType="end"/>
-            </w:r>
-          </w:hyperlink>
           <w:r>
             <w:rPr>
-              <w:rFonts w:ascii="Times New Roman" w:hAnsi="Times New Roman" w:eastAsia="Times New Roman" w:cs="Times New Roman"/>
-              <w:highlight w:val="none"/>
-            </w:rPr>
-          </w:r>
-          <w:r>
-            <w:rPr>
-              <w:rFonts w:ascii="Times New Roman" w:hAnsi="Times New Roman" w:eastAsia="Times New Roman" w:cs="Times New Roman"/>
               <w:highlight w:val="none"/>
             </w:rPr>
           </w:r>
@@ -1170,10 +1238,8 @@
             <w:ind/>
             <w:rPr>
               <w:highlight w:val="none"/>
-              <w14:ligatures w14:val="none"/>
             </w:rPr>
           </w:pPr>
-          <w:r/>
           <w:hyperlink w:tooltip="#_Toc9" w:anchor="_Toc9" w:history="1">
             <w:r>
               <w:rPr>
@@ -1185,13 +1251,12 @@
                 <w:rStyle w:val="890"/>
                 <w:highlight w:val="none"/>
               </w:rPr>
-              <w:t xml:space="preserve">Contraintes diverses exprimées par le demandeur </w:t>
+              <w:t xml:space="preserve">2.2 - Contraintes diverses exprimées par le demandeur </w:t>
             </w:r>
             <w:r>
               <w:rPr>
                 <w:rStyle w:val="890"/>
                 <w:highlight w:val="none"/>
-                <w14:ligatures w14:val="none"/>
               </w:rPr>
             </w:r>
             <w:r>
@@ -1208,13 +1273,6 @@
           <w:r>
             <w:rPr>
               <w:highlight w:val="none"/>
-              <w14:ligatures w14:val="none"/>
-            </w:rPr>
-          </w:r>
-          <w:r>
-            <w:rPr>
-              <w:highlight w:val="none"/>
-              <w14:ligatures w14:val="none"/>
             </w:rPr>
           </w:r>
         </w:p>
@@ -1228,11 +1286,9 @@
             <w:spacing/>
             <w:ind/>
             <w:rPr>
-              <w:rFonts w:ascii="Times New Roman" w:hAnsi="Times New Roman" w:eastAsia="Times New Roman" w:cs="Times New Roman"/>
               <w:highlight w:val="none"/>
             </w:rPr>
           </w:pPr>
-          <w:r/>
           <w:hyperlink w:tooltip="#_Toc10" w:anchor="_Toc10" w:history="1">
             <w:r>
               <w:rPr>
@@ -1242,7 +1298,12 @@
             <w:r>
               <w:rPr>
                 <w:rStyle w:val="890"/>
-                <w:rFonts w:ascii="Times New Roman" w:hAnsi="Times New Roman" w:eastAsia="Times New Roman" w:cs="Times New Roman"/>
+              </w:rPr>
+              <w:t xml:space="preserve">3 – </w:t>
+            </w:r>
+            <w:r>
+              <w:rPr>
+                <w:rStyle w:val="890"/>
                 <w:highlight w:val="none"/>
               </w:rPr>
               <w:t xml:space="preserve">Étude préliminaire</w:t>
@@ -1250,7 +1311,6 @@
             <w:r>
               <w:rPr>
                 <w:rStyle w:val="890"/>
-                <w:rFonts w:ascii="Times New Roman" w:hAnsi="Times New Roman" w:eastAsia="Times New Roman" w:cs="Times New Roman"/>
                 <w:highlight w:val="none"/>
               </w:rPr>
             </w:r>
@@ -1267,13 +1327,6 @@
           </w:hyperlink>
           <w:r>
             <w:rPr>
-              <w:rFonts w:ascii="Times New Roman" w:hAnsi="Times New Roman" w:eastAsia="Times New Roman" w:cs="Times New Roman"/>
-              <w:highlight w:val="none"/>
-            </w:rPr>
-          </w:r>
-          <w:r>
-            <w:rPr>
-              <w:rFonts w:ascii="Times New Roman" w:hAnsi="Times New Roman" w:eastAsia="Times New Roman" w:cs="Times New Roman"/>
               <w:highlight w:val="none"/>
             </w:rPr>
           </w:r>
@@ -1287,11 +1340,8 @@
             </w:tabs>
             <w:spacing/>
             <w:ind/>
-            <w:rPr>
-              <w14:ligatures w14:val="none"/>
-            </w:rPr>
+            <w:rPr/>
           </w:pPr>
-          <w:r/>
           <w:hyperlink w:tooltip="#_Toc11" w:anchor="_Toc11" w:history="1">
             <w:r>
               <w:rPr>
@@ -1301,14 +1351,12 @@
             <w:r>
               <w:rPr>
                 <w:rStyle w:val="890"/>
-                <w:highlight w:val="none"/>
               </w:rPr>
-              <w:t xml:space="preserve">Diagramme de déploiement d’exploitation</w:t>
+              <w:t xml:space="preserve">3.1 – Diagramme de déploiement d’exploitation</w:t>
             </w:r>
             <w:r>
               <w:rPr>
                 <w:rStyle w:val="890"/>
-                <w14:ligatures w14:val="none"/>
               </w:rPr>
             </w:r>
             <w:r>
@@ -1322,14 +1370,58 @@
               <w:fldChar w:fldCharType="end"/>
             </w:r>
           </w:hyperlink>
+          <w:r/>
+        </w:p>
+        <w:p>
+          <w:pPr>
+            <w:pStyle w:val="892"/>
+            <w:pBdr/>
+            <w:tabs>
+              <w:tab w:val="right" w:leader="dot" w:pos="9355"/>
+            </w:tabs>
+            <w:spacing/>
+            <w:ind/>
+            <w:rPr>
+              <w:rFonts w:ascii="Times New Roman" w:hAnsi="Times New Roman" w:eastAsia="Times New Roman" w:cs="Times New Roman"/>
+              <w:highlight w:val="none"/>
+            </w:rPr>
+          </w:pPr>
+          <w:hyperlink w:tooltip="#_Toc12" w:anchor="_Toc12" w:history="1">
+            <w:r>
+              <w:rPr>
+                <w:rStyle w:val="890"/>
+              </w:rPr>
+            </w:r>
+            <w:r>
+              <w:rPr>
+                <w:rStyle w:val="890"/>
+                <w:rFonts w:ascii="Times New Roman" w:hAnsi="Times New Roman" w:eastAsia="Times New Roman" w:cs="Times New Roman"/>
+                <w:highlight w:val="none"/>
+              </w:rPr>
+              <w:t xml:space="preserve">4 – Recettes</w:t>
+            </w:r>
+            <w:r>
+              <w:rPr>
+                <w:rStyle w:val="890"/>
+                <w:rFonts w:ascii="Times New Roman" w:hAnsi="Times New Roman" w:eastAsia="Times New Roman" w:cs="Times New Roman"/>
+                <w:highlight w:val="none"/>
+              </w:rPr>
+            </w:r>
+            <w:r>
+              <w:tab/>
+            </w:r>
+            <w:r>
+              <w:fldChar w:fldCharType="begin"/>
+              <w:instrText xml:space="preserve">PAGEREF _Toc12 \h</w:instrText>
+              <w:fldChar w:fldCharType="separate"/>
+              <w:t xml:space="preserve">8</w:t>
+              <w:fldChar w:fldCharType="end"/>
+            </w:r>
+          </w:hyperlink>
           <w:r>
             <w:rPr>
-              <w14:ligatures w14:val="none"/>
-            </w:rPr>
-          </w:r>
-          <w:r>
-            <w:rPr>
-              <w14:ligatures w14:val="none"/>
+              <w:rFonts w:ascii="Times New Roman" w:hAnsi="Times New Roman" w:eastAsia="Times New Roman" w:cs="Times New Roman"/>
+              <w:highlight w:val="none"/>
             </w:rPr>
           </w:r>
         </w:p>
@@ -1347,6 +1439,7 @@
               <w:highlight w:val="none"/>
             </w:rPr>
           </w:pPr>
+          <w:r/>
           <w:r>
             <w:fldChar w:fldCharType="end"/>
           </w:r>
@@ -1360,16 +1453,7 @@
               <w:highlight w:val="none"/>
             </w:rPr>
           </w:r>
-          <w:r>
-            <w:rPr>
-              <w:rFonts w:ascii="Times New Roman" w:hAnsi="Times New Roman" w:eastAsia="Times New Roman" w:cs="Times New Roman"/>
-              <w:b/>
-              <w:bCs/>
-              <w:sz w:val="48"/>
-              <w:szCs w:val="48"/>
-              <w:highlight w:val="none"/>
-            </w:rPr>
-          </w:r>
+          <w:r/>
         </w:p>
       </w:sdtContent>
     </w:sdt>
@@ -1425,7 +1509,8 @@
         <w:pStyle w:val="845"/>
         <w:pBdr/>
         <w:spacing/>
-        <w:ind/>
+        <w:ind w:right="284" w:firstLine="0" w:left="-709"/>
+        <w:jc w:val="left"/>
         <w:rPr>
           <w:highlight w:val="none"/>
           <w14:ligatures w14:val="none"/>
@@ -1434,40 +1519,61 @@
       <w:r/>
       <w:bookmarkStart w:id="2" w:name="_Toc2"/>
       <w:r>
-        <w:t xml:space="preserve">Contexte du projet </w:t>
+        <w:t xml:space="preserve"> </w:t>
       </w:r>
       <w:r>
         <w:rPr>
-          <w:highlight w:val="none"/>
+          <w:rStyle w:val="855"/>
+          <w:color w:val="1f4f79" w:themeColor="accent1" w:themeShade="80"/>
         </w:rPr>
-        <w:t xml:space="preserve">(</w:t>
-      </w:r>
-      <w:r>
-        <w:t xml:space="preserve">diagramme de contexte</w:t>
+        <w:t xml:space="preserve">1 -  Situation du projet dans son contexte</w:t>
       </w:r>
       <w:r>
         <w:rPr>
-          <w:highlight w:val="none"/>
+          <w:rStyle w:val="855"/>
         </w:rPr>
-        <w:t xml:space="preserve">)</w:t>
+        <w:t xml:space="preserve"> </w:t>
       </w:r>
+      <w:bookmarkEnd w:id="2"/>
+      <w:r/>
       <w:r>
         <w:rPr>
           <w:highlight w:val="none"/>
           <w14:ligatures w14:val="none"/>
         </w:rPr>
       </w:r>
-      <w:bookmarkEnd w:id="2"/>
+    </w:p>
+    <w:p>
+      <w:pPr>
+        <w:pStyle w:val="846"/>
+        <w:pBdr/>
+        <w:spacing/>
+        <w:ind/>
+        <w:rPr>
+          <w:color w:val="1f4f79" w:themeColor="accent1" w:themeShade="80"/>
+          <w14:ligatures w14:val="none"/>
+        </w:rPr>
+      </w:pPr>
+      <w:r/>
+      <w:bookmarkStart w:id="3" w:name="_Toc3"/>
       <w:r>
         <w:rPr>
-          <w:highlight w:val="none"/>
-          <w14:ligatures w14:val="none"/>
+          <w:color w:val="1f4f79" w:themeColor="accent1" w:themeShade="80"/>
         </w:rPr>
+        <w:t xml:space="preserve">1.1  – </w:t>
       </w:r>
       <w:r>
         <w:rPr>
+          <w:color w:val="1f4f79" w:themeColor="accent1" w:themeShade="80"/>
           <w:highlight w:val="none"/>
-          <w14:ligatures w14:val="none"/>
+        </w:rPr>
+        <w:t xml:space="preserve">Introduction du projet</w:t>
+      </w:r>
+      <w:bookmarkEnd w:id="3"/>
+      <w:r/>
+      <w:r>
+        <w:rPr>
+          <w:color w:val="1f4f79" w:themeColor="accent1" w:themeShade="80"/>
         </w:rPr>
       </w:r>
     </w:p>
@@ -1514,12 +1620,12 @@
                   <wp:posOffset>-731468</wp:posOffset>
                 </wp:positionH>
                 <wp:positionV relativeFrom="paragraph">
-                  <wp:posOffset>345752</wp:posOffset>
+                  <wp:posOffset>458861</wp:posOffset>
                 </wp:positionV>
                 <wp:extent cx="7080674" cy="6020014"/>
                 <wp:effectExtent l="0" t="0" r="0" b="0"/>
                 <wp:wrapSquare wrapText="bothSides"/>
-                <wp:docPr id="2" name=""/>
+                <wp:docPr id="3" name=""/>
                 <wp:cNvGraphicFramePr>
                   <a:graphicFrameLocks xmlns:a="http://schemas.openxmlformats.org/drawingml/2006/main" noChangeAspect="1"/>
                 </wp:cNvGraphicFramePr>
@@ -1533,8 +1639,8 @@
                         </pic:cNvPicPr>
                         <pic:nvPr/>
                       </pic:nvPicPr>
-                      <pic:blipFill>
-                        <a:blip r:embed="rId12"/>
+                      <pic:blipFill rotWithShape="1">
+                        <a:blip r:embed="rId13"/>
                         <a:srcRect l="17197" t="0" r="16622" b="0"/>
                         <a:stretch/>
                       </pic:blipFill>
@@ -1574,15 +1680,20 @@
                 <v:path o:extrusionok="f" gradientshapeok="t" o:connecttype="rect"/>
                 <o:lock v:ext="edit" aspectratio="t"/>
               </v:shapetype>
-              <v:shape id="_x0000_i1" o:spid="_x0000_s1" type="#_x0000_t75" style="position:absolute;z-index:3072;o:allowoverlap:true;o:allowincell:true;mso-position-horizontal-relative:text;margin-left:-57.60pt;mso-position-horizontal:absolute;mso-position-vertical-relative:text;margin-top:27.22pt;mso-position-vertical:absolute;width:557.53pt;height:474.02pt;mso-wrap-distance-left:9.07pt;mso-wrap-distance-top:0.00pt;mso-wrap-distance-right:9.07pt;mso-wrap-distance-bottom:0.00pt;z-index:1;" stroked="false">
+              <v:shape id="_x0000_i2" o:spid="_x0000_s2" type="#_x0000_t75" style="position:absolute;z-index:3072;o:allowoverlap:true;o:allowincell:true;mso-position-horizontal-relative:text;margin-left:-57.60pt;mso-position-horizontal:absolute;mso-position-vertical-relative:text;margin-top:36.13pt;mso-position-vertical:absolute;width:557.53pt;height:474.02pt;mso-wrap-distance-left:9.07pt;mso-wrap-distance-top:0.00pt;mso-wrap-distance-right:9.07pt;mso-wrap-distance-bottom:0.00pt;z-index:1;" stroked="false">
                 <w10:wrap type="square"/>
-                <v:imagedata r:id="rId12" o:title="" croptop="0f" cropleft="11270f" cropbottom="0f" cropright="10893f"/>
+                <v:imagedata r:id="rId13" o:title="" croptop="0f" cropleft="11270f" cropbottom="0f" cropright="10893f"/>
                 <o:lock v:ext="edit" rotation="t"/>
               </v:shape>
             </w:pict>
           </mc:Fallback>
         </mc:AlternateContent>
-        <w:br w:type="page" w:clear="all"/>
+      </w:r>
+      <w:r>
+        <w:rPr>
+          <w:highlight w:val="none"/>
+        </w:rPr>
+        <w:t xml:space="preserve">Mr Yohann Avril, gérant de la société Benoit Marais Menuiserie à Valanjou (49) souhaite mettre en œuvre une solution afin de suivre le fonctionnement de son atelier de menuiserie.</w:t>
       </w:r>
       <w:r>
         <w:rPr>
@@ -1607,24 +1718,15 @@
     </w:p>
     <w:p>
       <w:pPr>
-        <w:pStyle w:val="845"/>
-        <w:pBdr/>
+        <w:pBdr/>
+        <w:shd w:val="nil" w:color="000000"/>
         <w:spacing/>
         <w:ind/>
         <w:rPr>
-          <w:rFonts w:ascii="Times New Roman" w:hAnsi="Times New Roman" w:eastAsia="Times New Roman" w:cs="Times New Roman"/>
-          <w:b/>
-          <w:bCs/>
-          <w:sz w:val="48"/>
-          <w:szCs w:val="48"/>
           <w:highlight w:val="none"/>
+          <w14:ligatures w14:val="none"/>
         </w:rPr>
       </w:pPr>
-      <w:r/>
-      <w:bookmarkStart w:id="3" w:name="_Toc3"/>
-      <w:r>
-        <w:t xml:space="preserve">Spécification fonctionnelle</w:t>
-      </w:r>
       <w:r>
         <w:rPr>
           <w:rFonts w:ascii="Times New Roman" w:hAnsi="Times New Roman" w:eastAsia="Times New Roman" w:cs="Times New Roman"/>
@@ -1635,7 +1737,45 @@
           <w:highlight w:val="none"/>
         </w:rPr>
       </w:r>
-      <w:bookmarkEnd w:id="3"/>
+      <w:r>
+        <w:rPr>
+          <w:highlight w:val="none"/>
+        </w:rPr>
+        <w:t xml:space="preserve">La mission principale du système à réaliser est de mettre en place un système de surveillance de la qualité de l’air au niveau des différentes pièces et machines de la menuiserie afin de pouvoir alerter sur un potentiel dépassement des seuils définis par la loi sur cette qualité de l’air. Les différentes sondes relèveront la concentration de particules dans l’air, le taux de TVOC et de CO2.</w:t>
+      </w:r>
+      <w:r>
+        <w:rPr>
+          <w:highlight w:val="none"/>
+        </w:rPr>
+      </w:r>
+    </w:p>
+    <w:p>
+      <w:pPr>
+        <w:pBdr/>
+        <w:shd w:val="nil" w:color="000000"/>
+        <w:spacing/>
+        <w:ind/>
+        <w:rPr>
+          <w:highlight w:val="none"/>
+          <w14:ligatures w14:val="none"/>
+        </w:rPr>
+      </w:pPr>
+      <w:r>
+        <w:rPr>
+          <w:highlight w:val="none"/>
+        </w:rPr>
+        <w:t xml:space="preserve">Le système assurera aussi un suivi sur un site WEB accessible par le gérant sur son poste de travail pour suivre les différentes données relevées et les potentielles alertes activées.</w:t>
+      </w:r>
+      <w:r>
+        <w:rPr>
+          <w:highlight w:val="none"/>
+        </w:rPr>
+      </w:r>
+      <w:r>
+        <w:rPr>
+          <w:highlight w:val="none"/>
+        </w:rPr>
+      </w:r>
       <w:r>
         <w:rPr>
           <w:rFonts w:ascii="Times New Roman" w:hAnsi="Times New Roman" w:eastAsia="Times New Roman" w:cs="Times New Roman"/>
@@ -1656,99 +1796,158 @@
           <w:highlight w:val="none"/>
         </w:rPr>
       </w:r>
-    </w:p>
-    <w:p>
-      <w:pPr>
-        <w:pBdr/>
-        <w:spacing/>
-        <w:ind/>
-        <w:rPr/>
-      </w:pPr>
-      <w:r/>
-      <w:r/>
-    </w:p>
-    <w:p>
-      <w:pPr>
-        <w:pBdr/>
-        <w:spacing/>
-        <w:ind/>
-        <w:rPr/>
-      </w:pPr>
-      <w:r/>
-      <w:r/>
-    </w:p>
-    <w:p>
-      <w:pPr>
-        <w:pBdr/>
-        <w:spacing/>
-        <w:ind/>
-        <w:rPr/>
-      </w:pPr>
-      <w:r/>
-      <w:r/>
-    </w:p>
-    <w:p>
-      <w:pPr>
-        <w:pStyle w:val="846"/>
-        <w:pBdr/>
-        <w:spacing/>
-        <w:ind/>
-        <w:rPr>
-          <w:sz w:val="36"/>
-          <w:szCs w:val="36"/>
-        </w:rPr>
-      </w:pPr>
-      <w:r/>
-      <w:bookmarkStart w:id="4" w:name="_Toc4"/>
       <w:r>
         <w:rPr>
           <w:rFonts w:ascii="Times New Roman" w:hAnsi="Times New Roman" w:eastAsia="Times New Roman" w:cs="Times New Roman"/>
           <w:b/>
           <w:bCs/>
-          <w:sz w:val="36"/>
-          <w:szCs w:val="36"/>
+          <w:sz w:val="48"/>
+          <w:szCs w:val="48"/>
           <w:highlight w:val="none"/>
         </w:rPr>
-        <w:t xml:space="preserve">Diagramme utilisation</w:t>
+      </w:r>
+      <w:r>
+        <w:rPr>
+          <w:highlight w:val="none"/>
+        </w:rPr>
+      </w:r>
+    </w:p>
+    <w:p>
+      <w:pPr>
+        <w:pStyle w:val="845"/>
+        <w:pBdr/>
+        <w:spacing/>
+        <w:ind/>
+        <w:jc w:val="left"/>
+        <w:rPr>
+          <w:rFonts w:ascii="Times New Roman" w:hAnsi="Times New Roman" w:eastAsia="Times New Roman" w:cs="Times New Roman"/>
+          <w:b/>
+          <w:bCs/>
+          <w:color w:val="1f4f79" w:themeColor="accent1" w:themeShade="80"/>
+          <w:sz w:val="48"/>
+          <w:szCs w:val="48"/>
+          <w:highlight w:val="none"/>
+        </w:rPr>
+      </w:pPr>
+      <w:r/>
+      <w:bookmarkStart w:id="4" w:name="_Toc4"/>
+      <w:r>
+        <w:rPr>
+          <w:color w:val="1f4f79" w:themeColor="accent1" w:themeShade="80"/>
+        </w:rPr>
+        <w:t xml:space="preserve">2 - Spécification fonctionnelle</w:t>
       </w:r>
       <w:r>
         <w:rPr>
           <w:rFonts w:ascii="Times New Roman" w:hAnsi="Times New Roman" w:eastAsia="Times New Roman" w:cs="Times New Roman"/>
           <w:b/>
           <w:bCs/>
-          <w:sz w:val="36"/>
-          <w:szCs w:val="36"/>
+          <w:color w:val="1f4f79" w:themeColor="accent1" w:themeShade="80"/>
+          <w:sz w:val="48"/>
+          <w:szCs w:val="48"/>
           <w:highlight w:val="none"/>
-        </w:rPr>
-        <w:t xml:space="preserve"> :</w:t>
-      </w:r>
-      <w:r>
-        <w:rPr>
-          <w:sz w:val="36"/>
-          <w:szCs w:val="36"/>
         </w:rPr>
       </w:r>
       <w:bookmarkEnd w:id="4"/>
       <w:r>
         <w:rPr>
-          <w:sz w:val="36"/>
-          <w:szCs w:val="36"/>
+          <w:color w:val="1f4f79" w:themeColor="accent1" w:themeShade="80"/>
         </w:rPr>
       </w:r>
       <w:r>
         <w:rPr>
-          <w:sz w:val="36"/>
-          <w:szCs w:val="36"/>
+          <w:rFonts w:ascii="Times New Roman" w:hAnsi="Times New Roman" w:eastAsia="Times New Roman" w:cs="Times New Roman"/>
+          <w:b/>
+          <w:bCs/>
+          <w:color w:val="1f4f79" w:themeColor="accent1" w:themeShade="80"/>
+          <w:sz w:val="48"/>
+          <w:szCs w:val="48"/>
+          <w:highlight w:val="none"/>
         </w:rPr>
       </w:r>
     </w:p>
     <w:p>
       <w:pPr>
-        <w:pBdr/>
-        <w:spacing/>
-        <w:ind/>
-        <w:rPr/>
-      </w:pPr>
+        <w:pStyle w:val="846"/>
+        <w:pBdr/>
+        <w:spacing/>
+        <w:ind/>
+        <w:rPr>
+          <w:color w:val="1f4f79" w:themeColor="accent1" w:themeShade="80"/>
+          <w14:ligatures w14:val="none"/>
+        </w:rPr>
+      </w:pPr>
+      <w:r/>
+      <w:bookmarkStart w:id="5" w:name="_Toc5"/>
+      <w:r>
+        <w:rPr>
+          <w:color w:val="1f4f79" w:themeColor="accent1" w:themeShade="80"/>
+          <w:highlight w:val="none"/>
+        </w:rPr>
+        <w:t xml:space="preserve">2.1 – Diagramme des cas d’utilisation</w:t>
+      </w:r>
+      <w:bookmarkEnd w:id="5"/>
+      <w:r>
+        <w:rPr>
+          <w:color w:val="1f4f79" w:themeColor="accent1" w:themeShade="80"/>
+        </w:rPr>
+      </w:r>
+      <w:r>
+        <w:rPr>
+          <w:color w:val="1f4f79" w:themeColor="accent1" w:themeShade="80"/>
+        </w:rPr>
+      </w:r>
+    </w:p>
+    <w:p>
+      <w:pPr>
+        <w:pStyle w:val="847"/>
+        <w:pBdr/>
+        <w:spacing/>
+        <w:ind/>
+        <w:rPr>
+          <w:rFonts w:ascii="Times New Roman" w:hAnsi="Times New Roman" w:cs="Times New Roman"/>
+          <w:color w:val="1f4f79" w:themeColor="accent1" w:themeShade="80"/>
+          <w14:ligatures w14:val="none"/>
+        </w:rPr>
+      </w:pPr>
+      <w:r/>
+      <w:bookmarkStart w:id="6" w:name="_Toc6"/>
+      <w:r>
+        <w:rPr>
+          <w:rFonts w:ascii="Times New Roman" w:hAnsi="Times New Roman" w:eastAsia="Times New Roman" w:cs="Times New Roman"/>
+          <w:color w:val="1f4f79" w:themeColor="accent1" w:themeShade="80"/>
+          <w:highlight w:val="none"/>
+        </w:rPr>
+        <w:t xml:space="preserve">2.1.1 – Description des cas d’utilisation</w:t>
+      </w:r>
+      <w:r>
+        <w:rPr>
+          <w:color w:val="1f4f79" w:themeColor="accent1" w:themeShade="80"/>
+        </w:rPr>
+      </w:r>
+      <w:bookmarkEnd w:id="6"/>
+      <w:r>
+        <w:rPr>
+          <w:color w:val="1f4f79" w:themeColor="accent1" w:themeShade="80"/>
+        </w:rPr>
+      </w:r>
+      <w:r>
+        <w:rPr>
+          <w:rFonts w:ascii="Times New Roman" w:hAnsi="Times New Roman" w:cs="Times New Roman"/>
+          <w:color w:val="1f4f79" w:themeColor="accent1" w:themeShade="80"/>
+        </w:rPr>
+      </w:r>
+    </w:p>
+    <w:p>
+      <w:pPr>
+        <w:pBdr/>
+        <w:spacing/>
+        <w:ind/>
+        <w:rPr>
+          <w14:ligatures w14:val="none"/>
+        </w:rPr>
+      </w:pPr>
+      <w:r/>
       <w:r>
         <mc:AlternateContent>
           <mc:Choice Requires="wpg">
@@ -1759,12 +1958,12 @@
                   <wp:posOffset>-911647</wp:posOffset>
                 </wp:positionH>
                 <wp:positionV relativeFrom="paragraph">
-                  <wp:posOffset>0</wp:posOffset>
+                  <wp:posOffset>234392</wp:posOffset>
                 </wp:positionV>
                 <wp:extent cx="7077102" cy="3580296"/>
                 <wp:effectExtent l="0" t="0" r="0" b="0"/>
                 <wp:wrapSquare wrapText="bothSides"/>
-                <wp:docPr id="3" name=""/>
+                <wp:docPr id="4" name=""/>
                 <wp:cNvGraphicFramePr>
                   <a:graphicFrameLocks xmlns:a="http://schemas.openxmlformats.org/drawingml/2006/main" noChangeAspect="1"/>
                 </wp:cNvGraphicFramePr>
@@ -1772,20 +1971,20 @@
                   <a:graphicData uri="http://schemas.openxmlformats.org/drawingml/2006/picture">
                     <pic:pic xmlns:pic="http://schemas.openxmlformats.org/drawingml/2006/picture">
                       <pic:nvPicPr>
-                        <pic:cNvPr id="2097838175" name=""/>
+                        <pic:cNvPr id="2056197915" name=""/>
                         <pic:cNvPicPr>
                           <a:picLocks noChangeAspect="1"/>
                         </pic:cNvPicPr>
                         <pic:nvPr/>
                       </pic:nvPicPr>
-                      <pic:blipFill>
-                        <a:blip r:embed="rId13"/>
+                      <pic:blipFill rotWithShape="1">
+                        <a:blip r:embed="rId14"/>
                         <a:stretch/>
                       </pic:blipFill>
                       <pic:spPr bwMode="auto">
                         <a:xfrm flipH="0" flipV="0">
                           <a:off x="0" y="0"/>
-                          <a:ext cx="7077100" cy="3580295"/>
+                          <a:ext cx="7077099" cy="3580294"/>
                         </a:xfrm>
                         <a:prstGeom prst="rect">
                           <a:avLst/>
@@ -1818,31 +2017,35 @@
                 <v:path o:extrusionok="f" gradientshapeok="t" o:connecttype="rect"/>
                 <o:lock v:ext="edit" aspectratio="t"/>
               </v:shapetype>
-              <v:shape id="_x0000_i2" o:spid="_x0000_s2" type="#_x0000_t75" style="position:absolute;z-index:12288;o:allowoverlap:true;o:allowincell:true;mso-position-horizontal-relative:text;margin-left:-71.78pt;mso-position-horizontal:absolute;mso-position-vertical-relative:text;margin-top:0.00pt;mso-position-vertical:absolute;width:557.25pt;height:281.91pt;mso-wrap-distance-left:9.07pt;mso-wrap-distance-top:0.00pt;mso-wrap-distance-right:9.07pt;mso-wrap-distance-bottom:0.00pt;z-index:1;" stroked="false">
+              <v:shape id="_x0000_i3" o:spid="_x0000_s3" type="#_x0000_t75" style="position:absolute;z-index:12288;o:allowoverlap:true;o:allowincell:true;mso-position-horizontal-relative:text;margin-left:-71.78pt;mso-position-horizontal:absolute;mso-position-vertical-relative:text;margin-top:18.46pt;mso-position-vertical:absolute;width:557.25pt;height:281.91pt;mso-wrap-distance-left:9.07pt;mso-wrap-distance-top:0.00pt;mso-wrap-distance-right:9.07pt;mso-wrap-distance-bottom:0.00pt;z-index:1;" stroked="false">
                 <w10:wrap type="square"/>
-                <v:imagedata r:id="rId13" o:title=""/>
+                <v:imagedata r:id="rId14" o:title=""/>
                 <o:lock v:ext="edit" rotation="t"/>
               </v:shape>
             </w:pict>
           </mc:Fallback>
         </mc:AlternateContent>
       </w:r>
+      <w:r>
+        <w:t xml:space="preserve">Diagramme de cas d’utilisation du projet :</w:t>
+      </w:r>
+      <w:r>
+        <w:rPr>
+          <w:rFonts w:ascii="Times New Roman" w:hAnsi="Times New Roman" w:cs="Times New Roman"/>
+          <w:color w:val="auto"/>
+        </w:rPr>
+      </w:r>
       <w:r/>
     </w:p>
     <w:p>
       <w:pPr>
-        <w:pStyle w:val="846"/>
         <w:pBdr/>
         <w:spacing/>
         <w:ind/>
         <w:rPr/>
       </w:pPr>
       <w:r/>
-      <w:bookmarkStart w:id="5" w:name="_Toc5"/>
-      <w:r>
-        <w:t xml:space="preserve">Tableau description diagramme d’utilisation : </w:t>
-      </w:r>
-      <w:bookmarkEnd w:id="5"/>
+      <w:r/>
       <w:r/>
       <w:r/>
     </w:p>
@@ -1858,12 +2061,56 @@
     </w:p>
     <w:p>
       <w:pPr>
+        <w:pStyle w:val="847"/>
+        <w:pBdr/>
+        <w:spacing/>
+        <w:ind/>
+        <w:rPr>
+          <w:color w:val="1f4f79" w:themeColor="accent1" w:themeShade="80"/>
+          <w:highlight w:val="none"/>
+        </w:rPr>
+      </w:pPr>
+      <w:r>
+        <w:rPr>
+          <w:color w:val="1f4f79" w:themeColor="accent1" w:themeShade="80"/>
+        </w:rPr>
+      </w:r>
+      <w:bookmarkStart w:id="7" w:name="_Toc7"/>
+      <w:r>
+        <w:rPr>
+          <w:rFonts w:ascii="Times New Roman" w:hAnsi="Times New Roman" w:eastAsia="Times New Roman" w:cs="Times New Roman"/>
+          <w:color w:val="1f4f79" w:themeColor="accent1" w:themeShade="80"/>
+        </w:rPr>
+        <w:t xml:space="preserve">2.1.2 – Principaux scénarios et prototypes associés</w:t>
+      </w:r>
+      <w:r>
+        <w:rPr>
+          <w:color w:val="1f4f79" w:themeColor="accent1" w:themeShade="80"/>
+        </w:rPr>
+      </w:r>
+      <w:bookmarkEnd w:id="7"/>
+      <w:r>
+        <w:rPr>
+          <w:color w:val="1f4f79" w:themeColor="accent1" w:themeShade="80"/>
+        </w:rPr>
+      </w:r>
+      <w:r>
+        <w:rPr>
+          <w:color w:val="1f4f79" w:themeColor="accent1" w:themeShade="80"/>
+          <w:highlight w:val="none"/>
+        </w:rPr>
+      </w:r>
+    </w:p>
+    <w:p>
+      <w:pPr>
         <w:pBdr/>
         <w:spacing/>
         <w:ind/>
         <w:rPr/>
       </w:pPr>
-      <w:r/>
+      <w:r>
+        <w:t xml:space="preserve">Tableau de la description du diagramme d’utilisation :</w:t>
+      </w:r>
       <w:r/>
     </w:p>
     <w:tbl>
@@ -4565,24 +4812,23 @@
     </w:p>
     <w:p>
       <w:pPr>
-        <w:pStyle w:val="846"/>
         <w:pBdr/>
         <w:spacing/>
         <w:ind/>
         <w:rPr>
+          <w:highlight w:val="none"/>
           <w14:ligatures w14:val="none"/>
         </w:rPr>
       </w:pPr>
-      <w:r/>
-      <w:bookmarkStart w:id="6" w:name="_Toc6"/>
-      <w:r>
-        <w:t xml:space="preserve">Scénarios associés</w:t>
-      </w:r>
-      <w:bookmarkEnd w:id="6"/>
-      <w:r/>
       <w:r>
         <w:rPr>
-          <w14:ligatures w14:val="none"/>
+          <w:highlight w:val="none"/>
+        </w:rPr>
+        <w:t xml:space="preserve">Scénario du projet, diagramme d’activité :</w:t>
+      </w:r>
+      <w:r>
+        <w:rPr>
+          <w:highlight w:val="none"/>
         </w:rPr>
       </w:r>
     </w:p>
@@ -4602,7 +4848,7 @@
         </w:rPr>
       </w:pPr>
       <w:r/>
-      <w:bookmarkStart w:id="7" w:name="_Toc7"/>
+      <w:bookmarkStart w:id="8" w:name="_Toc8"/>
       <w:r>
         <mc:AlternateContent>
           <mc:Choice Requires="wpg">
@@ -4610,7 +4856,7 @@
               <wp:inline xmlns:wp="http://schemas.openxmlformats.org/drawingml/2006/wordprocessingDrawing" distT="0" distB="0" distL="0" distR="0">
                 <wp:extent cx="6348435" cy="3612539"/>
                 <wp:effectExtent l="0" t="0" r="0" b="0"/>
-                <wp:docPr id="4" name=""/>
+                <wp:docPr id="5" name=""/>
                 <wp:cNvGraphicFramePr>
                   <a:graphicFrameLocks xmlns:a="http://schemas.openxmlformats.org/drawingml/2006/main" noChangeAspect="1"/>
                 </wp:cNvGraphicFramePr>
@@ -4624,8 +4870,8 @@
                         </pic:cNvPicPr>
                         <pic:nvPr/>
                       </pic:nvPicPr>
-                      <pic:blipFill>
-                        <a:blip r:embed="rId14"/>
+                      <pic:blipFill rotWithShape="1">
+                        <a:blip r:embed="rId15"/>
                         <a:stretch/>
                       </pic:blipFill>
                       <pic:spPr bwMode="auto">
@@ -4664,8 +4910,8 @@
                 <v:path o:extrusionok="f" gradientshapeok="t" o:connecttype="rect"/>
                 <o:lock v:ext="edit" aspectratio="t"/>
               </v:shapetype>
-              <v:shape id="_x0000_i3" o:spid="_x0000_s3" type="#_x0000_t75" style="width:499.88pt;height:284.45pt;mso-wrap-distance-left:0.00pt;mso-wrap-distance-top:0.00pt;mso-wrap-distance-right:0.00pt;mso-wrap-distance-bottom:0.00pt;z-index:1;" stroked="false">
-                <v:imagedata r:id="rId14" o:title=""/>
+              <v:shape id="_x0000_i4" o:spid="_x0000_s4" type="#_x0000_t75" style="width:499.88pt;height:284.45pt;mso-wrap-distance-left:0.00pt;mso-wrap-distance-top:0.00pt;mso-wrap-distance-right:0.00pt;mso-wrap-distance-bottom:0.00pt;z-index:1;" stroked="false">
+                <v:imagedata r:id="rId15" o:title=""/>
                 <o:lock v:ext="edit" rotation="t"/>
               </v:shape>
             </w:pict>
@@ -4689,17 +4935,8 @@
           <w:highlight w:val="none"/>
         </w:rPr>
       </w:r>
-      <w:bookmarkEnd w:id="7"/>
-      <w:r>
-        <w:rPr>
-          <w:rFonts w:ascii="Times New Roman" w:hAnsi="Times New Roman" w:eastAsia="Times New Roman" w:cs="Times New Roman"/>
-          <w:b/>
-          <w:bCs/>
-          <w:sz w:val="48"/>
-          <w:szCs w:val="48"/>
-          <w:highlight w:val="none"/>
-        </w:rPr>
-      </w:r>
+      <w:bookmarkEnd w:id="8"/>
+      <w:r/>
       <w:r>
         <w:rPr>
           <w:rFonts w:ascii="Times New Roman" w:hAnsi="Times New Roman" w:eastAsia="Times New Roman" w:cs="Times New Roman"/>
@@ -4713,7 +4950,6 @@
     </w:p>
     <w:p>
       <w:pPr>
-        <w:pStyle w:val="846"/>
         <w:pBdr/>
         <w:spacing/>
         <w:ind/>
@@ -4727,7 +4963,6 @@
         </w:rPr>
       </w:pPr>
       <w:r/>
-      <w:bookmarkStart w:id="8" w:name="_Toc8"/>
       <w:r>
         <mc:AlternateContent>
           <mc:Choice Requires="wpg">
@@ -4738,7 +4973,7 @@
                   <wp:posOffset>-360045</wp:posOffset>
                 </wp:positionH>
                 <wp:positionV relativeFrom="paragraph">
-                  <wp:posOffset>530679</wp:posOffset>
+                  <wp:posOffset>250882</wp:posOffset>
                 </wp:positionV>
                 <wp:extent cx="3567150" cy="2675363"/>
                 <wp:effectExtent l="0" t="0" r="0" b="0"/>
@@ -4750,7 +4985,7 @@
                     <wp:lineTo x="0" y="21600"/>
                   </wp:wrapPolygon>
                 </wp:wrapTight>
-                <wp:docPr id="5" name=""/>
+                <wp:docPr id="6" name=""/>
                 <wp:cNvGraphicFramePr>
                   <a:graphicFrameLocks xmlns:a="http://schemas.openxmlformats.org/drawingml/2006/main" noChangeAspect="1"/>
                 </wp:cNvGraphicFramePr>
@@ -4764,8 +4999,8 @@
                         </pic:cNvPicPr>
                         <pic:nvPr/>
                       </pic:nvPicPr>
-                      <pic:blipFill>
-                        <a:blip r:embed="rId15"/>
+                      <pic:blipFill rotWithShape="1">
+                        <a:blip r:embed="rId16"/>
                         <a:stretch/>
                       </pic:blipFill>
                       <pic:spPr bwMode="auto">
@@ -4804,9 +5039,9 @@
                 <v:path o:extrusionok="f" gradientshapeok="t" o:connecttype="rect"/>
                 <o:lock v:ext="edit" aspectratio="t"/>
               </v:shapetype>
-              <v:shape id="_x0000_i4" o:spid="_x0000_s4" type="#_x0000_t75" style="position:absolute;z-index:15360;o:allowoverlap:true;o:allowincell:true;mso-position-horizontal-relative:text;margin-left:-28.35pt;mso-position-horizontal:absolute;mso-position-vertical-relative:text;margin-top:41.79pt;mso-position-vertical:absolute;width:280.88pt;height:210.66pt;mso-wrap-distance-left:9.07pt;mso-wrap-distance-top:0.00pt;mso-wrap-distance-right:9.07pt;mso-wrap-distance-bottom:0.00pt;z-index:1;" wrapcoords="0 0 100000 0 100000 100000 0 100000" stroked="false">
+              <v:shape id="_x0000_i5" o:spid="_x0000_s5" type="#_x0000_t75" style="position:absolute;z-index:15360;o:allowoverlap:true;o:allowincell:true;mso-position-horizontal-relative:text;margin-left:-28.35pt;mso-position-horizontal:absolute;mso-position-vertical-relative:text;margin-top:19.75pt;mso-position-vertical:absolute;width:280.88pt;height:210.66pt;mso-wrap-distance-left:9.07pt;mso-wrap-distance-top:0.00pt;mso-wrap-distance-right:9.07pt;mso-wrap-distance-bottom:0.00pt;z-index:1;" wrapcoords="0 0 100000 0 100000 100000 0 100000" stroked="false">
                 <w10:wrap type="tight"/>
-                <v:imagedata r:id="rId15" o:title=""/>
+                <v:imagedata r:id="rId16" o:title=""/>
                 <o:lock v:ext="edit" rotation="t"/>
               </v:shape>
             </w:pict>
@@ -4815,33 +5050,10 @@
       </w:r>
       <w:r>
         <w:rPr>
-          <w:rStyle w:val="856"/>
-          <w:rFonts w:ascii="Times New Roman" w:hAnsi="Times New Roman" w:eastAsia="Times New Roman" w:cs="Times New Roman"/>
-        </w:rPr>
-        <w:t xml:space="preserve">IHM</w:t>
-      </w:r>
-      <w:r>
-        <w:rPr>
-          <w:rFonts w:ascii="Times New Roman" w:hAnsi="Times New Roman" w:eastAsia="Times New Roman" w:cs="Times New Roman"/>
-          <w:b/>
-          <w:bCs/>
-          <w:sz w:val="48"/>
-          <w:szCs w:val="48"/>
           <w:highlight w:val="none"/>
         </w:rPr>
-        <w:br w:type="page" w:clear="all"/>
+        <w:t xml:space="preserve">Prototype IHM :</w:t>
       </w:r>
-      <w:r>
-        <w:rPr>
-          <w:rFonts w:ascii="Times New Roman" w:hAnsi="Times New Roman" w:eastAsia="Times New Roman" w:cs="Times New Roman"/>
-          <w:b/>
-          <w:bCs/>
-          <w:sz w:val="48"/>
-          <w:szCs w:val="48"/>
-          <w:highlight w:val="none"/>
-        </w:rPr>
-      </w:r>
-      <w:bookmarkEnd w:id="8"/>
       <w:r>
         <w:rPr>
           <w:rFonts w:ascii="Times New Roman" w:hAnsi="Times New Roman" w:eastAsia="Times New Roman" w:cs="Times New Roman"/>
@@ -4865,40 +5077,32 @@
     </w:p>
     <w:p>
       <w:pPr>
-        <w:pStyle w:val="846"/>
-        <w:pBdr/>
-        <w:spacing/>
-        <w:ind/>
+        <w:pBdr/>
+        <w:spacing/>
+        <w:ind w:left="0"/>
         <w:rPr>
           <w:highlight w:val="none"/>
           <w14:ligatures w14:val="none"/>
         </w:rPr>
       </w:pPr>
-      <w:r/>
-      <w:bookmarkStart w:id="9" w:name="_Toc9"/>
       <w:r>
         <w:rPr>
+          <w:rFonts w:ascii="Times New Roman" w:hAnsi="Times New Roman" w:eastAsia="Times New Roman" w:cs="Times New Roman"/>
+          <w:b/>
+          <w:bCs/>
+          <w:sz w:val="48"/>
+          <w:szCs w:val="48"/>
           <w:highlight w:val="none"/>
-        </w:rPr>
-        <w:t xml:space="preserve">Contraintes diverses exprimées par le demandeur </w:t>
-      </w:r>
-      <w:r>
-        <w:rPr>
-          <w:highlight w:val="none"/>
-          <w14:ligatures w14:val="none"/>
-        </w:rPr>
-      </w:r>
-      <w:bookmarkEnd w:id="9"/>
-      <w:r>
-        <w:rPr>
-          <w:highlight w:val="none"/>
-          <w14:ligatures w14:val="none"/>
         </w:rPr>
       </w:r>
       <w:r>
         <w:rPr>
           <w:highlight w:val="none"/>
-          <w14:ligatures w14:val="none"/>
+        </w:rPr>
+      </w:r>
+      <w:r>
+        <w:rPr>
+          <w:highlight w:val="none"/>
         </w:rPr>
       </w:r>
     </w:p>
@@ -4907,9 +5111,330 @@
         <w:pBdr/>
         <w:spacing/>
         <w:ind/>
+        <w:rPr>
+          <w:rFonts w:ascii="Times New Roman" w:hAnsi="Times New Roman" w:eastAsia="Times New Roman" w:cs="Times New Roman"/>
+          <w:b/>
+          <w:bCs/>
+          <w:sz w:val="48"/>
+          <w:szCs w:val="48"/>
+          <w:highlight w:val="none"/>
+        </w:rPr>
+      </w:pPr>
+      <w:r>
+        <w:rPr>
+          <w:rFonts w:ascii="Times New Roman" w:hAnsi="Times New Roman" w:eastAsia="Times New Roman" w:cs="Times New Roman"/>
+          <w:b/>
+          <w:bCs/>
+          <w:sz w:val="48"/>
+          <w:szCs w:val="48"/>
+          <w:highlight w:val="none"/>
+        </w:rPr>
+      </w:r>
+      <w:r>
+        <w:rPr>
+          <w:rFonts w:ascii="Times New Roman" w:hAnsi="Times New Roman" w:eastAsia="Times New Roman" w:cs="Times New Roman"/>
+          <w:b/>
+          <w:bCs/>
+          <w:sz w:val="48"/>
+          <w:szCs w:val="48"/>
+          <w:highlight w:val="none"/>
+        </w:rPr>
+      </w:r>
+      <w:r>
+        <w:rPr>
+          <w:rFonts w:ascii="Times New Roman" w:hAnsi="Times New Roman" w:eastAsia="Times New Roman" w:cs="Times New Roman"/>
+          <w:b/>
+          <w:bCs/>
+          <w:sz w:val="48"/>
+          <w:szCs w:val="48"/>
+          <w:highlight w:val="none"/>
+        </w:rPr>
+      </w:r>
+    </w:p>
+    <w:p>
+      <w:pPr>
+        <w:pBdr/>
+        <w:spacing/>
+        <w:ind/>
+        <w:rPr>
+          <w:rFonts w:ascii="Times New Roman" w:hAnsi="Times New Roman" w:eastAsia="Times New Roman" w:cs="Times New Roman"/>
+          <w:b/>
+          <w:bCs/>
+          <w:sz w:val="48"/>
+          <w:szCs w:val="48"/>
+          <w:highlight w:val="none"/>
+        </w:rPr>
+      </w:pPr>
+      <w:r>
+        <w:rPr>
+          <w:rFonts w:ascii="Times New Roman" w:hAnsi="Times New Roman" w:eastAsia="Times New Roman" w:cs="Times New Roman"/>
+          <w:b/>
+          <w:bCs/>
+          <w:sz w:val="48"/>
+          <w:szCs w:val="48"/>
+          <w:highlight w:val="none"/>
+        </w:rPr>
+      </w:r>
+      <w:r>
+        <w:rPr>
+          <w:rFonts w:ascii="Times New Roman" w:hAnsi="Times New Roman" w:eastAsia="Times New Roman" w:cs="Times New Roman"/>
+          <w:b/>
+          <w:bCs/>
+          <w:sz w:val="48"/>
+          <w:szCs w:val="48"/>
+          <w:highlight w:val="none"/>
+        </w:rPr>
+      </w:r>
+      <w:r>
+        <w:rPr>
+          <w:rFonts w:ascii="Times New Roman" w:hAnsi="Times New Roman" w:eastAsia="Times New Roman" w:cs="Times New Roman"/>
+          <w:b/>
+          <w:bCs/>
+          <w:sz w:val="48"/>
+          <w:szCs w:val="48"/>
+          <w:highlight w:val="none"/>
+        </w:rPr>
+      </w:r>
+    </w:p>
+    <w:p>
+      <w:pPr>
+        <w:pBdr/>
+        <w:spacing/>
+        <w:ind/>
+        <w:rPr>
+          <w:rFonts w:ascii="Times New Roman" w:hAnsi="Times New Roman" w:eastAsia="Times New Roman" w:cs="Times New Roman"/>
+          <w:b/>
+          <w:bCs/>
+          <w:sz w:val="48"/>
+          <w:szCs w:val="48"/>
+          <w:highlight w:val="none"/>
+        </w:rPr>
+      </w:pPr>
+      <w:r>
+        <w:rPr>
+          <w:rFonts w:ascii="Times New Roman" w:hAnsi="Times New Roman" w:eastAsia="Times New Roman" w:cs="Times New Roman"/>
+          <w:b/>
+          <w:bCs/>
+          <w:sz w:val="48"/>
+          <w:szCs w:val="48"/>
+          <w:highlight w:val="none"/>
+        </w:rPr>
+      </w:r>
+      <w:r>
+        <w:rPr>
+          <w:rFonts w:ascii="Times New Roman" w:hAnsi="Times New Roman" w:eastAsia="Times New Roman" w:cs="Times New Roman"/>
+          <w:b/>
+          <w:bCs/>
+          <w:sz w:val="48"/>
+          <w:szCs w:val="48"/>
+          <w:highlight w:val="none"/>
+        </w:rPr>
+      </w:r>
+      <w:r>
+        <w:rPr>
+          <w:rFonts w:ascii="Times New Roman" w:hAnsi="Times New Roman" w:eastAsia="Times New Roman" w:cs="Times New Roman"/>
+          <w:b/>
+          <w:bCs/>
+          <w:sz w:val="48"/>
+          <w:szCs w:val="48"/>
+          <w:highlight w:val="none"/>
+        </w:rPr>
+      </w:r>
+    </w:p>
+    <w:p>
+      <w:pPr>
+        <w:pBdr/>
+        <w:spacing/>
+        <w:ind/>
+        <w:rPr>
+          <w:rFonts w:ascii="Times New Roman" w:hAnsi="Times New Roman" w:eastAsia="Times New Roman" w:cs="Times New Roman"/>
+          <w:b/>
+          <w:bCs/>
+          <w:sz w:val="48"/>
+          <w:szCs w:val="48"/>
+          <w:highlight w:val="none"/>
+        </w:rPr>
+      </w:pPr>
+      <w:r>
+        <w:rPr>
+          <w:rFonts w:ascii="Times New Roman" w:hAnsi="Times New Roman" w:eastAsia="Times New Roman" w:cs="Times New Roman"/>
+          <w:b/>
+          <w:bCs/>
+          <w:sz w:val="48"/>
+          <w:szCs w:val="48"/>
+          <w:highlight w:val="none"/>
+        </w:rPr>
+      </w:r>
+      <w:r>
+        <w:rPr>
+          <w:rFonts w:ascii="Times New Roman" w:hAnsi="Times New Roman" w:eastAsia="Times New Roman" w:cs="Times New Roman"/>
+          <w:b/>
+          <w:bCs/>
+          <w:sz w:val="48"/>
+          <w:szCs w:val="48"/>
+          <w:highlight w:val="none"/>
+        </w:rPr>
+      </w:r>
+      <w:r>
+        <w:rPr>
+          <w:rFonts w:ascii="Times New Roman" w:hAnsi="Times New Roman" w:eastAsia="Times New Roman" w:cs="Times New Roman"/>
+          <w:b/>
+          <w:bCs/>
+          <w:sz w:val="48"/>
+          <w:szCs w:val="48"/>
+          <w:highlight w:val="none"/>
+        </w:rPr>
+      </w:r>
+    </w:p>
+    <w:p>
+      <w:pPr>
+        <w:pBdr/>
+        <w:spacing/>
+        <w:ind/>
+        <w:rPr>
+          <w:rFonts w:ascii="Times New Roman" w:hAnsi="Times New Roman" w:eastAsia="Times New Roman" w:cs="Times New Roman"/>
+          <w:b/>
+          <w:bCs/>
+          <w:sz w:val="48"/>
+          <w:szCs w:val="48"/>
+          <w:highlight w:val="none"/>
+        </w:rPr>
+      </w:pPr>
+      <w:r>
+        <w:rPr>
+          <w:rFonts w:ascii="Times New Roman" w:hAnsi="Times New Roman" w:eastAsia="Times New Roman" w:cs="Times New Roman"/>
+          <w:b/>
+          <w:bCs/>
+          <w:sz w:val="48"/>
+          <w:szCs w:val="48"/>
+          <w:highlight w:val="none"/>
+        </w:rPr>
+      </w:r>
+      <w:r>
+        <w:rPr>
+          <w:rFonts w:ascii="Times New Roman" w:hAnsi="Times New Roman" w:eastAsia="Times New Roman" w:cs="Times New Roman"/>
+          <w:b/>
+          <w:bCs/>
+          <w:sz w:val="48"/>
+          <w:szCs w:val="48"/>
+          <w:highlight w:val="none"/>
+        </w:rPr>
+      </w:r>
+      <w:r>
+        <w:rPr>
+          <w:rFonts w:ascii="Times New Roman" w:hAnsi="Times New Roman" w:eastAsia="Times New Roman" w:cs="Times New Roman"/>
+          <w:b/>
+          <w:bCs/>
+          <w:sz w:val="48"/>
+          <w:szCs w:val="48"/>
+          <w:highlight w:val="none"/>
+        </w:rPr>
+      </w:r>
+    </w:p>
+    <w:p>
+      <w:pPr>
+        <w:pBdr/>
+        <w:spacing/>
+        <w:ind/>
+        <w:rPr>
+          <w:rFonts w:ascii="Times New Roman" w:hAnsi="Times New Roman" w:eastAsia="Times New Roman" w:cs="Times New Roman"/>
+          <w:b/>
+          <w:bCs/>
+          <w:sz w:val="48"/>
+          <w:szCs w:val="48"/>
+          <w:highlight w:val="none"/>
+        </w:rPr>
+      </w:pPr>
+      <w:r>
+        <w:rPr>
+          <w:rFonts w:ascii="Times New Roman" w:hAnsi="Times New Roman" w:eastAsia="Times New Roman" w:cs="Times New Roman"/>
+          <w:b/>
+          <w:bCs/>
+          <w:sz w:val="48"/>
+          <w:szCs w:val="48"/>
+          <w:highlight w:val="none"/>
+        </w:rPr>
+      </w:r>
+      <w:r>
+        <w:rPr>
+          <w:rFonts w:ascii="Times New Roman" w:hAnsi="Times New Roman" w:eastAsia="Times New Roman" w:cs="Times New Roman"/>
+          <w:b/>
+          <w:bCs/>
+          <w:sz w:val="48"/>
+          <w:szCs w:val="48"/>
+          <w:highlight w:val="none"/>
+        </w:rPr>
+      </w:r>
+      <w:r>
+        <w:rPr>
+          <w:rFonts w:ascii="Times New Roman" w:hAnsi="Times New Roman" w:eastAsia="Times New Roman" w:cs="Times New Roman"/>
+          <w:b/>
+          <w:bCs/>
+          <w:sz w:val="48"/>
+          <w:szCs w:val="48"/>
+          <w:highlight w:val="none"/>
+        </w:rPr>
+      </w:r>
+      <w:r>
+        <w:rPr>
+          <w:rFonts w:ascii="Times New Roman" w:hAnsi="Times New Roman" w:eastAsia="Times New Roman" w:cs="Times New Roman"/>
+          <w:b/>
+          <w:bCs/>
+          <w:sz w:val="48"/>
+          <w:szCs w:val="48"/>
+          <w:highlight w:val="none"/>
+        </w:rPr>
+      </w:r>
+    </w:p>
+    <w:p>
+      <w:pPr>
+        <w:pStyle w:val="846"/>
+        <w:pBdr/>
+        <w:spacing/>
+        <w:ind/>
+        <w:rPr>
+          <w:highlight w:val="none"/>
+          <w14:ligatures w14:val="none"/>
+        </w:rPr>
+      </w:pPr>
+      <w:r/>
+      <w:bookmarkStart w:id="9" w:name="_Toc9"/>
+      <w:r>
+        <w:rPr>
+          <w:color w:val="1f4f79" w:themeColor="accent1" w:themeShade="80"/>
+          <w:highlight w:val="none"/>
+        </w:rPr>
+        <w:t xml:space="preserve">2.2 - Contraintes diverses exprimées par le demandeur</w:t>
+      </w:r>
+      <w:r>
+        <w:rPr>
+          <w:highlight w:val="none"/>
+        </w:rPr>
+        <w:t xml:space="preserve"> </w:t>
+      </w:r>
+      <w:r>
+        <w:rPr>
+          <w:highlight w:val="none"/>
+        </w:rPr>
+      </w:r>
+      <w:bookmarkEnd w:id="9"/>
+      <w:r/>
+      <w:r>
+        <w:rPr>
+          <w:highlight w:val="none"/>
+        </w:rPr>
+      </w:r>
+    </w:p>
+    <w:p>
+      <w:pPr>
+        <w:pBdr/>
+        <w:spacing/>
+        <w:ind/>
         <w:rPr/>
       </w:pPr>
-      <w:r/>
+      <w:r>
+        <w:t xml:space="preserve">Diagramme d’exigences :</w:t>
+      </w:r>
       <w:r/>
     </w:p>
     <w:p>
@@ -4921,14 +5446,15 @@
           <w:highlight w:val="none"/>
         </w:rPr>
       </w:pPr>
+      <w:r/>
       <w:r>
         <mc:AlternateContent>
           <mc:Choice Requires="wpg">
             <w:drawing>
               <wp:inline xmlns:wp="http://schemas.openxmlformats.org/drawingml/2006/wordprocessingDrawing" distT="0" distB="0" distL="0" distR="0">
-                <wp:extent cx="6300810" cy="3428813"/>
+                <wp:extent cx="5940425" cy="3231890"/>
                 <wp:effectExtent l="0" t="0" r="0" b="0"/>
-                <wp:docPr id="6" name=""/>
+                <wp:docPr id="7" name=""/>
                 <wp:cNvGraphicFramePr>
                   <a:graphicFrameLocks xmlns:a="http://schemas.openxmlformats.org/drawingml/2006/main" noChangeAspect="1"/>
                 </wp:cNvGraphicFramePr>
@@ -4936,20 +5462,20 @@
                   <a:graphicData uri="http://schemas.openxmlformats.org/drawingml/2006/picture">
                     <pic:pic xmlns:pic="http://schemas.openxmlformats.org/drawingml/2006/picture">
                       <pic:nvPicPr>
-                        <pic:cNvPr id="1292193101" name=""/>
+                        <pic:cNvPr id="103093323" name=""/>
                         <pic:cNvPicPr>
                           <a:picLocks noChangeAspect="1"/>
                         </pic:cNvPicPr>
                         <pic:nvPr/>
                       </pic:nvPicPr>
-                      <pic:blipFill>
-                        <a:blip r:embed="rId16"/>
+                      <pic:blipFill rotWithShape="1">
+                        <a:blip r:embed="rId17"/>
                         <a:stretch/>
                       </pic:blipFill>
                       <pic:spPr bwMode="auto">
-                        <a:xfrm flipH="0" flipV="0">
+                        <a:xfrm>
                           <a:off x="0" y="0"/>
-                          <a:ext cx="6300810" cy="3428812"/>
+                          <a:ext cx="5940424" cy="3231889"/>
                         </a:xfrm>
                         <a:prstGeom prst="rect">
                           <a:avLst/>
@@ -4982,13 +5508,63 @@
                 <v:path o:extrusionok="f" gradientshapeok="t" o:connecttype="rect"/>
                 <o:lock v:ext="edit" aspectratio="t"/>
               </v:shapetype>
-              <v:shape id="_x0000_i5" o:spid="_x0000_s5" type="#_x0000_t75" style="width:496.13pt;height:269.99pt;mso-wrap-distance-left:0.00pt;mso-wrap-distance-top:0.00pt;mso-wrap-distance-right:0.00pt;mso-wrap-distance-bottom:0.00pt;z-index:1;" stroked="false">
-                <v:imagedata r:id="rId16" o:title=""/>
+              <v:shape id="_x0000_i6" o:spid="_x0000_s6" type="#_x0000_t75" style="width:467.75pt;height:254.48pt;mso-wrap-distance-left:0.00pt;mso-wrap-distance-top:0.00pt;mso-wrap-distance-right:0.00pt;mso-wrap-distance-bottom:0.00pt;z-index:1;" stroked="false">
+                <v:imagedata r:id="rId17" o:title=""/>
                 <o:lock v:ext="edit" rotation="t"/>
               </v:shape>
             </w:pict>
           </mc:Fallback>
         </mc:AlternateContent>
+      </w:r>
+      <w:r/>
+      <w:r/>
+      <w:r/>
+      <w:r>
+        <w:rPr>
+          <w:highlight w:val="none"/>
+        </w:rPr>
+      </w:r>
+      <w:r>
+        <w:rPr>
+          <w:highlight w:val="none"/>
+        </w:rPr>
+      </w:r>
+      <w:r/>
+      <w:r/>
+      <w:r>
+        <w:rPr>
+          <w:highlight w:val="none"/>
+        </w:rPr>
+      </w:r>
+    </w:p>
+    <w:p>
+      <w:pPr>
+        <w:pBdr/>
+        <w:spacing/>
+        <w:ind/>
+        <w:rPr>
+          <w:highlight w:val="none"/>
+        </w:rPr>
+      </w:pPr>
+      <w:r>
+        <w:rPr>
+          <w:highlight w:val="none"/>
+        </w:rPr>
+        <w:t xml:space="preserve">Le demandeur a notifié une demande sur les taux de CO2. La demande étant de savoir si elle pouvait prévenir </w:t>
+      </w:r>
+      <w:r>
+        <w:rPr>
+          <w:highlight w:val="none"/>
+        </w:rPr>
+        <w:t xml:space="preserve">d’un éventuel incendie dans le cas où les taux étaient suspect. </w:t>
+        <w:br/>
+        <w:t xml:space="preserve">Il est en e</w:t>
+      </w:r>
+      <w:r>
+        <w:rPr>
+          <w:highlight w:val="none"/>
+        </w:rPr>
+        <w:t xml:space="preserve">ffet possible de détourner l’utilisation du capteur de TVOC/CO2, pour détecter un éventuel départ de feu dans la menuiserie. Le demandeur étant très exposé à ce risque en vue de la quantité de matières inflammable dans sa menuiserie (colle, solvant et bois).</w:t>
       </w:r>
       <w:r>
         <w:rPr>
@@ -5004,56 +5580,6 @@
     <w:p>
       <w:pPr>
         <w:pBdr/>
-        <w:spacing/>
-        <w:ind/>
-        <w:rPr/>
-      </w:pPr>
-      <w:r/>
-      <w:r/>
-    </w:p>
-    <w:p>
-      <w:pPr>
-        <w:pBdr/>
-        <w:spacing/>
-        <w:ind/>
-        <w:rPr>
-          <w:highlight w:val="none"/>
-        </w:rPr>
-      </w:pPr>
-      <w:r>
-        <w:rPr>
-          <w:highlight w:val="none"/>
-        </w:rPr>
-        <w:t xml:space="preserve">Le demandeur a notifier une demande sur les taux de CO2. La demande étant de savoir si elle pouvait prévenir </w:t>
-      </w:r>
-      <w:r>
-        <w:rPr>
-          <w:highlight w:val="none"/>
-        </w:rPr>
-        <w:t xml:space="preserve">d’un éventuel incendie dans le cas au les taux étaient suspect. </w:t>
-        <w:br/>
-        <w:t xml:space="preserve">Il est en e</w:t>
-      </w:r>
-      <w:r>
-        <w:rPr>
-          <w:highlight w:val="none"/>
-        </w:rPr>
-        <w:t xml:space="preserve">ffet possible de détourner l’utilisation du capteur de TVOC/CO2, pour détecter un éventuel départ de feu dans la menuiserie. Le demander étant très exposer à ce risque en vu de la quantité de matières inflammable dans sa menuiserie(colle, solvant et bois).</w:t>
-      </w:r>
-      <w:r>
-        <w:rPr>
-          <w:highlight w:val="none"/>
-        </w:rPr>
-      </w:r>
-      <w:r>
-        <w:rPr>
-          <w:highlight w:val="none"/>
-        </w:rPr>
-      </w:r>
-    </w:p>
-    <w:p>
-      <w:pPr>
-        <w:pBdr/>
         <w:shd w:val="nil" w:color="auto"/>
         <w:spacing/>
         <w:ind/>
@@ -5070,104 +5596,97 @@
         <w:pBdr/>
         <w:spacing/>
         <w:ind/>
+        <w:jc w:val="left"/>
         <w:rPr>
-          <w:rFonts w:ascii="Times New Roman" w:hAnsi="Times New Roman" w:eastAsia="Times New Roman" w:cs="Times New Roman"/>
-          <w:b/>
-          <w:bCs/>
-          <w:sz w:val="48"/>
-          <w:szCs w:val="48"/>
+          <w:color w:val="1f4f79" w:themeColor="accent1" w:themeShade="80"/>
           <w:highlight w:val="none"/>
+          <w14:ligatures w14:val="none"/>
         </w:rPr>
       </w:pPr>
-      <w:r/>
+      <w:r>
+        <w:rPr>
+          <w:color w:val="1f4f79" w:themeColor="accent1" w:themeShade="80"/>
+        </w:rPr>
+      </w:r>
       <w:bookmarkStart w:id="10" w:name="_Toc10"/>
       <w:r>
         <w:rPr>
-          <w:rFonts w:ascii="Times New Roman" w:hAnsi="Times New Roman" w:eastAsia="Times New Roman" w:cs="Times New Roman"/>
-          <w:b/>
-          <w:bCs/>
-          <w:sz w:val="48"/>
-          <w:szCs w:val="48"/>
+          <w:color w:val="1f4f79" w:themeColor="accent1" w:themeShade="80"/>
+        </w:rPr>
+        <w:t xml:space="preserve">3 – </w:t>
+      </w:r>
+      <w:r>
+        <w:rPr>
+          <w:color w:val="1f4f79" w:themeColor="accent1" w:themeShade="80"/>
           <w:highlight w:val="none"/>
         </w:rPr>
         <w:t xml:space="preserve">Étude préliminaire</w:t>
       </w:r>
       <w:r>
         <w:rPr>
-          <w:rFonts w:ascii="Times New Roman" w:hAnsi="Times New Roman" w:eastAsia="Times New Roman" w:cs="Times New Roman"/>
-          <w:b/>
-          <w:bCs/>
-          <w:sz w:val="48"/>
-          <w:szCs w:val="48"/>
+          <w:color w:val="1f4f79" w:themeColor="accent1" w:themeShade="80"/>
           <w:highlight w:val="none"/>
         </w:rPr>
       </w:r>
       <w:bookmarkEnd w:id="10"/>
       <w:r>
         <w:rPr>
-          <w:rFonts w:ascii="Times New Roman" w:hAnsi="Times New Roman" w:eastAsia="Times New Roman" w:cs="Times New Roman"/>
-          <w:b/>
-          <w:bCs/>
-          <w:sz w:val="48"/>
-          <w:szCs w:val="48"/>
-          <w:highlight w:val="none"/>
+          <w:color w:val="1f4f79" w:themeColor="accent1" w:themeShade="80"/>
         </w:rPr>
       </w:r>
       <w:r>
         <w:rPr>
-          <w:rFonts w:ascii="Times New Roman" w:hAnsi="Times New Roman" w:eastAsia="Times New Roman" w:cs="Times New Roman"/>
-          <w:b/>
-          <w:bCs/>
-          <w:sz w:val="48"/>
-          <w:szCs w:val="48"/>
+          <w:color w:val="1f4f79" w:themeColor="accent1" w:themeShade="80"/>
           <w:highlight w:val="none"/>
         </w:rPr>
       </w:r>
     </w:p>
     <w:p>
       <w:pPr>
-        <w:pBdr/>
-        <w:spacing/>
-        <w:ind/>
-        <w:rPr/>
-      </w:pPr>
-      <w:r/>
-      <w:r/>
-    </w:p>
-    <w:p>
-      <w:pPr>
         <w:pStyle w:val="846"/>
         <w:pBdr/>
         <w:spacing/>
         <w:ind/>
         <w:rPr>
-          <w14:ligatures w14:val="none"/>
+          <w:color w:val="1f4f79" w:themeColor="accent1" w:themeShade="80"/>
         </w:rPr>
       </w:pPr>
-      <w:r/>
+      <w:r>
+        <w:rPr>
+          <w:color w:val="1f4f79" w:themeColor="accent1" w:themeShade="80"/>
+        </w:rPr>
+      </w:r>
       <w:bookmarkStart w:id="11" w:name="_Toc11"/>
       <w:r>
         <w:rPr>
-          <w:highlight w:val="none"/>
+          <w:color w:val="1f4f79" w:themeColor="accent1" w:themeShade="80"/>
         </w:rPr>
-        <w:t xml:space="preserve">Diagramme de déploiement d’exploitation</w:t>
-      </w:r>
-      <w:r>
-        <w:rPr>
-          <w14:ligatures w14:val="none"/>
-        </w:rPr>
+        <w:t xml:space="preserve">3.1 – Diagramme de déploiement d’exploitation</w:t>
       </w:r>
       <w:bookmarkEnd w:id="11"/>
       <w:r>
         <w:rPr>
-          <w14:ligatures w14:val="none"/>
+          <w:color w:val="1f4f79" w:themeColor="accent1" w:themeShade="80"/>
         </w:rPr>
       </w:r>
       <w:r>
         <w:rPr>
-          <w14:ligatures w14:val="none"/>
+          <w:color w:val="1f4f79" w:themeColor="accent1" w:themeShade="80"/>
         </w:rPr>
       </w:r>
+    </w:p>
+    <w:p>
+      <w:pPr>
+        <w:pBdr/>
+        <w:spacing/>
+        <w:ind/>
+        <w:rPr/>
+      </w:pPr>
+      <w:r>
+        <w:t xml:space="preserve">Diagramme de déploiement</w:t>
+      </w:r>
+      <w:r/>
+      <w:r/>
     </w:p>
     <w:p>
       <w:pPr>
@@ -5189,6 +5708,15 @@
           <w:highlight w:val="none"/>
         </w:rPr>
       </w:r>
+      <w:r/>
+      <w:r>
+        <w:rPr>
+          <w:rFonts w:ascii="Times New Roman" w:hAnsi="Times New Roman" w:eastAsia="Times New Roman" w:cs="Times New Roman"/>
+          <w:b/>
+          <w:color w:val="000000"/>
+          <w:sz w:val="24"/>
+        </w:rPr>
+      </w:r>
       <w:r>
         <mc:AlternateContent>
           <mc:Choice Requires="wpg">
@@ -5196,7 +5724,7 @@
               <wp:inline xmlns:wp="http://schemas.openxmlformats.org/drawingml/2006/wordprocessingDrawing" distT="0" distB="0" distL="0" distR="0">
                 <wp:extent cx="5940425" cy="4397934"/>
                 <wp:effectExtent l="0" t="0" r="0" b="0"/>
-                <wp:docPr id="7" name=""/>
+                <wp:docPr id="8" name=""/>
                 <wp:cNvGraphicFramePr>
                   <a:graphicFrameLocks xmlns:a="http://schemas.openxmlformats.org/drawingml/2006/main" noChangeAspect="1"/>
                 </wp:cNvGraphicFramePr>
@@ -5204,20 +5732,20 @@
                   <a:graphicData uri="http://schemas.openxmlformats.org/drawingml/2006/picture">
                     <pic:pic xmlns:pic="http://schemas.openxmlformats.org/drawingml/2006/picture">
                       <pic:nvPicPr>
-                        <pic:cNvPr id="698565566" name=""/>
+                        <pic:cNvPr id="1063057272" name=""/>
                         <pic:cNvPicPr>
                           <a:picLocks noChangeAspect="1"/>
                         </pic:cNvPicPr>
                         <pic:nvPr/>
                       </pic:nvPicPr>
-                      <pic:blipFill>
-                        <a:blip r:embed="rId17"/>
+                      <pic:blipFill rotWithShape="1">
+                        <a:blip r:embed="rId18"/>
                         <a:stretch/>
                       </pic:blipFill>
                       <pic:spPr bwMode="auto">
                         <a:xfrm>
                           <a:off x="0" y="0"/>
-                          <a:ext cx="5940423" cy="4397933"/>
+                          <a:ext cx="5940423" cy="4397932"/>
                         </a:xfrm>
                         <a:prstGeom prst="rect">
                           <a:avLst/>
@@ -5250,8 +5778,8 @@
                 <v:path o:extrusionok="f" gradientshapeok="t" o:connecttype="rect"/>
                 <o:lock v:ext="edit" aspectratio="t"/>
               </v:shapetype>
-              <v:shape id="_x0000_i6" o:spid="_x0000_s6" type="#_x0000_t75" style="width:467.75pt;height:346.29pt;mso-wrap-distance-left:0.00pt;mso-wrap-distance-top:0.00pt;mso-wrap-distance-right:0.00pt;mso-wrap-distance-bottom:0.00pt;z-index:1;" stroked="false">
-                <v:imagedata r:id="rId17" o:title=""/>
+              <v:shape id="_x0000_i7" o:spid="_x0000_s7" type="#_x0000_t75" style="width:467.75pt;height:346.29pt;mso-wrap-distance-left:0.00pt;mso-wrap-distance-top:0.00pt;mso-wrap-distance-right:0.00pt;mso-wrap-distance-bottom:0.00pt;z-index:1;" stroked="false">
+                <v:imagedata r:id="rId18" o:title=""/>
                 <o:lock v:ext="edit" rotation="t"/>
               </v:shape>
             </w:pict>
@@ -5981,32 +6509,58 @@
         <w:pBdr/>
         <w:spacing/>
         <w:ind/>
+        <w:jc w:val="left"/>
         <w:rPr>
           <w:rFonts w:ascii="Times New Roman" w:hAnsi="Times New Roman" w:eastAsia="Times New Roman" w:cs="Times New Roman"/>
           <w:b/>
           <w:bCs/>
+          <w:color w:val="1f4f79" w:themeColor="accent1" w:themeShade="80"/>
           <w:sz w:val="48"/>
           <w:szCs w:val="48"/>
           <w:highlight w:val="none"/>
         </w:rPr>
       </w:pPr>
-      <w:r/>
+      <w:r>
+        <w:rPr>
+          <w:color w:val="1f4f79" w:themeColor="accent1" w:themeShade="80"/>
+        </w:rPr>
+      </w:r>
+      <w:bookmarkStart w:id="12" w:name="_Toc12"/>
       <w:r>
         <w:rPr>
           <w:rFonts w:ascii="Times New Roman" w:hAnsi="Times New Roman" w:eastAsia="Times New Roman" w:cs="Times New Roman"/>
           <w:b/>
           <w:bCs/>
+          <w:color w:val="1f4f79" w:themeColor="accent1" w:themeShade="80"/>
           <w:sz w:val="48"/>
           <w:szCs w:val="48"/>
           <w:highlight w:val="none"/>
         </w:rPr>
-        <w:t xml:space="preserve">Recettes</w:t>
+        <w:t xml:space="preserve">4 – Recettes</w:t>
       </w:r>
       <w:r>
         <w:rPr>
           <w:rFonts w:ascii="Times New Roman" w:hAnsi="Times New Roman" w:eastAsia="Times New Roman" w:cs="Times New Roman"/>
           <w:b/>
           <w:bCs/>
+          <w:color w:val="1f4f79" w:themeColor="accent1" w:themeShade="80"/>
+          <w:sz w:val="48"/>
+          <w:szCs w:val="48"/>
+          <w:highlight w:val="none"/>
+        </w:rPr>
+      </w:r>
+      <w:bookmarkEnd w:id="12"/>
+      <w:r>
+        <w:rPr>
+          <w:color w:val="1f4f79" w:themeColor="accent1" w:themeShade="80"/>
+        </w:rPr>
+      </w:r>
+      <w:r>
+        <w:rPr>
+          <w:rFonts w:ascii="Times New Roman" w:hAnsi="Times New Roman" w:eastAsia="Times New Roman" w:cs="Times New Roman"/>
+          <w:b/>
+          <w:bCs/>
+          <w:color w:val="1f4f79" w:themeColor="accent1" w:themeShade="80"/>
           <w:sz w:val="48"/>
           <w:szCs w:val="48"/>
           <w:highlight w:val="none"/>
@@ -6021,7 +6575,6 @@
         <w:jc w:val="center"/>
         <w:rPr/>
       </w:pPr>
-      <w:r/>
       <w:r>
         <mc:AlternateContent>
           <mc:Choice Requires="wpg">
@@ -6044,7 +6597,7 @@
                     <wp:lineTo x="0" y="21600"/>
                   </wp:wrapPolygon>
                 </wp:wrapThrough>
-                <wp:docPr id="8" name=""/>
+                <wp:docPr id="9" name=""/>
                 <wp:cNvGraphicFramePr>
                   <a:graphicFrameLocks xmlns:a="http://schemas.openxmlformats.org/drawingml/2006/main" noChangeAspect="1"/>
                 </wp:cNvGraphicFramePr>
@@ -6058,8 +6611,8 @@
                         </pic:cNvPicPr>
                         <pic:nvPr/>
                       </pic:nvPicPr>
-                      <pic:blipFill>
-                        <a:blip r:embed="rId18"/>
+                      <pic:blipFill rotWithShape="1">
+                        <a:blip r:embed="rId19"/>
                         <a:stretch/>
                       </pic:blipFill>
                       <pic:spPr bwMode="auto">
@@ -6098,9 +6651,9 @@
                 <v:path o:extrusionok="f" gradientshapeok="t" o:connecttype="rect"/>
                 <o:lock v:ext="edit" aspectratio="t"/>
               </v:shapetype>
-              <v:shape id="_x0000_i7" o:spid="_x0000_s7" type="#_x0000_t75" style="position:absolute;z-index:18432;o:allowoverlap:true;o:allowincell:true;mso-position-horizontal-relative:text;margin-left:-82.56pt;mso-position-horizontal:absolute;mso-position-vertical-relative:text;margin-top:9.28pt;mso-position-vertical:absolute;width:590.33pt;height:181.75pt;mso-wrap-distance-left:9.07pt;mso-wrap-distance-top:0.00pt;mso-wrap-distance-right:9.07pt;mso-wrap-distance-bottom:0.00pt;z-index:1;" wrapcoords="0 0 100000 0 100000 100000 0 100000" stroked="false">
+              <v:shape id="_x0000_i8" o:spid="_x0000_s8" type="#_x0000_t75" style="position:absolute;z-index:18432;o:allowoverlap:true;o:allowincell:true;mso-position-horizontal-relative:text;margin-left:-82.56pt;mso-position-horizontal:absolute;mso-position-vertical-relative:text;margin-top:9.28pt;mso-position-vertical:absolute;width:590.33pt;height:181.75pt;mso-wrap-distance-left:9.07pt;mso-wrap-distance-top:0.00pt;mso-wrap-distance-right:9.07pt;mso-wrap-distance-bottom:0.00pt;z-index:1;" wrapcoords="0 0 100000 0 100000 100000 0 100000" stroked="false">
                 <w10:wrap type="through"/>
-                <v:imagedata r:id="rId18" o:title=""/>
+                <v:imagedata r:id="rId19" o:title=""/>
                 <o:lock v:ext="edit" rotation="t"/>
               </v:shape>
             </w:pict>
@@ -6108,8 +6661,6 @@
         </mc:AlternateContent>
       </w:r>
       <w:r/>
-      <w:r/>
-      <w:r/>
     </w:p>
     <w:p>
       <w:pPr>
@@ -6118,28 +6669,6 @@
         <w:ind/>
         <w:rPr/>
       </w:pPr>
-      <w:r>
-        <w:rPr>
-          <w:rFonts w:ascii="Times New Roman" w:hAnsi="Times New Roman" w:eastAsia="Times New Roman" w:cs="Times New Roman"/>
-          <w:b/>
-          <w:bCs/>
-          <w:sz w:val="48"/>
-          <w:szCs w:val="48"/>
-          <w:highlight w:val="none"/>
-        </w:rPr>
-      </w:r>
-      <w:r/>
-      <w:r>
-        <w:rPr>
-          <w:rFonts w:ascii="Times New Roman" w:hAnsi="Times New Roman" w:eastAsia="Times New Roman" w:cs="Times New Roman"/>
-          <w:b/>
-          <w:bCs/>
-          <w:sz w:val="48"/>
-          <w:szCs w:val="48"/>
-          <w:highlight w:val="none"/>
-        </w:rPr>
-      </w:r>
-      <w:r/>
       <w:r>
         <w:rPr>
           <w:rFonts w:ascii="Times New Roman" w:hAnsi="Times New Roman" w:eastAsia="Times New Roman" w:cs="Times New Roman"/>
@@ -6423,8 +6952,140 @@
       <w:suff w:val="tab"/>
     </w:lvl>
   </w:abstractNum>
+  <w:abstractNum w:abstractNumId="1">
+    <w:nsid w:val="347C9D94"/>
+    <w:lvl w:ilvl="0">
+      <w:isLgl w:val="false"/>
+      <w:lvlJc w:val="left"/>
+      <w:lvlText w:val="%1."/>
+      <w:numFmt w:val="decimal"/>
+      <w:pPr>
+        <w:pBdr/>
+        <w:spacing/>
+        <w:ind w:hanging="360" w:left="142"/>
+      </w:pPr>
+      <w:rPr/>
+      <w:start w:val="1"/>
+      <w:suff w:val="tab"/>
+    </w:lvl>
+    <w:lvl w:ilvl="1">
+      <w:isLgl w:val="false"/>
+      <w:lvlJc w:val="left"/>
+      <w:lvlText w:val="%2."/>
+      <w:numFmt w:val="lowerLetter"/>
+      <w:pPr>
+        <w:pBdr/>
+        <w:spacing/>
+        <w:ind w:hanging="360" w:left="862"/>
+      </w:pPr>
+      <w:rPr/>
+      <w:start w:val="1"/>
+      <w:suff w:val="tab"/>
+    </w:lvl>
+    <w:lvl w:ilvl="2">
+      <w:isLgl w:val="false"/>
+      <w:lvlJc w:val="right"/>
+      <w:lvlText w:val="%3."/>
+      <w:numFmt w:val="lowerRoman"/>
+      <w:pPr>
+        <w:pBdr/>
+        <w:spacing/>
+        <w:ind w:hanging="180" w:left="1582"/>
+      </w:pPr>
+      <w:rPr/>
+      <w:start w:val="1"/>
+      <w:suff w:val="tab"/>
+    </w:lvl>
+    <w:lvl w:ilvl="3">
+      <w:isLgl w:val="false"/>
+      <w:lvlJc w:val="left"/>
+      <w:lvlText w:val="%4."/>
+      <w:numFmt w:val="decimal"/>
+      <w:pPr>
+        <w:pBdr/>
+        <w:spacing/>
+        <w:ind w:hanging="360" w:left="2302"/>
+      </w:pPr>
+      <w:rPr/>
+      <w:start w:val="1"/>
+      <w:suff w:val="tab"/>
+    </w:lvl>
+    <w:lvl w:ilvl="4">
+      <w:isLgl w:val="false"/>
+      <w:lvlJc w:val="left"/>
+      <w:lvlText w:val="%5."/>
+      <w:numFmt w:val="lowerLetter"/>
+      <w:pPr>
+        <w:pBdr/>
+        <w:spacing/>
+        <w:ind w:hanging="360" w:left="3022"/>
+      </w:pPr>
+      <w:rPr/>
+      <w:start w:val="1"/>
+      <w:suff w:val="tab"/>
+    </w:lvl>
+    <w:lvl w:ilvl="5">
+      <w:isLgl w:val="false"/>
+      <w:lvlJc w:val="right"/>
+      <w:lvlText w:val="%6."/>
+      <w:numFmt w:val="lowerRoman"/>
+      <w:pPr>
+        <w:pBdr/>
+        <w:spacing/>
+        <w:ind w:hanging="180" w:left="3742"/>
+      </w:pPr>
+      <w:rPr/>
+      <w:start w:val="1"/>
+      <w:suff w:val="tab"/>
+    </w:lvl>
+    <w:lvl w:ilvl="6">
+      <w:isLgl w:val="false"/>
+      <w:lvlJc w:val="left"/>
+      <w:lvlText w:val="%7."/>
+      <w:numFmt w:val="decimal"/>
+      <w:pPr>
+        <w:pBdr/>
+        <w:spacing/>
+        <w:ind w:hanging="360" w:left="4462"/>
+      </w:pPr>
+      <w:rPr/>
+      <w:start w:val="1"/>
+      <w:suff w:val="tab"/>
+    </w:lvl>
+    <w:lvl w:ilvl="7">
+      <w:isLgl w:val="false"/>
+      <w:lvlJc w:val="left"/>
+      <w:lvlText w:val="%8."/>
+      <w:numFmt w:val="lowerLetter"/>
+      <w:pPr>
+        <w:pBdr/>
+        <w:spacing/>
+        <w:ind w:hanging="360" w:left="5182"/>
+      </w:pPr>
+      <w:rPr/>
+      <w:start w:val="1"/>
+      <w:suff w:val="tab"/>
+    </w:lvl>
+    <w:lvl w:ilvl="8">
+      <w:isLgl w:val="false"/>
+      <w:lvlJc w:val="right"/>
+      <w:lvlText w:val="%9."/>
+      <w:numFmt w:val="lowerRoman"/>
+      <w:pPr>
+        <w:pBdr/>
+        <w:spacing/>
+        <w:ind w:hanging="180" w:left="5902"/>
+      </w:pPr>
+      <w:rPr/>
+      <w:start w:val="1"/>
+      <w:suff w:val="tab"/>
+    </w:lvl>
+  </w:abstractNum>
   <w:num w:numId="1">
     <w:abstractNumId w:val="0"/>
+  </w:num>
+  <w:num w:numId="2">
+    <w:abstractNumId w:val="1"/>
   </w:num>
 </w:numbering>
 </file>

</xml_diff>